<commit_message>
Update sector dataset and workshop document
Update binary files: refresh Data/Clean/Datos Sectores Equity (Index review).xlsx with revised sector data and apply edits to Documents/Taller 5 Bloomberg H.E. - Jess Gil y Antonio Gutiérrez.docx. These are binary updates reflecting data revisions and document changes.
</commit_message>
<xml_diff>
--- a/Documents/Taller 5 Bloomberg H.E. - Jess Gil y Antonio Gutiérrez.docx
+++ b/Documents/Taller 5 Bloomberg H.E. - Jess Gil y Antonio Gutiérrez.docx
@@ -4,7 +4,7 @@
   <w:body>
     <w:p>
       <w:pPr>
-        <w:pStyle w:val="Heading1"/>
+        <w:pStyle w:val="Ttulo1"/>
         <w:spacing w:before="0"/>
         <w:rPr>
           <w:rFonts w:cstheme="majorHAnsi"/>
@@ -52,7 +52,7 @@
     </w:p>
     <w:p>
       <w:pPr>
-        <w:pStyle w:val="ListBullet"/>
+        <w:pStyle w:val="Listaconvietas"/>
         <w:numPr>
           <w:ilvl w:val="0"/>
           <w:numId w:val="0"/>
@@ -76,7 +76,7 @@
       <w:hyperlink r:id="rId6" w:history="1">
         <w:r>
           <w:rPr>
-            <w:rStyle w:val="Hyperlink"/>
+            <w:rStyle w:val="Hipervnculo"/>
             <w:rFonts w:asciiTheme="majorHAnsi" w:hAnsiTheme="majorHAnsi" w:cstheme="majorHAnsi"/>
             <w:sz w:val="24"/>
             <w:szCs w:val="24"/>
@@ -88,7 +88,7 @@
     </w:p>
     <w:p>
       <w:pPr>
-        <w:pStyle w:val="ListBullet"/>
+        <w:pStyle w:val="Listaconvietas"/>
         <w:numPr>
           <w:ilvl w:val="0"/>
           <w:numId w:val="0"/>
@@ -104,7 +104,7 @@
     </w:p>
     <w:p>
       <w:pPr>
-        <w:pStyle w:val="ListBullet"/>
+        <w:pStyle w:val="Listaconvietas"/>
         <w:numPr>
           <w:ilvl w:val="0"/>
           <w:numId w:val="11"/>
@@ -303,7 +303,7 @@
     </w:p>
     <w:p>
       <w:pPr>
-        <w:pStyle w:val="ListBullet"/>
+        <w:pStyle w:val="Listaconvietas"/>
         <w:numPr>
           <w:ilvl w:val="0"/>
           <w:numId w:val="0"/>
@@ -392,48 +392,39 @@
     <w:p>
       <w:pPr>
         <w:rPr>
-          <w:lang w:val="es-CO"/>
-        </w:rPr>
-      </w:pPr>
-      <w:r>
-        <w:rPr>
+          <w:rFonts w:asciiTheme="majorHAnsi" w:hAnsiTheme="majorHAnsi" w:cstheme="majorHAnsi"/>
+          <w:lang w:val="es-CO"/>
+        </w:rPr>
+      </w:pPr>
+      <w:r>
+        <w:rPr>
+          <w:rFonts w:asciiTheme="majorHAnsi" w:hAnsiTheme="majorHAnsi" w:cstheme="majorHAnsi"/>
           <w:highlight w:val="yellow"/>
           <w:lang w:val="es-CO"/>
         </w:rPr>
-        <w:t>(Ver archivo Excel – “Data</w:t>
-      </w:r>
-      <w:r>
-        <w:rPr>
+        <w:t>(Ver archivo Excel – “Data\Raw</w:t>
+      </w:r>
+      <w:r>
+        <w:rPr>
+          <w:rFonts w:asciiTheme="majorHAnsi" w:hAnsiTheme="majorHAnsi" w:cstheme="majorHAnsi"/>
           <w:highlight w:val="yellow"/>
           <w:lang w:val="es-CO"/>
         </w:rPr>
-        <w:t>\Raw</w:t>
-      </w:r>
-      <w:r>
-        <w:rPr>
+        <w:t xml:space="preserve">\Datos Sectores </w:t>
+      </w:r>
+      <w:proofErr w:type="spellStart"/>
+      <w:r>
+        <w:rPr>
+          <w:rFonts w:asciiTheme="majorHAnsi" w:hAnsiTheme="majorHAnsi" w:cstheme="majorHAnsi"/>
           <w:highlight w:val="yellow"/>
           <w:lang w:val="es-CO"/>
         </w:rPr>
-        <w:t>\</w:t>
-      </w:r>
-      <w:r>
-        <w:rPr>
-          <w:highlight w:val="yellow"/>
-          <w:lang w:val="es-CO"/>
-        </w:rPr>
-        <w:t xml:space="preserve">Datos Sectores </w:t>
-      </w:r>
-      <w:proofErr w:type="spellStart"/>
-      <w:r>
-        <w:rPr>
-          <w:highlight w:val="yellow"/>
-          <w:lang w:val="es-CO"/>
-        </w:rPr>
         <w:t>Equity</w:t>
       </w:r>
       <w:proofErr w:type="spellEnd"/>
       <w:r>
         <w:rPr>
+          <w:rFonts w:asciiTheme="majorHAnsi" w:hAnsiTheme="majorHAnsi" w:cstheme="majorHAnsi"/>
           <w:highlight w:val="yellow"/>
           <w:lang w:val="es-CO"/>
         </w:rPr>
@@ -442,7 +433,7 @@
     </w:p>
     <w:p>
       <w:pPr>
-        <w:pStyle w:val="ListBullet"/>
+        <w:pStyle w:val="Listaconvietas"/>
         <w:numPr>
           <w:ilvl w:val="0"/>
           <w:numId w:val="11"/>
@@ -470,7 +461,7 @@
     </w:p>
     <w:p>
       <w:pPr>
-        <w:pStyle w:val="ListBullet"/>
+        <w:pStyle w:val="Listaconvietas"/>
         <w:numPr>
           <w:ilvl w:val="1"/>
           <w:numId w:val="11"/>
@@ -510,35 +501,19 @@
           <w:szCs w:val="24"/>
           <w:lang w:val="es-CO"/>
         </w:rPr>
-        <w:t xml:space="preserve">2015) sobre el total del índice. </w:t>
-      </w:r>
-      <w:r>
-        <w:rPr>
-          <w:rFonts w:asciiTheme="majorHAnsi" w:hAnsiTheme="majorHAnsi" w:cstheme="majorHAnsi"/>
-          <w:sz w:val="24"/>
-          <w:szCs w:val="24"/>
-          <w:lang w:val="es-CO"/>
-        </w:rPr>
-        <w:t xml:space="preserve"> </w:t>
-      </w:r>
-      <w:r>
-        <w:rPr>
-          <w:rFonts w:asciiTheme="majorHAnsi" w:hAnsiTheme="majorHAnsi" w:cstheme="majorHAnsi"/>
-          <w:sz w:val="24"/>
-          <w:szCs w:val="24"/>
-          <w:lang w:val="es-CO"/>
-        </w:rPr>
-        <w:t>Verificar que sumen 1.</w:t>
+        <w:t>2015) sobre el total del índice.  Verificar que sumen 1.</w:t>
       </w:r>
     </w:p>
     <w:p>
       <w:pPr>
         <w:rPr>
-          <w:lang w:val="es-CO"/>
-        </w:rPr>
-      </w:pPr>
-      <w:r>
-        <w:rPr>
+          <w:rFonts w:asciiTheme="majorHAnsi" w:hAnsiTheme="majorHAnsi" w:cstheme="majorHAnsi"/>
+          <w:lang w:val="es-CO"/>
+        </w:rPr>
+      </w:pPr>
+      <w:r>
+        <w:rPr>
+          <w:rFonts w:asciiTheme="majorHAnsi" w:hAnsiTheme="majorHAnsi" w:cstheme="majorHAnsi"/>
           <w:highlight w:val="yellow"/>
           <w:lang w:val="es-CO"/>
         </w:rPr>
@@ -546,98 +521,95 @@
       </w:r>
       <w:r>
         <w:rPr>
+          <w:rFonts w:asciiTheme="majorHAnsi" w:hAnsiTheme="majorHAnsi" w:cstheme="majorHAnsi"/>
           <w:highlight w:val="yellow"/>
           <w:lang w:val="es-CO"/>
         </w:rPr>
-        <w:t xml:space="preserve"> – “</w:t>
-      </w:r>
-      <w:r>
-        <w:rPr>
+        <w:t xml:space="preserve"> – “Data\</w:t>
+      </w:r>
+      <w:proofErr w:type="spellStart"/>
+      <w:r>
+        <w:rPr>
+          <w:rFonts w:asciiTheme="majorHAnsi" w:hAnsiTheme="majorHAnsi" w:cstheme="majorHAnsi"/>
           <w:highlight w:val="yellow"/>
           <w:lang w:val="es-CO"/>
         </w:rPr>
-        <w:t>Data\</w:t>
+        <w:t>Clean</w:t>
+      </w:r>
+      <w:proofErr w:type="spellEnd"/>
+      <w:r>
+        <w:rPr>
+          <w:rFonts w:asciiTheme="majorHAnsi" w:hAnsiTheme="majorHAnsi" w:cstheme="majorHAnsi"/>
+          <w:highlight w:val="yellow"/>
+          <w:lang w:val="es-CO"/>
+        </w:rPr>
+        <w:t xml:space="preserve">\Datos Sectores </w:t>
       </w:r>
       <w:proofErr w:type="spellStart"/>
       <w:r>
         <w:rPr>
+          <w:rFonts w:asciiTheme="majorHAnsi" w:hAnsiTheme="majorHAnsi" w:cstheme="majorHAnsi"/>
           <w:highlight w:val="yellow"/>
           <w:lang w:val="es-CO"/>
         </w:rPr>
-        <w:t>Clean</w:t>
+        <w:t>Equity</w:t>
       </w:r>
       <w:proofErr w:type="spellEnd"/>
       <w:r>
         <w:rPr>
+          <w:rFonts w:asciiTheme="majorHAnsi" w:hAnsiTheme="majorHAnsi" w:cstheme="majorHAnsi"/>
           <w:highlight w:val="yellow"/>
           <w:lang w:val="es-CO"/>
         </w:rPr>
-        <w:t>\</w:t>
-      </w:r>
-      <w:r>
-        <w:rPr>
+        <w:t xml:space="preserve"> (</w:t>
+      </w:r>
+      <w:proofErr w:type="spellStart"/>
+      <w:r>
+        <w:rPr>
+          <w:rFonts w:asciiTheme="majorHAnsi" w:hAnsiTheme="majorHAnsi" w:cstheme="majorHAnsi"/>
           <w:highlight w:val="yellow"/>
           <w:lang w:val="es-CO"/>
         </w:rPr>
-        <w:t xml:space="preserve">Datos Sectores </w:t>
+        <w:t>Index</w:t>
+      </w:r>
+      <w:proofErr w:type="spellEnd"/>
+      <w:r>
+        <w:rPr>
+          <w:rFonts w:asciiTheme="majorHAnsi" w:hAnsiTheme="majorHAnsi" w:cstheme="majorHAnsi"/>
+          <w:highlight w:val="yellow"/>
+          <w:lang w:val="es-CO"/>
+        </w:rPr>
+        <w:t xml:space="preserve"> </w:t>
       </w:r>
       <w:proofErr w:type="spellStart"/>
       <w:r>
         <w:rPr>
+          <w:rFonts w:asciiTheme="majorHAnsi" w:hAnsiTheme="majorHAnsi" w:cstheme="majorHAnsi"/>
           <w:highlight w:val="yellow"/>
           <w:lang w:val="es-CO"/>
         </w:rPr>
-        <w:t>Equity</w:t>
+        <w:t>review</w:t>
       </w:r>
       <w:proofErr w:type="spellEnd"/>
       <w:r>
         <w:rPr>
+          <w:rFonts w:asciiTheme="majorHAnsi" w:hAnsiTheme="majorHAnsi" w:cstheme="majorHAnsi"/>
           <w:highlight w:val="yellow"/>
           <w:lang w:val="es-CO"/>
         </w:rPr>
-        <w:t xml:space="preserve"> (</w:t>
-      </w:r>
-      <w:proofErr w:type="spellStart"/>
-      <w:r>
-        <w:rPr>
+        <w:t>)</w:t>
+      </w:r>
+      <w:r>
+        <w:rPr>
+          <w:rFonts w:asciiTheme="majorHAnsi" w:hAnsiTheme="majorHAnsi" w:cstheme="majorHAnsi"/>
           <w:highlight w:val="yellow"/>
           <w:lang w:val="es-CO"/>
         </w:rPr>
-        <w:t>Index</w:t>
-      </w:r>
-      <w:proofErr w:type="spellEnd"/>
-      <w:r>
-        <w:rPr>
-          <w:highlight w:val="yellow"/>
-          <w:lang w:val="es-CO"/>
-        </w:rPr>
-        <w:t xml:space="preserve"> </w:t>
-      </w:r>
-      <w:proofErr w:type="spellStart"/>
-      <w:r>
-        <w:rPr>
-          <w:highlight w:val="yellow"/>
-          <w:lang w:val="es-CO"/>
-        </w:rPr>
-        <w:t>review</w:t>
-      </w:r>
-      <w:proofErr w:type="spellEnd"/>
-      <w:r>
-        <w:rPr>
-          <w:highlight w:val="yellow"/>
-          <w:lang w:val="es-CO"/>
-        </w:rPr>
-        <w:t>)</w:t>
-      </w:r>
-      <w:r>
-        <w:rPr>
-          <w:highlight w:val="yellow"/>
-          <w:lang w:val="es-CO"/>
-        </w:rPr>
         <w:t>”</w:t>
       </w:r>
       <w:r>
         <w:rPr>
+          <w:rFonts w:asciiTheme="majorHAnsi" w:hAnsiTheme="majorHAnsi" w:cstheme="majorHAnsi"/>
           <w:highlight w:val="yellow"/>
           <w:lang w:val="es-CO"/>
         </w:rPr>
@@ -646,7 +618,7 @@
     </w:p>
     <w:p>
       <w:pPr>
-        <w:pStyle w:val="ListBullet"/>
+        <w:pStyle w:val="Listaconvietas"/>
         <w:numPr>
           <w:ilvl w:val="1"/>
           <w:numId w:val="11"/>
@@ -710,7 +682,7 @@
           <w:szCs w:val="24"/>
           <w:lang w:val="es-CO"/>
         </w:rPr>
-        <w:t xml:space="preserve">. </w:t>
+        <w:t>. 20</w:t>
       </w:r>
       <w:r>
         <w:rPr>
@@ -719,7 +691,7 @@
           <w:szCs w:val="24"/>
           <w:lang w:val="es-CO"/>
         </w:rPr>
-        <w:t>20</w:t>
+        <w:t>15</w:t>
       </w:r>
       <w:r>
         <w:rPr>
@@ -728,7 +700,7 @@
           <w:szCs w:val="24"/>
           <w:lang w:val="es-CO"/>
         </w:rPr>
-        <w:t>15</w:t>
+        <w:t>), ¿Cómo cambia en comparación a los pesos por volumen de transacción?</w:t>
       </w:r>
       <w:r>
         <w:rPr>
@@ -737,27 +709,20 @@
           <w:szCs w:val="24"/>
           <w:lang w:val="es-CO"/>
         </w:rPr>
-        <w:t>), ¿Cómo cambia en comparación a los pesos por volumen de transacción?</w:t>
-      </w:r>
-      <w:r>
-        <w:rPr>
-          <w:rFonts w:asciiTheme="majorHAnsi" w:hAnsiTheme="majorHAnsi" w:cstheme="majorHAnsi"/>
-          <w:sz w:val="24"/>
-          <w:szCs w:val="24"/>
-          <w:lang w:val="es-CO"/>
-        </w:rPr>
         <w:t>, ¿Por qué?</w:t>
       </w:r>
     </w:p>
     <w:p>
       <w:pPr>
         <w:rPr>
+          <w:rFonts w:asciiTheme="majorHAnsi" w:hAnsiTheme="majorHAnsi" w:cstheme="majorHAnsi"/>
           <w:highlight w:val="yellow"/>
           <w:lang w:val="es-CO"/>
         </w:rPr>
       </w:pPr>
       <w:r>
         <w:rPr>
+          <w:rFonts w:asciiTheme="majorHAnsi" w:hAnsiTheme="majorHAnsi" w:cstheme="majorHAnsi"/>
           <w:highlight w:val="yellow"/>
           <w:lang w:val="es-CO"/>
         </w:rPr>
@@ -767,12 +732,14 @@
     <w:p>
       <w:pPr>
         <w:rPr>
+          <w:rFonts w:asciiTheme="majorHAnsi" w:hAnsiTheme="majorHAnsi" w:cstheme="majorHAnsi"/>
           <w:highlight w:val="yellow"/>
           <w:lang w:val="es-CO"/>
         </w:rPr>
       </w:pPr>
       <w:r>
         <w:rPr>
+          <w:rFonts w:asciiTheme="majorHAnsi" w:hAnsiTheme="majorHAnsi" w:cstheme="majorHAnsi"/>
           <w:highlight w:val="yellow"/>
           <w:lang w:val="es-CO"/>
         </w:rPr>
@@ -782,12 +749,14 @@
     <w:p>
       <w:pPr>
         <w:rPr>
+          <w:rFonts w:asciiTheme="majorHAnsi" w:hAnsiTheme="majorHAnsi" w:cstheme="majorHAnsi"/>
           <w:highlight w:val="yellow"/>
           <w:lang w:val="es-CO"/>
         </w:rPr>
       </w:pPr>
       <w:r>
         <w:rPr>
+          <w:rFonts w:asciiTheme="majorHAnsi" w:hAnsiTheme="majorHAnsi" w:cstheme="majorHAnsi"/>
           <w:highlight w:val="yellow"/>
           <w:lang w:val="es-CO"/>
         </w:rPr>
@@ -797,11 +766,13 @@
     <w:p>
       <w:pPr>
         <w:rPr>
-          <w:lang w:val="es-CO"/>
-        </w:rPr>
-      </w:pPr>
-      <w:r>
-        <w:rPr>
+          <w:rFonts w:asciiTheme="majorHAnsi" w:hAnsiTheme="majorHAnsi" w:cstheme="majorHAnsi"/>
+          <w:lang w:val="es-CO"/>
+        </w:rPr>
+      </w:pPr>
+      <w:r>
+        <w:rPr>
+          <w:rFonts w:asciiTheme="majorHAnsi" w:hAnsiTheme="majorHAnsi" w:cstheme="majorHAnsi"/>
           <w:highlight w:val="yellow"/>
           <w:lang w:val="es-CO"/>
         </w:rPr>
@@ -810,6 +781,7 @@
       <w:proofErr w:type="spellStart"/>
       <w:r>
         <w:rPr>
+          <w:rFonts w:asciiTheme="majorHAnsi" w:hAnsiTheme="majorHAnsi" w:cstheme="majorHAnsi"/>
           <w:highlight w:val="yellow"/>
           <w:lang w:val="es-CO"/>
         </w:rPr>
@@ -818,6 +790,7 @@
       <w:proofErr w:type="spellEnd"/>
       <w:r>
         <w:rPr>
+          <w:rFonts w:asciiTheme="majorHAnsi" w:hAnsiTheme="majorHAnsi" w:cstheme="majorHAnsi"/>
           <w:highlight w:val="yellow"/>
           <w:lang w:val="es-CO"/>
         </w:rPr>
@@ -826,7 +799,7 @@
     </w:p>
     <w:p>
       <w:pPr>
-        <w:pStyle w:val="ListBullet"/>
+        <w:pStyle w:val="Listaconvietas"/>
         <w:numPr>
           <w:ilvl w:val="0"/>
           <w:numId w:val="11"/>
@@ -854,7 +827,7 @@
     </w:p>
     <w:p>
       <w:pPr>
-        <w:pStyle w:val="ListBullet"/>
+        <w:pStyle w:val="Listaconvietas"/>
         <w:numPr>
           <w:ilvl w:val="1"/>
           <w:numId w:val="11"/>
@@ -942,18 +915,19 @@
     </w:p>
     <w:p>
       <w:pPr>
-        <w:pStyle w:val="ListParagraph"/>
+        <w:pStyle w:val="Prrafodelista"/>
         <w:numPr>
           <w:ilvl w:val="0"/>
           <w:numId w:val="13"/>
         </w:numPr>
         <w:rPr>
+          <w:rFonts w:asciiTheme="majorHAnsi" w:hAnsiTheme="majorHAnsi" w:cstheme="majorHAnsi"/>
           <w:highlight w:val="yellow"/>
-          <w:lang w:val="es-CO"/>
-        </w:rPr>
-      </w:pPr>
-      <w:r>
-        <w:rPr>
+        </w:rPr>
+      </w:pPr>
+      <w:r>
+        <w:rPr>
+          <w:rFonts w:asciiTheme="majorHAnsi" w:hAnsiTheme="majorHAnsi" w:cstheme="majorHAnsi"/>
           <w:highlight w:val="yellow"/>
           <w:lang w:val="es-CO"/>
         </w:rPr>
@@ -962,6 +936,7 @@
       <w:proofErr w:type="spellStart"/>
       <w:r>
         <w:rPr>
+          <w:rFonts w:asciiTheme="majorHAnsi" w:hAnsiTheme="majorHAnsi" w:cstheme="majorHAnsi"/>
           <w:highlight w:val="yellow"/>
           <w:lang w:val="en-GB"/>
         </w:rPr>
@@ -970,6 +945,7 @@
       <w:proofErr w:type="spellEnd"/>
       <w:r>
         <w:rPr>
+          <w:rFonts w:asciiTheme="majorHAnsi" w:hAnsiTheme="majorHAnsi" w:cstheme="majorHAnsi"/>
           <w:highlight w:val="yellow"/>
           <w:lang w:val="en-GB"/>
         </w:rPr>
@@ -978,6 +954,7 @@
       <w:proofErr w:type="spellStart"/>
       <w:r>
         <w:rPr>
+          <w:rFonts w:asciiTheme="majorHAnsi" w:hAnsiTheme="majorHAnsi" w:cstheme="majorHAnsi"/>
           <w:highlight w:val="yellow"/>
           <w:lang w:val="en-GB"/>
         </w:rPr>
@@ -986,6 +963,7 @@
       <w:proofErr w:type="spellEnd"/>
       <w:r>
         <w:rPr>
+          <w:rFonts w:asciiTheme="majorHAnsi" w:hAnsiTheme="majorHAnsi" w:cstheme="majorHAnsi"/>
           <w:highlight w:val="yellow"/>
           <w:lang w:val="en-GB"/>
         </w:rPr>
@@ -994,6 +972,7 @@
       <w:proofErr w:type="spellStart"/>
       <w:r>
         <w:rPr>
+          <w:rFonts w:asciiTheme="majorHAnsi" w:hAnsiTheme="majorHAnsi" w:cstheme="majorHAnsi"/>
           <w:highlight w:val="yellow"/>
           <w:lang w:val="en-GB"/>
         </w:rPr>
@@ -1002,33 +981,29 @@
       <w:proofErr w:type="spellEnd"/>
       <w:r>
         <w:rPr>
+          <w:rFonts w:asciiTheme="majorHAnsi" w:hAnsiTheme="majorHAnsi" w:cstheme="majorHAnsi"/>
           <w:highlight w:val="yellow"/>
           <w:lang w:val="en-GB"/>
         </w:rPr>
-        <w:t>: NVIDIA (NVDA), Apple (AAPL), Microsoft (MSFT), Broadcom (AVGO), Micron Technology (MU), Oracle (ORCL), Advanced Micro Devices (AMD), Cisco Systems (CSCO), Lam Research (LRCX) y Applied Materials (AMAT).</w:t>
-      </w:r>
-      <w:r>
-        <w:rPr>
-          <w:highlight w:val="yellow"/>
-          <w:lang w:val="en-GB"/>
-        </w:rPr>
-        <w:t xml:space="preserve"> </w:t>
+        <w:t xml:space="preserve">: NVIDIA (NVDA), Apple (AAPL), Microsoft (MSFT), Broadcom (AVGO), Micron Technology (MU), Oracle (ORCL), Advanced Micro Devices (AMD), Cisco Systems (CSCO), Lam Research (LRCX) y Applied Materials (AMAT). </w:t>
       </w:r>
     </w:p>
     <w:p>
       <w:pPr>
-        <w:pStyle w:val="ListParagraph"/>
+        <w:pStyle w:val="Prrafodelista"/>
         <w:numPr>
           <w:ilvl w:val="0"/>
           <w:numId w:val="13"/>
         </w:numPr>
         <w:rPr>
+          <w:rFonts w:asciiTheme="majorHAnsi" w:hAnsiTheme="majorHAnsi" w:cstheme="majorHAnsi"/>
           <w:highlight w:val="yellow"/>
           <w:lang w:val="es-CO"/>
         </w:rPr>
       </w:pPr>
       <w:r>
         <w:rPr>
+          <w:rFonts w:asciiTheme="majorHAnsi" w:hAnsiTheme="majorHAnsi" w:cstheme="majorHAnsi"/>
           <w:highlight w:val="yellow"/>
           <w:lang w:val="es-CO"/>
         </w:rPr>
@@ -1037,6 +1012,7 @@
       <w:proofErr w:type="spellStart"/>
       <w:r>
         <w:rPr>
+          <w:rFonts w:asciiTheme="majorHAnsi" w:hAnsiTheme="majorHAnsi" w:cstheme="majorHAnsi"/>
           <w:highlight w:val="yellow"/>
           <w:lang w:val="es-CO"/>
         </w:rPr>
@@ -1045,6 +1021,7 @@
       <w:proofErr w:type="spellEnd"/>
       <w:r>
         <w:rPr>
+          <w:rFonts w:asciiTheme="majorHAnsi" w:hAnsiTheme="majorHAnsi" w:cstheme="majorHAnsi"/>
           <w:highlight w:val="yellow"/>
           <w:lang w:val="es-CO"/>
         </w:rPr>
@@ -1053,18 +1030,20 @@
     </w:p>
     <w:p>
       <w:pPr>
-        <w:pStyle w:val="ListParagraph"/>
+        <w:pStyle w:val="Prrafodelista"/>
         <w:numPr>
           <w:ilvl w:val="0"/>
           <w:numId w:val="13"/>
         </w:numPr>
         <w:rPr>
+          <w:rFonts w:asciiTheme="majorHAnsi" w:hAnsiTheme="majorHAnsi" w:cstheme="majorHAnsi"/>
           <w:highlight w:val="yellow"/>
           <w:lang w:val="en-GB"/>
         </w:rPr>
       </w:pPr>
       <w:r>
         <w:rPr>
+          <w:rFonts w:asciiTheme="majorHAnsi" w:hAnsiTheme="majorHAnsi" w:cstheme="majorHAnsi"/>
           <w:highlight w:val="yellow"/>
           <w:lang w:val="es-CO"/>
         </w:rPr>
@@ -1073,6 +1052,7 @@
       <w:proofErr w:type="spellStart"/>
       <w:r>
         <w:rPr>
+          <w:rFonts w:asciiTheme="majorHAnsi" w:hAnsiTheme="majorHAnsi" w:cstheme="majorHAnsi"/>
           <w:highlight w:val="yellow"/>
           <w:lang w:val="es-CO"/>
         </w:rPr>
@@ -1081,6 +1061,7 @@
       <w:proofErr w:type="spellEnd"/>
       <w:r>
         <w:rPr>
+          <w:rFonts w:asciiTheme="majorHAnsi" w:hAnsiTheme="majorHAnsi" w:cstheme="majorHAnsi"/>
           <w:highlight w:val="yellow"/>
           <w:lang w:val="es-CO"/>
         </w:rPr>
@@ -1089,6 +1070,7 @@
       <w:proofErr w:type="spellStart"/>
       <w:r>
         <w:rPr>
+          <w:rFonts w:asciiTheme="majorHAnsi" w:hAnsiTheme="majorHAnsi" w:cstheme="majorHAnsi"/>
           <w:highlight w:val="yellow"/>
           <w:lang w:val="en-GB"/>
         </w:rPr>
@@ -1097,6 +1079,7 @@
       <w:proofErr w:type="spellEnd"/>
       <w:r>
         <w:rPr>
+          <w:rFonts w:asciiTheme="majorHAnsi" w:hAnsiTheme="majorHAnsi" w:cstheme="majorHAnsi"/>
           <w:highlight w:val="yellow"/>
           <w:lang w:val="en-GB"/>
         </w:rPr>
@@ -1105,6 +1088,7 @@
       <w:proofErr w:type="spellStart"/>
       <w:r>
         <w:rPr>
+          <w:rFonts w:asciiTheme="majorHAnsi" w:hAnsiTheme="majorHAnsi" w:cstheme="majorHAnsi"/>
           <w:highlight w:val="yellow"/>
           <w:lang w:val="en-GB"/>
         </w:rPr>
@@ -1113,6 +1097,7 @@
       <w:proofErr w:type="spellEnd"/>
       <w:r>
         <w:rPr>
+          <w:rFonts w:asciiTheme="majorHAnsi" w:hAnsiTheme="majorHAnsi" w:cstheme="majorHAnsi"/>
           <w:highlight w:val="yellow"/>
           <w:lang w:val="en-GB"/>
         </w:rPr>
@@ -1121,6 +1106,7 @@
       <w:proofErr w:type="spellStart"/>
       <w:r>
         <w:rPr>
+          <w:rFonts w:asciiTheme="majorHAnsi" w:hAnsiTheme="majorHAnsi" w:cstheme="majorHAnsi"/>
           <w:highlight w:val="yellow"/>
           <w:lang w:val="en-GB"/>
         </w:rPr>
@@ -1129,6 +1115,7 @@
       <w:proofErr w:type="spellEnd"/>
       <w:r>
         <w:rPr>
+          <w:rFonts w:asciiTheme="majorHAnsi" w:hAnsiTheme="majorHAnsi" w:cstheme="majorHAnsi"/>
           <w:highlight w:val="yellow"/>
           <w:lang w:val="en-GB"/>
         </w:rPr>
@@ -1137,7 +1124,7 @@
     </w:p>
     <w:p>
       <w:pPr>
-        <w:pStyle w:val="ListBullet"/>
+        <w:pStyle w:val="Listaconvietas"/>
         <w:numPr>
           <w:ilvl w:val="1"/>
           <w:numId w:val="11"/>
@@ -1162,11 +1149,13 @@
     <w:p>
       <w:pPr>
         <w:rPr>
-          <w:lang w:val="es-CO"/>
-        </w:rPr>
-      </w:pPr>
-      <w:r>
-        <w:rPr>
+          <w:rFonts w:asciiTheme="majorHAnsi" w:hAnsiTheme="majorHAnsi" w:cstheme="majorHAnsi"/>
+          <w:lang w:val="es-CO"/>
+        </w:rPr>
+      </w:pPr>
+      <w:r>
+        <w:rPr>
+          <w:rFonts w:asciiTheme="majorHAnsi" w:hAnsiTheme="majorHAnsi" w:cstheme="majorHAnsi"/>
           <w:highlight w:val="yellow"/>
           <w:lang w:val="es-CO"/>
         </w:rPr>
@@ -1174,96 +1163,93 @@
       </w:r>
       <w:r>
         <w:rPr>
+          <w:rFonts w:asciiTheme="majorHAnsi" w:hAnsiTheme="majorHAnsi" w:cstheme="majorHAnsi"/>
           <w:highlight w:val="yellow"/>
           <w:lang w:val="es-CO"/>
         </w:rPr>
-        <w:t>Excel</w:t>
-      </w:r>
-      <w:r>
-        <w:rPr>
+        <w:t>Excel Datos</w:t>
+      </w:r>
+      <w:r>
+        <w:rPr>
+          <w:rFonts w:asciiTheme="majorHAnsi" w:hAnsiTheme="majorHAnsi" w:cstheme="majorHAnsi"/>
           <w:highlight w:val="yellow"/>
           <w:lang w:val="es-CO"/>
         </w:rPr>
-        <w:t xml:space="preserve"> Datos</w:t>
-      </w:r>
-      <w:r>
-        <w:rPr>
+        <w:t xml:space="preserve"> Sectores </w:t>
+      </w:r>
+      <w:proofErr w:type="spellStart"/>
+      <w:r>
+        <w:rPr>
+          <w:rFonts w:asciiTheme="majorHAnsi" w:hAnsiTheme="majorHAnsi" w:cstheme="majorHAnsi"/>
           <w:highlight w:val="yellow"/>
           <w:lang w:val="es-CO"/>
         </w:rPr>
-        <w:t xml:space="preserve"> Sectores </w:t>
+        <w:t>Equity</w:t>
+      </w:r>
+      <w:proofErr w:type="spellEnd"/>
+      <w:r>
+        <w:rPr>
+          <w:rFonts w:asciiTheme="majorHAnsi" w:hAnsiTheme="majorHAnsi" w:cstheme="majorHAnsi"/>
+          <w:highlight w:val="yellow"/>
+          <w:lang w:val="es-CO"/>
+        </w:rPr>
+        <w:t xml:space="preserve"> (</w:t>
       </w:r>
       <w:proofErr w:type="spellStart"/>
       <w:r>
         <w:rPr>
+          <w:rFonts w:asciiTheme="majorHAnsi" w:hAnsiTheme="majorHAnsi" w:cstheme="majorHAnsi"/>
           <w:highlight w:val="yellow"/>
           <w:lang w:val="es-CO"/>
         </w:rPr>
-        <w:t>Equity</w:t>
+        <w:t>Index</w:t>
       </w:r>
       <w:proofErr w:type="spellEnd"/>
       <w:r>
         <w:rPr>
+          <w:rFonts w:asciiTheme="majorHAnsi" w:hAnsiTheme="majorHAnsi" w:cstheme="majorHAnsi"/>
           <w:highlight w:val="yellow"/>
           <w:lang w:val="es-CO"/>
         </w:rPr>
-        <w:t xml:space="preserve"> (</w:t>
+        <w:t xml:space="preserve"> </w:t>
       </w:r>
       <w:proofErr w:type="spellStart"/>
       <w:r>
         <w:rPr>
+          <w:rFonts w:asciiTheme="majorHAnsi" w:hAnsiTheme="majorHAnsi" w:cstheme="majorHAnsi"/>
           <w:highlight w:val="yellow"/>
           <w:lang w:val="es-CO"/>
         </w:rPr>
-        <w:t>Index</w:t>
+        <w:t>review</w:t>
       </w:r>
       <w:proofErr w:type="spellEnd"/>
       <w:r>
         <w:rPr>
+          <w:rFonts w:asciiTheme="majorHAnsi" w:hAnsiTheme="majorHAnsi" w:cstheme="majorHAnsi"/>
           <w:highlight w:val="yellow"/>
           <w:lang w:val="es-CO"/>
         </w:rPr>
+        <w:t>)</w:t>
+      </w:r>
+      <w:r>
+        <w:rPr>
+          <w:rFonts w:asciiTheme="majorHAnsi" w:hAnsiTheme="majorHAnsi" w:cstheme="majorHAnsi"/>
+          <w:highlight w:val="yellow"/>
+          <w:lang w:val="es-CO"/>
+        </w:rPr>
         <w:t xml:space="preserve"> </w:t>
       </w:r>
-      <w:proofErr w:type="spellStart"/>
-      <w:r>
-        <w:rPr>
+      <w:r>
+        <w:rPr>
+          <w:rFonts w:asciiTheme="majorHAnsi" w:hAnsiTheme="majorHAnsi" w:cstheme="majorHAnsi"/>
           <w:highlight w:val="yellow"/>
           <w:lang w:val="es-CO"/>
         </w:rPr>
-        <w:t>review</w:t>
-      </w:r>
-      <w:proofErr w:type="spellEnd"/>
-      <w:r>
-        <w:rPr>
-          <w:highlight w:val="yellow"/>
-          <w:lang w:val="es-CO"/>
-        </w:rPr>
-        <w:t>)</w:t>
-      </w:r>
-      <w:r>
-        <w:rPr>
-          <w:highlight w:val="yellow"/>
-          <w:lang w:val="es-CO"/>
-        </w:rPr>
-        <w:t xml:space="preserve"> </w:t>
-      </w:r>
-      <w:r>
-        <w:rPr>
-          <w:highlight w:val="yellow"/>
-          <w:lang w:val="es-CO"/>
-        </w:rPr>
-        <w:t xml:space="preserve">– </w:t>
-      </w:r>
-      <w:r>
-        <w:rPr>
-          <w:highlight w:val="yellow"/>
-          <w:lang w:val="es-CO"/>
-        </w:rPr>
-        <w:t xml:space="preserve">Hojas: </w:t>
-      </w:r>
-      <w:r>
-        <w:rPr>
+        <w:t xml:space="preserve">– Hojas: </w:t>
+      </w:r>
+      <w:r>
+        <w:rPr>
+          <w:rFonts w:asciiTheme="majorHAnsi" w:hAnsiTheme="majorHAnsi" w:cstheme="majorHAnsi"/>
           <w:highlight w:val="yellow"/>
           <w:lang w:val="es-CO"/>
         </w:rPr>
@@ -1272,7 +1258,7 @@
     </w:p>
     <w:p>
       <w:pPr>
-        <w:pStyle w:val="ListBullet"/>
+        <w:pStyle w:val="Listaconvietas"/>
         <w:numPr>
           <w:ilvl w:val="1"/>
           <w:numId w:val="11"/>
@@ -1324,11 +1310,13 @@
     <w:p>
       <w:pPr>
         <w:rPr>
-          <w:lang w:val="es-CO"/>
-        </w:rPr>
-      </w:pPr>
-      <w:r>
-        <w:rPr>
+          <w:rFonts w:asciiTheme="majorHAnsi" w:hAnsiTheme="majorHAnsi" w:cstheme="majorHAnsi"/>
+          <w:lang w:val="es-CO"/>
+        </w:rPr>
+      </w:pPr>
+      <w:r>
+        <w:rPr>
+          <w:rFonts w:asciiTheme="majorHAnsi" w:hAnsiTheme="majorHAnsi" w:cstheme="majorHAnsi"/>
           <w:highlight w:val="yellow"/>
           <w:lang w:val="es-CO"/>
         </w:rPr>
@@ -1336,6 +1324,7 @@
       </w:r>
       <w:r>
         <w:rPr>
+          <w:rFonts w:asciiTheme="majorHAnsi" w:hAnsiTheme="majorHAnsi" w:cstheme="majorHAnsi"/>
           <w:highlight w:val="yellow"/>
           <w:lang w:val="es-CO"/>
         </w:rPr>
@@ -1344,6 +1333,7 @@
       <w:proofErr w:type="spellStart"/>
       <w:r>
         <w:rPr>
+          <w:rFonts w:asciiTheme="majorHAnsi" w:hAnsiTheme="majorHAnsi" w:cstheme="majorHAnsi"/>
           <w:highlight w:val="yellow"/>
           <w:lang w:val="es-CO"/>
         </w:rPr>
@@ -1352,6 +1342,7 @@
       <w:proofErr w:type="spellEnd"/>
       <w:r>
         <w:rPr>
+          <w:rFonts w:asciiTheme="majorHAnsi" w:hAnsiTheme="majorHAnsi" w:cstheme="majorHAnsi"/>
           <w:highlight w:val="yellow"/>
           <w:lang w:val="es-CO"/>
         </w:rPr>
@@ -1360,6 +1351,7 @@
       <w:proofErr w:type="spellStart"/>
       <w:r>
         <w:rPr>
+          <w:rFonts w:asciiTheme="majorHAnsi" w:hAnsiTheme="majorHAnsi" w:cstheme="majorHAnsi"/>
           <w:highlight w:val="yellow"/>
           <w:lang w:val="es-CO"/>
         </w:rPr>
@@ -1368,6 +1360,7 @@
       <w:proofErr w:type="spellEnd"/>
       <w:r>
         <w:rPr>
+          <w:rFonts w:asciiTheme="majorHAnsi" w:hAnsiTheme="majorHAnsi" w:cstheme="majorHAnsi"/>
           <w:highlight w:val="yellow"/>
           <w:lang w:val="es-CO"/>
         </w:rPr>
@@ -1376,6 +1369,7 @@
       <w:proofErr w:type="spellStart"/>
       <w:r>
         <w:rPr>
+          <w:rFonts w:asciiTheme="majorHAnsi" w:hAnsiTheme="majorHAnsi" w:cstheme="majorHAnsi"/>
           <w:highlight w:val="yellow"/>
           <w:lang w:val="es-CO"/>
         </w:rPr>
@@ -1384,50 +1378,40 @@
       <w:proofErr w:type="spellEnd"/>
       <w:r>
         <w:rPr>
+          <w:rFonts w:asciiTheme="majorHAnsi" w:hAnsiTheme="majorHAnsi" w:cstheme="majorHAnsi"/>
           <w:highlight w:val="yellow"/>
           <w:lang w:val="es-CO"/>
         </w:rPr>
-        <w:t>)</w:t>
-      </w:r>
-      <w:r>
-        <w:rPr>
+        <w:t xml:space="preserve">) </w:t>
+      </w:r>
+      <w:r>
+        <w:rPr>
+          <w:rFonts w:asciiTheme="majorHAnsi" w:hAnsiTheme="majorHAnsi" w:cstheme="majorHAnsi"/>
           <w:highlight w:val="yellow"/>
           <w:lang w:val="es-CO"/>
         </w:rPr>
-        <w:t xml:space="preserve"> </w:t>
-      </w:r>
-      <w:r>
-        <w:rPr>
+        <w:t xml:space="preserve">– </w:t>
+      </w:r>
+      <w:r>
+        <w:rPr>
+          <w:rFonts w:asciiTheme="majorHAnsi" w:hAnsiTheme="majorHAnsi" w:cstheme="majorHAnsi"/>
           <w:highlight w:val="yellow"/>
           <w:lang w:val="es-CO"/>
         </w:rPr>
-        <w:t xml:space="preserve">– </w:t>
-      </w:r>
-      <w:r>
-        <w:rPr>
+        <w:t xml:space="preserve">Hoja: </w:t>
+      </w:r>
+      <w:r>
+        <w:rPr>
+          <w:rFonts w:asciiTheme="majorHAnsi" w:hAnsiTheme="majorHAnsi" w:cstheme="majorHAnsi"/>
           <w:highlight w:val="yellow"/>
           <w:lang w:val="es-CO"/>
         </w:rPr>
-        <w:t xml:space="preserve">Hoja: </w:t>
-      </w:r>
-      <w:r>
-        <w:rPr>
-          <w:highlight w:val="yellow"/>
-          <w:lang w:val="es-CO"/>
-        </w:rPr>
-        <w:t>Gráficas</w:t>
-      </w:r>
-      <w:r>
-        <w:rPr>
-          <w:highlight w:val="yellow"/>
-          <w:lang w:val="es-CO"/>
-        </w:rPr>
-        <w:t>)</w:t>
+        <w:t>Gráficas)</w:t>
       </w:r>
     </w:p>
     <w:p>
       <w:pPr>
-        <w:pStyle w:val="ListBullet"/>
+        <w:pStyle w:val="Listaconvietas"/>
         <w:numPr>
           <w:ilvl w:val="1"/>
           <w:numId w:val="11"/>
@@ -1461,12 +1445,14 @@
     <w:p>
       <w:pPr>
         <w:rPr>
+          <w:rFonts w:asciiTheme="majorHAnsi" w:hAnsiTheme="majorHAnsi" w:cstheme="majorHAnsi"/>
           <w:highlight w:val="yellow"/>
           <w:lang w:val="es-CO"/>
         </w:rPr>
       </w:pPr>
       <w:r>
         <w:rPr>
+          <w:rFonts w:asciiTheme="majorHAnsi" w:hAnsiTheme="majorHAnsi" w:cstheme="majorHAnsi"/>
           <w:highlight w:val="yellow"/>
           <w:lang w:val="es-CO"/>
         </w:rPr>
@@ -1476,11 +1462,13 @@
     <w:p>
       <w:pPr>
         <w:rPr>
-          <w:lang w:val="es-CO"/>
-        </w:rPr>
-      </w:pPr>
-      <w:r>
-        <w:rPr>
+          <w:rFonts w:asciiTheme="majorHAnsi" w:hAnsiTheme="majorHAnsi" w:cstheme="majorHAnsi"/>
+          <w:lang w:val="es-CO"/>
+        </w:rPr>
+      </w:pPr>
+      <w:r>
+        <w:rPr>
+          <w:rFonts w:asciiTheme="majorHAnsi" w:hAnsiTheme="majorHAnsi" w:cstheme="majorHAnsi"/>
           <w:highlight w:val="yellow"/>
           <w:lang w:val="es-CO"/>
         </w:rPr>
@@ -1490,6 +1478,7 @@
       <w:proofErr w:type="spellStart"/>
       <w:r>
         <w:rPr>
+          <w:rFonts w:asciiTheme="majorHAnsi" w:hAnsiTheme="majorHAnsi" w:cstheme="majorHAnsi"/>
           <w:highlight w:val="yellow"/>
           <w:lang w:val="es-CO"/>
         </w:rPr>
@@ -1498,6 +1487,7 @@
       <w:proofErr w:type="spellEnd"/>
       <w:r>
         <w:rPr>
+          <w:rFonts w:asciiTheme="majorHAnsi" w:hAnsiTheme="majorHAnsi" w:cstheme="majorHAnsi"/>
           <w:highlight w:val="yellow"/>
           <w:lang w:val="es-CO"/>
         </w:rPr>
@@ -1507,110 +1497,76 @@
     <w:p>
       <w:pPr>
         <w:rPr>
-          <w:lang w:val="es-CO"/>
-        </w:rPr>
-      </w:pPr>
-      <w:r>
-        <w:rPr>
+          <w:rFonts w:asciiTheme="majorHAnsi" w:hAnsiTheme="majorHAnsi" w:cstheme="majorHAnsi"/>
+          <w:lang w:val="es-CO"/>
+        </w:rPr>
+      </w:pPr>
+      <w:r>
+        <w:rPr>
+          <w:rFonts w:asciiTheme="majorHAnsi" w:hAnsiTheme="majorHAnsi" w:cstheme="majorHAnsi"/>
           <w:highlight w:val="yellow"/>
           <w:lang w:val="es-CO"/>
         </w:rPr>
-        <w:t xml:space="preserve">(Ver Excel </w:t>
-      </w:r>
-      <w:r>
-        <w:rPr>
+        <w:t xml:space="preserve">(Ver Excel Datos Sectores </w:t>
+      </w:r>
+      <w:proofErr w:type="spellStart"/>
+      <w:r>
+        <w:rPr>
+          <w:rFonts w:asciiTheme="majorHAnsi" w:hAnsiTheme="majorHAnsi" w:cstheme="majorHAnsi"/>
           <w:highlight w:val="yellow"/>
           <w:lang w:val="es-CO"/>
         </w:rPr>
-        <w:t xml:space="preserve">Datos Sectores </w:t>
+        <w:t>Equity</w:t>
+      </w:r>
+      <w:proofErr w:type="spellEnd"/>
+      <w:r>
+        <w:rPr>
+          <w:rFonts w:asciiTheme="majorHAnsi" w:hAnsiTheme="majorHAnsi" w:cstheme="majorHAnsi"/>
+          <w:highlight w:val="yellow"/>
+          <w:lang w:val="es-CO"/>
+        </w:rPr>
+        <w:t xml:space="preserve"> (</w:t>
       </w:r>
       <w:proofErr w:type="spellStart"/>
       <w:r>
         <w:rPr>
+          <w:rFonts w:asciiTheme="majorHAnsi" w:hAnsiTheme="majorHAnsi" w:cstheme="majorHAnsi"/>
           <w:highlight w:val="yellow"/>
           <w:lang w:val="es-CO"/>
         </w:rPr>
-        <w:t>Equity</w:t>
+        <w:t>Index</w:t>
       </w:r>
       <w:proofErr w:type="spellEnd"/>
       <w:r>
         <w:rPr>
+          <w:rFonts w:asciiTheme="majorHAnsi" w:hAnsiTheme="majorHAnsi" w:cstheme="majorHAnsi"/>
           <w:highlight w:val="yellow"/>
           <w:lang w:val="es-CO"/>
         </w:rPr>
-        <w:t xml:space="preserve"> (</w:t>
+        <w:t xml:space="preserve"> </w:t>
       </w:r>
       <w:proofErr w:type="spellStart"/>
       <w:r>
         <w:rPr>
+          <w:rFonts w:asciiTheme="majorHAnsi" w:hAnsiTheme="majorHAnsi" w:cstheme="majorHAnsi"/>
           <w:highlight w:val="yellow"/>
           <w:lang w:val="es-CO"/>
         </w:rPr>
-        <w:t>Index</w:t>
+        <w:t>review</w:t>
       </w:r>
       <w:proofErr w:type="spellEnd"/>
       <w:r>
         <w:rPr>
+          <w:rFonts w:asciiTheme="majorHAnsi" w:hAnsiTheme="majorHAnsi" w:cstheme="majorHAnsi"/>
           <w:highlight w:val="yellow"/>
           <w:lang w:val="es-CO"/>
         </w:rPr>
-        <w:t xml:space="preserve"> </w:t>
-      </w:r>
-      <w:proofErr w:type="spellStart"/>
-      <w:r>
-        <w:rPr>
-          <w:highlight w:val="yellow"/>
-          <w:lang w:val="es-CO"/>
-        </w:rPr>
-        <w:t>review</w:t>
-      </w:r>
-      <w:proofErr w:type="spellEnd"/>
-      <w:r>
-        <w:rPr>
-          <w:highlight w:val="yellow"/>
-          <w:lang w:val="es-CO"/>
-        </w:rPr>
-        <w:t>)</w:t>
-      </w:r>
-      <w:r>
-        <w:rPr>
-          <w:highlight w:val="yellow"/>
-          <w:lang w:val="es-CO"/>
-        </w:rPr>
-        <w:t xml:space="preserve"> </w:t>
-      </w:r>
-      <w:r>
-        <w:rPr>
-          <w:highlight w:val="yellow"/>
-          <w:lang w:val="es-CO"/>
-        </w:rPr>
-        <w:t xml:space="preserve">– </w:t>
-      </w:r>
-      <w:r>
-        <w:rPr>
-          <w:highlight w:val="yellow"/>
-          <w:lang w:val="es-CO"/>
-        </w:rPr>
-        <w:t>Hoja:</w:t>
-      </w:r>
-      <w:r>
-        <w:rPr>
-          <w:highlight w:val="yellow"/>
-          <w:lang w:val="es-CO"/>
-        </w:rPr>
-        <w:t xml:space="preserve"> Gráficas</w:t>
-      </w:r>
-      <w:r>
-        <w:rPr>
-          <w:highlight w:val="yellow"/>
-          <w:lang w:val="es-CO"/>
-        </w:rPr>
-        <w:t>)</w:t>
+        <w:t>) – Hoja: Gráficas)</w:t>
       </w:r>
     </w:p>
     <w:p>
       <w:pPr>
-        <w:pStyle w:val="ListBullet"/>
+        <w:pStyle w:val="Listaconvietas"/>
         <w:numPr>
           <w:ilvl w:val="0"/>
           <w:numId w:val="0"/>
@@ -1626,7 +1582,7 @@
     </w:p>
     <w:p>
       <w:pPr>
-        <w:pStyle w:val="ListBullet"/>
+        <w:pStyle w:val="Listaconvietas"/>
         <w:numPr>
           <w:ilvl w:val="1"/>
           <w:numId w:val="11"/>
@@ -1732,12 +1688,14 @@
     <w:p>
       <w:pPr>
         <w:rPr>
+          <w:rFonts w:asciiTheme="majorHAnsi" w:hAnsiTheme="majorHAnsi" w:cstheme="majorHAnsi"/>
           <w:highlight w:val="yellow"/>
           <w:lang w:val="es-CO"/>
         </w:rPr>
       </w:pPr>
       <w:r>
         <w:rPr>
+          <w:rFonts w:asciiTheme="majorHAnsi" w:hAnsiTheme="majorHAnsi" w:cstheme="majorHAnsi"/>
           <w:highlight w:val="yellow"/>
           <w:lang w:val="es-CO"/>
         </w:rPr>
@@ -1747,11 +1705,13 @@
     <w:p>
       <w:pPr>
         <w:rPr>
-          <w:lang w:val="es-CO"/>
-        </w:rPr>
-      </w:pPr>
-      <w:r>
-        <w:rPr>
+          <w:rFonts w:asciiTheme="majorHAnsi" w:hAnsiTheme="majorHAnsi" w:cstheme="majorHAnsi"/>
+          <w:lang w:val="es-CO"/>
+        </w:rPr>
+      </w:pPr>
+      <w:r>
+        <w:rPr>
+          <w:rFonts w:asciiTheme="majorHAnsi" w:hAnsiTheme="majorHAnsi" w:cstheme="majorHAnsi"/>
           <w:highlight w:val="yellow"/>
           <w:lang w:val="es-CO"/>
         </w:rPr>
@@ -1761,110 +1721,76 @@
     <w:p>
       <w:pPr>
         <w:rPr>
-          <w:lang w:val="es-CO"/>
-        </w:rPr>
-      </w:pPr>
-      <w:r>
-        <w:rPr>
+          <w:rFonts w:asciiTheme="majorHAnsi" w:hAnsiTheme="majorHAnsi" w:cstheme="majorHAnsi"/>
+          <w:lang w:val="es-CO"/>
+        </w:rPr>
+      </w:pPr>
+      <w:r>
+        <w:rPr>
+          <w:rFonts w:asciiTheme="majorHAnsi" w:hAnsiTheme="majorHAnsi" w:cstheme="majorHAnsi"/>
           <w:highlight w:val="yellow"/>
           <w:lang w:val="es-CO"/>
         </w:rPr>
-        <w:t xml:space="preserve">(Ver Excel </w:t>
-      </w:r>
-      <w:r>
-        <w:rPr>
+        <w:t xml:space="preserve">(Ver Excel Datos Sectores </w:t>
+      </w:r>
+      <w:proofErr w:type="spellStart"/>
+      <w:r>
+        <w:rPr>
+          <w:rFonts w:asciiTheme="majorHAnsi" w:hAnsiTheme="majorHAnsi" w:cstheme="majorHAnsi"/>
           <w:highlight w:val="yellow"/>
           <w:lang w:val="es-CO"/>
         </w:rPr>
-        <w:t xml:space="preserve">Datos Sectores </w:t>
+        <w:t>Equity</w:t>
+      </w:r>
+      <w:proofErr w:type="spellEnd"/>
+      <w:r>
+        <w:rPr>
+          <w:rFonts w:asciiTheme="majorHAnsi" w:hAnsiTheme="majorHAnsi" w:cstheme="majorHAnsi"/>
+          <w:highlight w:val="yellow"/>
+          <w:lang w:val="es-CO"/>
+        </w:rPr>
+        <w:t xml:space="preserve"> (</w:t>
       </w:r>
       <w:proofErr w:type="spellStart"/>
       <w:r>
         <w:rPr>
+          <w:rFonts w:asciiTheme="majorHAnsi" w:hAnsiTheme="majorHAnsi" w:cstheme="majorHAnsi"/>
           <w:highlight w:val="yellow"/>
           <w:lang w:val="es-CO"/>
         </w:rPr>
-        <w:t>Equity</w:t>
+        <w:t>Index</w:t>
       </w:r>
       <w:proofErr w:type="spellEnd"/>
       <w:r>
         <w:rPr>
+          <w:rFonts w:asciiTheme="majorHAnsi" w:hAnsiTheme="majorHAnsi" w:cstheme="majorHAnsi"/>
           <w:highlight w:val="yellow"/>
           <w:lang w:val="es-CO"/>
         </w:rPr>
-        <w:t xml:space="preserve"> (</w:t>
+        <w:t xml:space="preserve"> </w:t>
       </w:r>
       <w:proofErr w:type="spellStart"/>
       <w:r>
         <w:rPr>
+          <w:rFonts w:asciiTheme="majorHAnsi" w:hAnsiTheme="majorHAnsi" w:cstheme="majorHAnsi"/>
           <w:highlight w:val="yellow"/>
           <w:lang w:val="es-CO"/>
         </w:rPr>
-        <w:t>Index</w:t>
+        <w:t>review</w:t>
       </w:r>
       <w:proofErr w:type="spellEnd"/>
       <w:r>
         <w:rPr>
+          <w:rFonts w:asciiTheme="majorHAnsi" w:hAnsiTheme="majorHAnsi" w:cstheme="majorHAnsi"/>
           <w:highlight w:val="yellow"/>
           <w:lang w:val="es-CO"/>
         </w:rPr>
-        <w:t xml:space="preserve"> </w:t>
-      </w:r>
-      <w:proofErr w:type="spellStart"/>
-      <w:r>
-        <w:rPr>
-          <w:highlight w:val="yellow"/>
-          <w:lang w:val="es-CO"/>
-        </w:rPr>
-        <w:t>review</w:t>
-      </w:r>
-      <w:proofErr w:type="spellEnd"/>
-      <w:r>
-        <w:rPr>
-          <w:highlight w:val="yellow"/>
-          <w:lang w:val="es-CO"/>
-        </w:rPr>
-        <w:t>)</w:t>
-      </w:r>
-      <w:r>
-        <w:rPr>
-          <w:highlight w:val="yellow"/>
-          <w:lang w:val="es-CO"/>
-        </w:rPr>
-        <w:t xml:space="preserve"> </w:t>
-      </w:r>
-      <w:r>
-        <w:rPr>
-          <w:highlight w:val="yellow"/>
-          <w:lang w:val="es-CO"/>
-        </w:rPr>
-        <w:t xml:space="preserve">– </w:t>
-      </w:r>
-      <w:r>
-        <w:rPr>
-          <w:highlight w:val="yellow"/>
-          <w:lang w:val="es-CO"/>
-        </w:rPr>
-        <w:t>Hoja:</w:t>
-      </w:r>
-      <w:r>
-        <w:rPr>
-          <w:highlight w:val="yellow"/>
-          <w:lang w:val="es-CO"/>
-        </w:rPr>
-        <w:t xml:space="preserve"> Gráficas</w:t>
-      </w:r>
-      <w:r>
-        <w:rPr>
-          <w:highlight w:val="yellow"/>
-          <w:lang w:val="es-CO"/>
-        </w:rPr>
-        <w:t>)</w:t>
+        <w:t>) – Hoja: Gráficas)</w:t>
       </w:r>
     </w:p>
     <w:p>
       <w:pPr>
-        <w:pStyle w:val="ListBullet"/>
+        <w:pStyle w:val="Listaconvietas"/>
         <w:numPr>
           <w:ilvl w:val="0"/>
           <w:numId w:val="11"/>
@@ -1936,7 +1862,7 @@
     </w:p>
     <w:p>
       <w:pPr>
-        <w:pStyle w:val="ListBullet"/>
+        <w:pStyle w:val="Listaconvietas"/>
         <w:numPr>
           <w:ilvl w:val="1"/>
           <w:numId w:val="11"/>
@@ -1987,7 +1913,101 @@
     </w:p>
     <w:p>
       <w:pPr>
-        <w:pStyle w:val="ListBullet"/>
+        <w:pStyle w:val="Listaconvietas"/>
+        <w:numPr>
+          <w:ilvl w:val="0"/>
+          <w:numId w:val="0"/>
+        </w:numPr>
+        <w:ind w:left="1440"/>
+        <w:rPr>
+          <w:rFonts w:asciiTheme="majorHAnsi" w:hAnsiTheme="majorHAnsi" w:cstheme="majorHAnsi"/>
+          <w:sz w:val="24"/>
+          <w:szCs w:val="24"/>
+          <w:lang w:val="es-CO"/>
+        </w:rPr>
+      </w:pPr>
+      <w:r>
+        <w:rPr>
+          <w:rFonts w:asciiTheme="majorHAnsi" w:hAnsiTheme="majorHAnsi" w:cstheme="majorHAnsi"/>
+          <w:highlight w:val="yellow"/>
+          <w:lang w:val="es-CO"/>
+        </w:rPr>
+        <w:t xml:space="preserve">(Ver Excel Datos Sectores </w:t>
+      </w:r>
+      <w:proofErr w:type="spellStart"/>
+      <w:r>
+        <w:rPr>
+          <w:rFonts w:asciiTheme="majorHAnsi" w:hAnsiTheme="majorHAnsi" w:cstheme="majorHAnsi"/>
+          <w:highlight w:val="yellow"/>
+          <w:lang w:val="es-CO"/>
+        </w:rPr>
+        <w:t>Equity</w:t>
+      </w:r>
+      <w:proofErr w:type="spellEnd"/>
+      <w:r>
+        <w:rPr>
+          <w:rFonts w:asciiTheme="majorHAnsi" w:hAnsiTheme="majorHAnsi" w:cstheme="majorHAnsi"/>
+          <w:highlight w:val="yellow"/>
+          <w:lang w:val="es-CO"/>
+        </w:rPr>
+        <w:t xml:space="preserve"> (</w:t>
+      </w:r>
+      <w:proofErr w:type="spellStart"/>
+      <w:r>
+        <w:rPr>
+          <w:rFonts w:asciiTheme="majorHAnsi" w:hAnsiTheme="majorHAnsi" w:cstheme="majorHAnsi"/>
+          <w:highlight w:val="yellow"/>
+          <w:lang w:val="es-CO"/>
+        </w:rPr>
+        <w:t>Index</w:t>
+      </w:r>
+      <w:proofErr w:type="spellEnd"/>
+      <w:r>
+        <w:rPr>
+          <w:rFonts w:asciiTheme="majorHAnsi" w:hAnsiTheme="majorHAnsi" w:cstheme="majorHAnsi"/>
+          <w:highlight w:val="yellow"/>
+          <w:lang w:val="es-CO"/>
+        </w:rPr>
+        <w:t xml:space="preserve"> </w:t>
+      </w:r>
+      <w:proofErr w:type="spellStart"/>
+      <w:r>
+        <w:rPr>
+          <w:rFonts w:asciiTheme="majorHAnsi" w:hAnsiTheme="majorHAnsi" w:cstheme="majorHAnsi"/>
+          <w:highlight w:val="yellow"/>
+          <w:lang w:val="es-CO"/>
+        </w:rPr>
+        <w:t>review</w:t>
+      </w:r>
+      <w:proofErr w:type="spellEnd"/>
+      <w:r>
+        <w:rPr>
+          <w:rFonts w:asciiTheme="majorHAnsi" w:hAnsiTheme="majorHAnsi" w:cstheme="majorHAnsi"/>
+          <w:highlight w:val="yellow"/>
+          <w:lang w:val="es-CO"/>
+        </w:rPr>
+        <w:t>) – Hojas: Tecnología / Consumo Básico / Inmobiliario)</w:t>
+      </w:r>
+    </w:p>
+    <w:p>
+      <w:pPr>
+        <w:pStyle w:val="Listaconvietas"/>
+        <w:numPr>
+          <w:ilvl w:val="0"/>
+          <w:numId w:val="0"/>
+        </w:numPr>
+        <w:ind w:left="1440"/>
+        <w:rPr>
+          <w:rFonts w:asciiTheme="majorHAnsi" w:hAnsiTheme="majorHAnsi" w:cstheme="majorHAnsi"/>
+          <w:sz w:val="24"/>
+          <w:szCs w:val="24"/>
+          <w:lang w:val="es-CO"/>
+        </w:rPr>
+      </w:pPr>
+    </w:p>
+    <w:p>
+      <w:pPr>
+        <w:pStyle w:val="Listaconvietas"/>
         <w:numPr>
           <w:ilvl w:val="1"/>
           <w:numId w:val="11"/>
@@ -2020,7 +2040,101 @@
     </w:p>
     <w:p>
       <w:pPr>
-        <w:pStyle w:val="ListBullet"/>
+        <w:pStyle w:val="Listaconvietas"/>
+        <w:numPr>
+          <w:ilvl w:val="0"/>
+          <w:numId w:val="0"/>
+        </w:numPr>
+        <w:ind w:left="1440"/>
+        <w:rPr>
+          <w:rFonts w:asciiTheme="majorHAnsi" w:hAnsiTheme="majorHAnsi" w:cstheme="majorHAnsi"/>
+          <w:sz w:val="24"/>
+          <w:szCs w:val="24"/>
+          <w:lang w:val="es-CO"/>
+        </w:rPr>
+      </w:pPr>
+      <w:r>
+        <w:rPr>
+          <w:rFonts w:asciiTheme="majorHAnsi" w:hAnsiTheme="majorHAnsi" w:cstheme="majorHAnsi"/>
+          <w:highlight w:val="yellow"/>
+          <w:lang w:val="es-CO"/>
+        </w:rPr>
+        <w:t xml:space="preserve">(Ver Excel Datos Sectores </w:t>
+      </w:r>
+      <w:proofErr w:type="spellStart"/>
+      <w:r>
+        <w:rPr>
+          <w:rFonts w:asciiTheme="majorHAnsi" w:hAnsiTheme="majorHAnsi" w:cstheme="majorHAnsi"/>
+          <w:highlight w:val="yellow"/>
+          <w:lang w:val="es-CO"/>
+        </w:rPr>
+        <w:t>Equity</w:t>
+      </w:r>
+      <w:proofErr w:type="spellEnd"/>
+      <w:r>
+        <w:rPr>
+          <w:rFonts w:asciiTheme="majorHAnsi" w:hAnsiTheme="majorHAnsi" w:cstheme="majorHAnsi"/>
+          <w:highlight w:val="yellow"/>
+          <w:lang w:val="es-CO"/>
+        </w:rPr>
+        <w:t xml:space="preserve"> (</w:t>
+      </w:r>
+      <w:proofErr w:type="spellStart"/>
+      <w:r>
+        <w:rPr>
+          <w:rFonts w:asciiTheme="majorHAnsi" w:hAnsiTheme="majorHAnsi" w:cstheme="majorHAnsi"/>
+          <w:highlight w:val="yellow"/>
+          <w:lang w:val="es-CO"/>
+        </w:rPr>
+        <w:t>Index</w:t>
+      </w:r>
+      <w:proofErr w:type="spellEnd"/>
+      <w:r>
+        <w:rPr>
+          <w:rFonts w:asciiTheme="majorHAnsi" w:hAnsiTheme="majorHAnsi" w:cstheme="majorHAnsi"/>
+          <w:highlight w:val="yellow"/>
+          <w:lang w:val="es-CO"/>
+        </w:rPr>
+        <w:t xml:space="preserve"> </w:t>
+      </w:r>
+      <w:proofErr w:type="spellStart"/>
+      <w:r>
+        <w:rPr>
+          <w:rFonts w:asciiTheme="majorHAnsi" w:hAnsiTheme="majorHAnsi" w:cstheme="majorHAnsi"/>
+          <w:highlight w:val="yellow"/>
+          <w:lang w:val="es-CO"/>
+        </w:rPr>
+        <w:t>review</w:t>
+      </w:r>
+      <w:proofErr w:type="spellEnd"/>
+      <w:r>
+        <w:rPr>
+          <w:rFonts w:asciiTheme="majorHAnsi" w:hAnsiTheme="majorHAnsi" w:cstheme="majorHAnsi"/>
+          <w:highlight w:val="yellow"/>
+          <w:lang w:val="es-CO"/>
+        </w:rPr>
+        <w:t>) – Hojas: Tecnología / Consumo Básico / Inmobiliario)</w:t>
+      </w:r>
+    </w:p>
+    <w:p>
+      <w:pPr>
+        <w:pStyle w:val="Listaconvietas"/>
+        <w:numPr>
+          <w:ilvl w:val="0"/>
+          <w:numId w:val="0"/>
+        </w:numPr>
+        <w:ind w:left="1440"/>
+        <w:rPr>
+          <w:rFonts w:asciiTheme="majorHAnsi" w:hAnsiTheme="majorHAnsi" w:cstheme="majorHAnsi"/>
+          <w:sz w:val="24"/>
+          <w:szCs w:val="24"/>
+          <w:lang w:val="es-CO"/>
+        </w:rPr>
+      </w:pPr>
+    </w:p>
+    <w:p>
+      <w:pPr>
+        <w:pStyle w:val="Listaconvietas"/>
         <w:numPr>
           <w:ilvl w:val="1"/>
           <w:numId w:val="11"/>
@@ -2062,7 +2176,101 @@
     </w:p>
     <w:p>
       <w:pPr>
-        <w:pStyle w:val="ListBullet"/>
+        <w:pStyle w:val="Listaconvietas"/>
+        <w:numPr>
+          <w:ilvl w:val="0"/>
+          <w:numId w:val="0"/>
+        </w:numPr>
+        <w:ind w:left="1440"/>
+        <w:rPr>
+          <w:rFonts w:asciiTheme="majorHAnsi" w:hAnsiTheme="majorHAnsi" w:cstheme="majorHAnsi"/>
+          <w:sz w:val="24"/>
+          <w:szCs w:val="24"/>
+          <w:lang w:val="es-CO"/>
+        </w:rPr>
+      </w:pPr>
+      <w:r>
+        <w:rPr>
+          <w:rFonts w:asciiTheme="majorHAnsi" w:hAnsiTheme="majorHAnsi" w:cstheme="majorHAnsi"/>
+          <w:highlight w:val="yellow"/>
+          <w:lang w:val="es-CO"/>
+        </w:rPr>
+        <w:t xml:space="preserve">(Ver Excel Datos Sectores </w:t>
+      </w:r>
+      <w:proofErr w:type="spellStart"/>
+      <w:r>
+        <w:rPr>
+          <w:rFonts w:asciiTheme="majorHAnsi" w:hAnsiTheme="majorHAnsi" w:cstheme="majorHAnsi"/>
+          <w:highlight w:val="yellow"/>
+          <w:lang w:val="es-CO"/>
+        </w:rPr>
+        <w:t>Equity</w:t>
+      </w:r>
+      <w:proofErr w:type="spellEnd"/>
+      <w:r>
+        <w:rPr>
+          <w:rFonts w:asciiTheme="majorHAnsi" w:hAnsiTheme="majorHAnsi" w:cstheme="majorHAnsi"/>
+          <w:highlight w:val="yellow"/>
+          <w:lang w:val="es-CO"/>
+        </w:rPr>
+        <w:t xml:space="preserve"> (</w:t>
+      </w:r>
+      <w:proofErr w:type="spellStart"/>
+      <w:r>
+        <w:rPr>
+          <w:rFonts w:asciiTheme="majorHAnsi" w:hAnsiTheme="majorHAnsi" w:cstheme="majorHAnsi"/>
+          <w:highlight w:val="yellow"/>
+          <w:lang w:val="es-CO"/>
+        </w:rPr>
+        <w:t>Index</w:t>
+      </w:r>
+      <w:proofErr w:type="spellEnd"/>
+      <w:r>
+        <w:rPr>
+          <w:rFonts w:asciiTheme="majorHAnsi" w:hAnsiTheme="majorHAnsi" w:cstheme="majorHAnsi"/>
+          <w:highlight w:val="yellow"/>
+          <w:lang w:val="es-CO"/>
+        </w:rPr>
+        <w:t xml:space="preserve"> </w:t>
+      </w:r>
+      <w:proofErr w:type="spellStart"/>
+      <w:r>
+        <w:rPr>
+          <w:rFonts w:asciiTheme="majorHAnsi" w:hAnsiTheme="majorHAnsi" w:cstheme="majorHAnsi"/>
+          <w:highlight w:val="yellow"/>
+          <w:lang w:val="es-CO"/>
+        </w:rPr>
+        <w:t>review</w:t>
+      </w:r>
+      <w:proofErr w:type="spellEnd"/>
+      <w:r>
+        <w:rPr>
+          <w:rFonts w:asciiTheme="majorHAnsi" w:hAnsiTheme="majorHAnsi" w:cstheme="majorHAnsi"/>
+          <w:highlight w:val="yellow"/>
+          <w:lang w:val="es-CO"/>
+        </w:rPr>
+        <w:t>) – Hoja: Gráficas)</w:t>
+      </w:r>
+    </w:p>
+    <w:p>
+      <w:pPr>
+        <w:pStyle w:val="Listaconvietas"/>
+        <w:numPr>
+          <w:ilvl w:val="0"/>
+          <w:numId w:val="0"/>
+        </w:numPr>
+        <w:ind w:left="1440"/>
+        <w:rPr>
+          <w:rFonts w:asciiTheme="majorHAnsi" w:hAnsiTheme="majorHAnsi" w:cstheme="majorHAnsi"/>
+          <w:sz w:val="24"/>
+          <w:szCs w:val="24"/>
+          <w:lang w:val="es-CO"/>
+        </w:rPr>
+      </w:pPr>
+    </w:p>
+    <w:p>
+      <w:pPr>
+        <w:pStyle w:val="Listaconvietas"/>
         <w:numPr>
           <w:ilvl w:val="1"/>
           <w:numId w:val="11"/>
@@ -2086,7 +2294,111 @@
     </w:p>
     <w:p>
       <w:pPr>
-        <w:pStyle w:val="ListBullet"/>
+        <w:pStyle w:val="font-claude-response-body"/>
+        <w:rPr>
+          <w:rFonts w:asciiTheme="majorHAnsi" w:hAnsiTheme="majorHAnsi" w:cstheme="majorHAnsi"/>
+        </w:rPr>
+      </w:pPr>
+      <w:r>
+        <w:rPr>
+          <w:rFonts w:asciiTheme="majorHAnsi" w:hAnsiTheme="majorHAnsi" w:cstheme="majorHAnsi"/>
+        </w:rPr>
+        <w:t>En el sector de tecnología se observa el cambio más notable: la desviación estándar pasó de 0,01453 en 2015 a 0,01959 en 2025, lo que representa un incremento de aproximadamente el 35%. Adicionalmente, los intervalos de confianza de ambos años no se solapan, lo cual indica que esta diferencia es estadísticamente significativa. Esto sugiere que el mercado tecnológico se volvió considerablemente más volátil, fenómeno que puede explicarse por el fuerte crecimiento del sector impulsado por la inteligencia artificial, la digitalización acelerada por la pandemia y los ciclos de auge y corrección propios de este tipo de activos.</w:t>
+      </w:r>
+    </w:p>
+    <w:p>
+      <w:pPr>
+        <w:pStyle w:val="font-claude-response-body"/>
+        <w:rPr>
+          <w:rFonts w:asciiTheme="majorHAnsi" w:hAnsiTheme="majorHAnsi" w:cstheme="majorHAnsi"/>
+        </w:rPr>
+      </w:pPr>
+      <w:r>
+        <w:rPr>
+          <w:rFonts w:asciiTheme="majorHAnsi" w:hAnsiTheme="majorHAnsi" w:cstheme="majorHAnsi"/>
+        </w:rPr>
+        <w:t>En el sector de consumo básico, la variación es mínima: la desviación estándar pasó de 0,00886 a 0,00911, un cambio de apenas el 2,8%. Los intervalos de confianza de ambos años se solapan ampliamente, lo que indica que no hay evidencia estadística de un cambio significativo en la volatilidad. Este comportamiento es consistente con la naturaleza defensiva del sector, cuyos productos</w:t>
+      </w:r>
+      <w:r>
+        <w:rPr>
+          <w:rFonts w:asciiTheme="majorHAnsi" w:hAnsiTheme="majorHAnsi" w:cstheme="majorHAnsi"/>
+        </w:rPr>
+        <w:t xml:space="preserve"> como </w:t>
+      </w:r>
+      <w:r>
+        <w:rPr>
+          <w:rFonts w:asciiTheme="majorHAnsi" w:hAnsiTheme="majorHAnsi" w:cstheme="majorHAnsi"/>
+        </w:rPr>
+        <w:t>alimentos, bebidas y artículos de higiene</w:t>
+      </w:r>
+      <w:r>
+        <w:rPr>
+          <w:rFonts w:asciiTheme="majorHAnsi" w:hAnsiTheme="majorHAnsi" w:cstheme="majorHAnsi"/>
+        </w:rPr>
+        <w:t xml:space="preserve"> </w:t>
+      </w:r>
+      <w:r>
+        <w:rPr>
+          <w:rFonts w:asciiTheme="majorHAnsi" w:hAnsiTheme="majorHAnsi" w:cstheme="majorHAnsi"/>
+        </w:rPr>
+        <w:t>mantienen una demanda estable independientemente del ciclo económico.</w:t>
+      </w:r>
+    </w:p>
+    <w:p>
+      <w:pPr>
+        <w:pStyle w:val="font-claude-response-body"/>
+        <w:rPr>
+          <w:rFonts w:asciiTheme="majorHAnsi" w:hAnsiTheme="majorHAnsi" w:cstheme="majorHAnsi"/>
+        </w:rPr>
+      </w:pPr>
+      <w:r>
+        <w:rPr>
+          <w:rFonts w:asciiTheme="majorHAnsi" w:hAnsiTheme="majorHAnsi" w:cstheme="majorHAnsi"/>
+        </w:rPr>
+        <w:t>En el sector inmobiliario, la desviación estándar disminuyó levemente de 0,01107 en 2015 a 0,01082 en 2025, una reducción de apenas el 2,3%. Al igual que en consumo básico, los intervalos de confianza se solapan, por lo que no se puede concluir que el cambio sea estadísticamente significativo. Sin embargo, este resultado es interesante dado el contexto</w:t>
+      </w:r>
+      <w:r>
+        <w:rPr>
+          <w:rFonts w:asciiTheme="majorHAnsi" w:hAnsiTheme="majorHAnsi" w:cstheme="majorHAnsi"/>
+        </w:rPr>
+        <w:t xml:space="preserve"> ya que </w:t>
+      </w:r>
+      <w:r>
+        <w:rPr>
+          <w:rFonts w:asciiTheme="majorHAnsi" w:hAnsiTheme="majorHAnsi" w:cstheme="majorHAnsi"/>
+        </w:rPr>
+        <w:t>el sector inmobiliario enfrentó presiones importantes en 2022 debido a las subidas de tasas de interés por parte de la Reserva Federal, lo que generó alta volatilidad en ese período intermedio que no necesariamente se refleja al comparar solo los años extremos.</w:t>
+      </w:r>
+    </w:p>
+    <w:p>
+      <w:pPr>
+        <w:pStyle w:val="font-claude-response-body"/>
+        <w:rPr>
+          <w:rFonts w:asciiTheme="majorHAnsi" w:hAnsiTheme="majorHAnsi" w:cstheme="majorHAnsi"/>
+        </w:rPr>
+      </w:pPr>
+      <w:r>
+        <w:rPr>
+          <w:rFonts w:asciiTheme="majorHAnsi" w:hAnsiTheme="majorHAnsi" w:cstheme="majorHAnsi"/>
+        </w:rPr>
+        <w:t>En conclusión, el único sector que muestra evidencia clara de un cambio en la volatilidad entre 2015 y 2025 es el de tecnología. Los sectores de consumo básico e inmobiliario mantuvieron niveles de riesgo similares en ambos períodos, aunque por razones distintas</w:t>
+      </w:r>
+      <w:r>
+        <w:rPr>
+          <w:rFonts w:asciiTheme="majorHAnsi" w:hAnsiTheme="majorHAnsi" w:cstheme="majorHAnsi"/>
+        </w:rPr>
+        <w:t xml:space="preserve"> ya que, </w:t>
+      </w:r>
+      <w:r>
+        <w:rPr>
+          <w:rFonts w:asciiTheme="majorHAnsi" w:hAnsiTheme="majorHAnsi" w:cstheme="majorHAnsi"/>
+        </w:rPr>
+        <w:t>el primero por su estabilidad estructural, y el segundo a pesar de haber atravesado turbulencias significativas en el período intermedio.</w:t>
+      </w:r>
+    </w:p>
+    <w:p>
+      <w:pPr>
+        <w:pStyle w:val="Listaconvietas"/>
         <w:numPr>
           <w:ilvl w:val="0"/>
           <w:numId w:val="0"/>
@@ -2153,7 +2465,7 @@
     <w:lvl w:ilvl="0">
       <w:start w:val="1"/>
       <w:numFmt w:val="decimal"/>
-      <w:pStyle w:val="ListNumber3"/>
+      <w:pStyle w:val="Listaconnmeros3"/>
       <w:lvlText w:val="%1."/>
       <w:lvlJc w:val="left"/>
       <w:pPr>
@@ -2171,7 +2483,7 @@
     <w:lvl w:ilvl="0">
       <w:start w:val="1"/>
       <w:numFmt w:val="decimal"/>
-      <w:pStyle w:val="ListNumber2"/>
+      <w:pStyle w:val="Listaconnmeros2"/>
       <w:lvlText w:val="%1."/>
       <w:lvlJc w:val="left"/>
       <w:pPr>
@@ -2209,7 +2521,7 @@
     <w:lvl w:ilvl="0">
       <w:start w:val="1"/>
       <w:numFmt w:val="bullet"/>
-      <w:pStyle w:val="ListBullet3"/>
+      <w:pStyle w:val="Listaconvietas3"/>
       <w:lvlText w:val=""/>
       <w:lvlJc w:val="left"/>
       <w:pPr>
@@ -2230,7 +2542,7 @@
     <w:lvl w:ilvl="0">
       <w:start w:val="1"/>
       <w:numFmt w:val="bullet"/>
-      <w:pStyle w:val="ListBullet2"/>
+      <w:pStyle w:val="Listaconvietas2"/>
       <w:lvlText w:val=""/>
       <w:lvlJc w:val="left"/>
       <w:pPr>
@@ -2251,7 +2563,7 @@
     <w:lvl w:ilvl="0">
       <w:start w:val="1"/>
       <w:numFmt w:val="decimal"/>
-      <w:pStyle w:val="ListNumber"/>
+      <w:pStyle w:val="Listaconnmeros"/>
       <w:lvlText w:val="%1."/>
       <w:lvlJc w:val="left"/>
       <w:pPr>
@@ -2269,7 +2581,7 @@
     <w:lvl w:ilvl="0">
       <w:start w:val="1"/>
       <w:numFmt w:val="bullet"/>
-      <w:pStyle w:val="ListBullet"/>
+      <w:pStyle w:val="Listaconvietas"/>
       <w:lvlText w:val=""/>
       <w:lvlJc w:val="left"/>
       <w:pPr>
@@ -3096,11 +3408,11 @@
     <w:qFormat/>
     <w:rsid w:val="00FC693F"/>
   </w:style>
-  <w:style w:type="paragraph" w:styleId="Heading1">
+  <w:style w:type="paragraph" w:styleId="Ttulo1">
     <w:name w:val="heading 1"/>
     <w:basedOn w:val="Normal"/>
     <w:next w:val="Normal"/>
-    <w:link w:val="Heading1Char"/>
+    <w:link w:val="Ttulo1Car"/>
     <w:uiPriority w:val="9"/>
     <w:qFormat/>
     <w:rsid w:val="00FC693F"/>
@@ -3119,11 +3431,11 @@
       <w:szCs w:val="28"/>
     </w:rPr>
   </w:style>
-  <w:style w:type="paragraph" w:styleId="Heading2">
+  <w:style w:type="paragraph" w:styleId="Ttulo2">
     <w:name w:val="heading 2"/>
     <w:basedOn w:val="Normal"/>
     <w:next w:val="Normal"/>
-    <w:link w:val="Heading2Char"/>
+    <w:link w:val="Ttulo2Car"/>
     <w:uiPriority w:val="9"/>
     <w:unhideWhenUsed/>
     <w:qFormat/>
@@ -3143,11 +3455,11 @@
       <w:szCs w:val="26"/>
     </w:rPr>
   </w:style>
-  <w:style w:type="paragraph" w:styleId="Heading3">
+  <w:style w:type="paragraph" w:styleId="Ttulo3">
     <w:name w:val="heading 3"/>
     <w:basedOn w:val="Normal"/>
     <w:next w:val="Normal"/>
-    <w:link w:val="Heading3Char"/>
+    <w:link w:val="Ttulo3Car"/>
     <w:uiPriority w:val="9"/>
     <w:unhideWhenUsed/>
     <w:qFormat/>
@@ -3165,11 +3477,11 @@
       <w:color w:val="4F81BD" w:themeColor="accent1"/>
     </w:rPr>
   </w:style>
-  <w:style w:type="paragraph" w:styleId="Heading4">
+  <w:style w:type="paragraph" w:styleId="Ttulo4">
     <w:name w:val="heading 4"/>
     <w:basedOn w:val="Normal"/>
     <w:next w:val="Normal"/>
-    <w:link w:val="Heading4Char"/>
+    <w:link w:val="Ttulo4Car"/>
     <w:uiPriority w:val="9"/>
     <w:semiHidden/>
     <w:unhideWhenUsed/>
@@ -3190,11 +3502,11 @@
       <w:color w:val="4F81BD" w:themeColor="accent1"/>
     </w:rPr>
   </w:style>
-  <w:style w:type="paragraph" w:styleId="Heading5">
+  <w:style w:type="paragraph" w:styleId="Ttulo5">
     <w:name w:val="heading 5"/>
     <w:basedOn w:val="Normal"/>
     <w:next w:val="Normal"/>
-    <w:link w:val="Heading5Char"/>
+    <w:link w:val="Ttulo5Car"/>
     <w:uiPriority w:val="9"/>
     <w:semiHidden/>
     <w:unhideWhenUsed/>
@@ -3211,11 +3523,11 @@
       <w:color w:val="243F60" w:themeColor="accent1" w:themeShade="7F"/>
     </w:rPr>
   </w:style>
-  <w:style w:type="paragraph" w:styleId="Heading6">
+  <w:style w:type="paragraph" w:styleId="Ttulo6">
     <w:name w:val="heading 6"/>
     <w:basedOn w:val="Normal"/>
     <w:next w:val="Normal"/>
-    <w:link w:val="Heading6Char"/>
+    <w:link w:val="Ttulo6Car"/>
     <w:uiPriority w:val="9"/>
     <w:semiHidden/>
     <w:unhideWhenUsed/>
@@ -3234,11 +3546,11 @@
       <w:color w:val="243F60" w:themeColor="accent1" w:themeShade="7F"/>
     </w:rPr>
   </w:style>
-  <w:style w:type="paragraph" w:styleId="Heading7">
+  <w:style w:type="paragraph" w:styleId="Ttulo7">
     <w:name w:val="heading 7"/>
     <w:basedOn w:val="Normal"/>
     <w:next w:val="Normal"/>
-    <w:link w:val="Heading7Char"/>
+    <w:link w:val="Ttulo7Car"/>
     <w:uiPriority w:val="9"/>
     <w:semiHidden/>
     <w:unhideWhenUsed/>
@@ -3257,11 +3569,11 @@
       <w:color w:val="404040" w:themeColor="text1" w:themeTint="BF"/>
     </w:rPr>
   </w:style>
-  <w:style w:type="paragraph" w:styleId="Heading8">
+  <w:style w:type="paragraph" w:styleId="Ttulo8">
     <w:name w:val="heading 8"/>
     <w:basedOn w:val="Normal"/>
     <w:next w:val="Normal"/>
-    <w:link w:val="Heading8Char"/>
+    <w:link w:val="Ttulo8Car"/>
     <w:uiPriority w:val="9"/>
     <w:semiHidden/>
     <w:unhideWhenUsed/>
@@ -3280,11 +3592,11 @@
       <w:szCs w:val="20"/>
     </w:rPr>
   </w:style>
-  <w:style w:type="paragraph" w:styleId="Heading9">
+  <w:style w:type="paragraph" w:styleId="Ttulo9">
     <w:name w:val="heading 9"/>
     <w:basedOn w:val="Normal"/>
     <w:next w:val="Normal"/>
-    <w:link w:val="Heading9Char"/>
+    <w:link w:val="Ttulo9Car"/>
     <w:uiPriority w:val="9"/>
     <w:semiHidden/>
     <w:unhideWhenUsed/>
@@ -3305,12 +3617,13 @@
       <w:szCs w:val="20"/>
     </w:rPr>
   </w:style>
-  <w:style w:type="character" w:default="1" w:styleId="DefaultParagraphFont">
+  <w:style w:type="character" w:default="1" w:styleId="Fuentedeprrafopredeter">
     <w:name w:val="Default Paragraph Font"/>
     <w:uiPriority w:val="1"/>
+    <w:semiHidden/>
     <w:unhideWhenUsed/>
   </w:style>
-  <w:style w:type="table" w:default="1" w:styleId="TableNormal">
+  <w:style w:type="table" w:default="1" w:styleId="Tablanormal">
     <w:name w:val="Normal Table"/>
     <w:uiPriority w:val="99"/>
     <w:semiHidden/>
@@ -3325,16 +3638,16 @@
       </w:tblCellMar>
     </w:tblPr>
   </w:style>
-  <w:style w:type="numbering" w:default="1" w:styleId="NoList">
+  <w:style w:type="numbering" w:default="1" w:styleId="Sinlista">
     <w:name w:val="No List"/>
     <w:uiPriority w:val="99"/>
     <w:semiHidden/>
     <w:unhideWhenUsed/>
   </w:style>
-  <w:style w:type="paragraph" w:styleId="Header">
+  <w:style w:type="paragraph" w:styleId="Encabezado">
     <w:name w:val="header"/>
     <w:basedOn w:val="Normal"/>
-    <w:link w:val="HeaderChar"/>
+    <w:link w:val="EncabezadoCar"/>
     <w:uiPriority w:val="99"/>
     <w:unhideWhenUsed/>
     <w:rsid w:val="00E618BF"/>
@@ -3346,17 +3659,17 @@
       <w:spacing w:after="0" w:line="240" w:lineRule="auto"/>
     </w:pPr>
   </w:style>
-  <w:style w:type="character" w:customStyle="1" w:styleId="HeaderChar">
-    <w:name w:val="Header Char"/>
-    <w:basedOn w:val="DefaultParagraphFont"/>
-    <w:link w:val="Header"/>
+  <w:style w:type="character" w:customStyle="1" w:styleId="EncabezadoCar">
+    <w:name w:val="Encabezado Car"/>
+    <w:basedOn w:val="Fuentedeprrafopredeter"/>
+    <w:link w:val="Encabezado"/>
     <w:uiPriority w:val="99"/>
     <w:rsid w:val="00E618BF"/>
   </w:style>
-  <w:style w:type="paragraph" w:styleId="Footer">
+  <w:style w:type="paragraph" w:styleId="Piedepgina">
     <w:name w:val="footer"/>
     <w:basedOn w:val="Normal"/>
-    <w:link w:val="FooterChar"/>
+    <w:link w:val="PiedepginaCar"/>
     <w:uiPriority w:val="99"/>
     <w:unhideWhenUsed/>
     <w:rsid w:val="00E618BF"/>
@@ -3368,14 +3681,14 @@
       <w:spacing w:after="0" w:line="240" w:lineRule="auto"/>
     </w:pPr>
   </w:style>
-  <w:style w:type="character" w:customStyle="1" w:styleId="FooterChar">
-    <w:name w:val="Footer Char"/>
-    <w:basedOn w:val="DefaultParagraphFont"/>
-    <w:link w:val="Footer"/>
+  <w:style w:type="character" w:customStyle="1" w:styleId="PiedepginaCar">
+    <w:name w:val="Pie de página Car"/>
+    <w:basedOn w:val="Fuentedeprrafopredeter"/>
+    <w:link w:val="Piedepgina"/>
     <w:uiPriority w:val="99"/>
     <w:rsid w:val="00E618BF"/>
   </w:style>
-  <w:style w:type="paragraph" w:styleId="NoSpacing">
+  <w:style w:type="paragraph" w:styleId="Sinespaciado">
     <w:name w:val="No Spacing"/>
     <w:uiPriority w:val="1"/>
     <w:qFormat/>
@@ -3384,10 +3697,10 @@
       <w:spacing w:after="0" w:line="240" w:lineRule="auto"/>
     </w:pPr>
   </w:style>
-  <w:style w:type="character" w:customStyle="1" w:styleId="Heading1Char">
-    <w:name w:val="Heading 1 Char"/>
-    <w:basedOn w:val="DefaultParagraphFont"/>
-    <w:link w:val="Heading1"/>
+  <w:style w:type="character" w:customStyle="1" w:styleId="Ttulo1Car">
+    <w:name w:val="Título 1 Car"/>
+    <w:basedOn w:val="Fuentedeprrafopredeter"/>
+    <w:link w:val="Ttulo1"/>
     <w:uiPriority w:val="9"/>
     <w:rsid w:val="00FC693F"/>
     <w:rPr>
@@ -3399,10 +3712,10 @@
       <w:szCs w:val="28"/>
     </w:rPr>
   </w:style>
-  <w:style w:type="character" w:customStyle="1" w:styleId="Heading2Char">
-    <w:name w:val="Heading 2 Char"/>
-    <w:basedOn w:val="DefaultParagraphFont"/>
-    <w:link w:val="Heading2"/>
+  <w:style w:type="character" w:customStyle="1" w:styleId="Ttulo2Car">
+    <w:name w:val="Título 2 Car"/>
+    <w:basedOn w:val="Fuentedeprrafopredeter"/>
+    <w:link w:val="Ttulo2"/>
     <w:uiPriority w:val="9"/>
     <w:rsid w:val="00FC693F"/>
     <w:rPr>
@@ -3414,10 +3727,10 @@
       <w:szCs w:val="26"/>
     </w:rPr>
   </w:style>
-  <w:style w:type="character" w:customStyle="1" w:styleId="Heading3Char">
-    <w:name w:val="Heading 3 Char"/>
-    <w:basedOn w:val="DefaultParagraphFont"/>
-    <w:link w:val="Heading3"/>
+  <w:style w:type="character" w:customStyle="1" w:styleId="Ttulo3Car">
+    <w:name w:val="Título 3 Car"/>
+    <w:basedOn w:val="Fuentedeprrafopredeter"/>
+    <w:link w:val="Ttulo3"/>
     <w:uiPriority w:val="9"/>
     <w:rsid w:val="00FC693F"/>
     <w:rPr>
@@ -3427,11 +3740,11 @@
       <w:color w:val="4F81BD" w:themeColor="accent1"/>
     </w:rPr>
   </w:style>
-  <w:style w:type="paragraph" w:styleId="Title">
+  <w:style w:type="paragraph" w:styleId="Ttulo">
     <w:name w:val="Title"/>
     <w:basedOn w:val="Normal"/>
     <w:next w:val="Normal"/>
-    <w:link w:val="TitleChar"/>
+    <w:link w:val="TtuloCar"/>
     <w:uiPriority w:val="10"/>
     <w:qFormat/>
     <w:rsid w:val="00FC693F"/>
@@ -3451,10 +3764,10 @@
       <w:szCs w:val="52"/>
     </w:rPr>
   </w:style>
-  <w:style w:type="character" w:customStyle="1" w:styleId="TitleChar">
-    <w:name w:val="Title Char"/>
-    <w:basedOn w:val="DefaultParagraphFont"/>
-    <w:link w:val="Title"/>
+  <w:style w:type="character" w:customStyle="1" w:styleId="TtuloCar">
+    <w:name w:val="Título Car"/>
+    <w:basedOn w:val="Fuentedeprrafopredeter"/>
+    <w:link w:val="Ttulo"/>
     <w:uiPriority w:val="10"/>
     <w:rsid w:val="00FC693F"/>
     <w:rPr>
@@ -3466,11 +3779,11 @@
       <w:szCs w:val="52"/>
     </w:rPr>
   </w:style>
-  <w:style w:type="paragraph" w:styleId="Subtitle">
+  <w:style w:type="paragraph" w:styleId="Subttulo">
     <w:name w:val="Subtitle"/>
     <w:basedOn w:val="Normal"/>
     <w:next w:val="Normal"/>
-    <w:link w:val="SubtitleChar"/>
+    <w:link w:val="SubttuloCar"/>
     <w:uiPriority w:val="11"/>
     <w:qFormat/>
     <w:rsid w:val="00FC693F"/>
@@ -3489,10 +3802,10 @@
       <w:szCs w:val="24"/>
     </w:rPr>
   </w:style>
-  <w:style w:type="character" w:customStyle="1" w:styleId="SubtitleChar">
-    <w:name w:val="Subtitle Char"/>
-    <w:basedOn w:val="DefaultParagraphFont"/>
-    <w:link w:val="Subtitle"/>
+  <w:style w:type="character" w:customStyle="1" w:styleId="SubttuloCar">
+    <w:name w:val="Subtítulo Car"/>
+    <w:basedOn w:val="Fuentedeprrafopredeter"/>
+    <w:link w:val="Subttulo"/>
     <w:uiPriority w:val="11"/>
     <w:rsid w:val="00FC693F"/>
     <w:rPr>
@@ -3505,7 +3818,7 @@
       <w:szCs w:val="24"/>
     </w:rPr>
   </w:style>
-  <w:style w:type="paragraph" w:styleId="ListParagraph">
+  <w:style w:type="paragraph" w:styleId="Prrafodelista">
     <w:name w:val="List Paragraph"/>
     <w:basedOn w:val="Normal"/>
     <w:uiPriority w:val="34"/>
@@ -3516,10 +3829,10 @@
       <w:contextualSpacing/>
     </w:pPr>
   </w:style>
-  <w:style w:type="paragraph" w:styleId="BodyText">
+  <w:style w:type="paragraph" w:styleId="Textoindependiente">
     <w:name w:val="Body Text"/>
     <w:basedOn w:val="Normal"/>
-    <w:link w:val="BodyTextChar"/>
+    <w:link w:val="TextoindependienteCar"/>
     <w:uiPriority w:val="99"/>
     <w:unhideWhenUsed/>
     <w:rsid w:val="00AA1D8D"/>
@@ -3527,17 +3840,17 @@
       <w:spacing w:after="120"/>
     </w:pPr>
   </w:style>
-  <w:style w:type="character" w:customStyle="1" w:styleId="BodyTextChar">
-    <w:name w:val="Body Text Char"/>
-    <w:basedOn w:val="DefaultParagraphFont"/>
-    <w:link w:val="BodyText"/>
+  <w:style w:type="character" w:customStyle="1" w:styleId="TextoindependienteCar">
+    <w:name w:val="Texto independiente Car"/>
+    <w:basedOn w:val="Fuentedeprrafopredeter"/>
+    <w:link w:val="Textoindependiente"/>
     <w:uiPriority w:val="99"/>
     <w:rsid w:val="00AA1D8D"/>
   </w:style>
-  <w:style w:type="paragraph" w:styleId="BodyText2">
+  <w:style w:type="paragraph" w:styleId="Textoindependiente2">
     <w:name w:val="Body Text 2"/>
     <w:basedOn w:val="Normal"/>
-    <w:link w:val="BodyText2Char"/>
+    <w:link w:val="Textoindependiente2Car"/>
     <w:uiPriority w:val="99"/>
     <w:unhideWhenUsed/>
     <w:rsid w:val="00AA1D8D"/>
@@ -3545,17 +3858,17 @@
       <w:spacing w:after="120" w:line="480" w:lineRule="auto"/>
     </w:pPr>
   </w:style>
-  <w:style w:type="character" w:customStyle="1" w:styleId="BodyText2Char">
-    <w:name w:val="Body Text 2 Char"/>
-    <w:basedOn w:val="DefaultParagraphFont"/>
-    <w:link w:val="BodyText2"/>
+  <w:style w:type="character" w:customStyle="1" w:styleId="Textoindependiente2Car">
+    <w:name w:val="Texto independiente 2 Car"/>
+    <w:basedOn w:val="Fuentedeprrafopredeter"/>
+    <w:link w:val="Textoindependiente2"/>
     <w:uiPriority w:val="99"/>
     <w:rsid w:val="00AA1D8D"/>
   </w:style>
-  <w:style w:type="paragraph" w:styleId="BodyText3">
+  <w:style w:type="paragraph" w:styleId="Textoindependiente3">
     <w:name w:val="Body Text 3"/>
     <w:basedOn w:val="Normal"/>
-    <w:link w:val="BodyText3Char"/>
+    <w:link w:val="Textoindependiente3Car"/>
     <w:uiPriority w:val="99"/>
     <w:unhideWhenUsed/>
     <w:rsid w:val="00AA1D8D"/>
@@ -3567,10 +3880,10 @@
       <w:szCs w:val="16"/>
     </w:rPr>
   </w:style>
-  <w:style w:type="character" w:customStyle="1" w:styleId="BodyText3Char">
-    <w:name w:val="Body Text 3 Char"/>
-    <w:basedOn w:val="DefaultParagraphFont"/>
-    <w:link w:val="BodyText3"/>
+  <w:style w:type="character" w:customStyle="1" w:styleId="Textoindependiente3Car">
+    <w:name w:val="Texto independiente 3 Car"/>
+    <w:basedOn w:val="Fuentedeprrafopredeter"/>
+    <w:link w:val="Textoindependiente3"/>
     <w:uiPriority w:val="99"/>
     <w:rsid w:val="00AA1D8D"/>
     <w:rPr>
@@ -3578,7 +3891,7 @@
       <w:szCs w:val="16"/>
     </w:rPr>
   </w:style>
-  <w:style w:type="paragraph" w:styleId="List">
+  <w:style w:type="paragraph" w:styleId="Lista">
     <w:name w:val="List"/>
     <w:basedOn w:val="Normal"/>
     <w:uiPriority w:val="99"/>
@@ -3589,7 +3902,7 @@
       <w:contextualSpacing/>
     </w:pPr>
   </w:style>
-  <w:style w:type="paragraph" w:styleId="List2">
+  <w:style w:type="paragraph" w:styleId="Lista2">
     <w:name w:val="List 2"/>
     <w:basedOn w:val="Normal"/>
     <w:uiPriority w:val="99"/>
@@ -3600,7 +3913,7 @@
       <w:contextualSpacing/>
     </w:pPr>
   </w:style>
-  <w:style w:type="paragraph" w:styleId="List3">
+  <w:style w:type="paragraph" w:styleId="Lista3">
     <w:name w:val="List 3"/>
     <w:basedOn w:val="Normal"/>
     <w:uiPriority w:val="99"/>
@@ -3611,7 +3924,7 @@
       <w:contextualSpacing/>
     </w:pPr>
   </w:style>
-  <w:style w:type="paragraph" w:styleId="ListBullet">
+  <w:style w:type="paragraph" w:styleId="Listaconvietas">
     <w:name w:val="List Bullet"/>
     <w:basedOn w:val="Normal"/>
     <w:uiPriority w:val="99"/>
@@ -3624,7 +3937,7 @@
       <w:contextualSpacing/>
     </w:pPr>
   </w:style>
-  <w:style w:type="paragraph" w:styleId="ListBullet2">
+  <w:style w:type="paragraph" w:styleId="Listaconvietas2">
     <w:name w:val="List Bullet 2"/>
     <w:basedOn w:val="Normal"/>
     <w:uiPriority w:val="99"/>
@@ -3637,7 +3950,7 @@
       <w:contextualSpacing/>
     </w:pPr>
   </w:style>
-  <w:style w:type="paragraph" w:styleId="ListBullet3">
+  <w:style w:type="paragraph" w:styleId="Listaconvietas3">
     <w:name w:val="List Bullet 3"/>
     <w:basedOn w:val="Normal"/>
     <w:uiPriority w:val="99"/>
@@ -3650,7 +3963,7 @@
       <w:contextualSpacing/>
     </w:pPr>
   </w:style>
-  <w:style w:type="paragraph" w:styleId="ListNumber">
+  <w:style w:type="paragraph" w:styleId="Listaconnmeros">
     <w:name w:val="List Number"/>
     <w:basedOn w:val="Normal"/>
     <w:uiPriority w:val="99"/>
@@ -3663,7 +3976,7 @@
       <w:contextualSpacing/>
     </w:pPr>
   </w:style>
-  <w:style w:type="paragraph" w:styleId="ListNumber2">
+  <w:style w:type="paragraph" w:styleId="Listaconnmeros2">
     <w:name w:val="List Number 2"/>
     <w:basedOn w:val="Normal"/>
     <w:uiPriority w:val="99"/>
@@ -3676,7 +3989,7 @@
       <w:contextualSpacing/>
     </w:pPr>
   </w:style>
-  <w:style w:type="paragraph" w:styleId="ListNumber3">
+  <w:style w:type="paragraph" w:styleId="Listaconnmeros3">
     <w:name w:val="List Number 3"/>
     <w:basedOn w:val="Normal"/>
     <w:uiPriority w:val="99"/>
@@ -3689,7 +4002,7 @@
       <w:contextualSpacing/>
     </w:pPr>
   </w:style>
-  <w:style w:type="paragraph" w:styleId="ListContinue">
+  <w:style w:type="paragraph" w:styleId="Continuarlista">
     <w:name w:val="List Continue"/>
     <w:basedOn w:val="Normal"/>
     <w:uiPriority w:val="99"/>
@@ -3701,7 +4014,7 @@
       <w:contextualSpacing/>
     </w:pPr>
   </w:style>
-  <w:style w:type="paragraph" w:styleId="ListContinue2">
+  <w:style w:type="paragraph" w:styleId="Continuarlista2">
     <w:name w:val="List Continue 2"/>
     <w:basedOn w:val="Normal"/>
     <w:uiPriority w:val="99"/>
@@ -3713,7 +4026,7 @@
       <w:contextualSpacing/>
     </w:pPr>
   </w:style>
-  <w:style w:type="paragraph" w:styleId="ListContinue3">
+  <w:style w:type="paragraph" w:styleId="Continuarlista3">
     <w:name w:val="List Continue 3"/>
     <w:basedOn w:val="Normal"/>
     <w:uiPriority w:val="99"/>
@@ -3725,9 +4038,9 @@
       <w:contextualSpacing/>
     </w:pPr>
   </w:style>
-  <w:style w:type="paragraph" w:styleId="MacroText">
+  <w:style w:type="paragraph" w:styleId="Textomacro">
     <w:name w:val="macro"/>
-    <w:link w:val="MacroTextChar"/>
+    <w:link w:val="TextomacroCar"/>
     <w:uiPriority w:val="99"/>
     <w:unhideWhenUsed/>
     <w:rsid w:val="0029639D"/>
@@ -3748,10 +4061,10 @@
       <w:szCs w:val="20"/>
     </w:rPr>
   </w:style>
-  <w:style w:type="character" w:customStyle="1" w:styleId="MacroTextChar">
-    <w:name w:val="Macro Text Char"/>
-    <w:basedOn w:val="DefaultParagraphFont"/>
-    <w:link w:val="MacroText"/>
+  <w:style w:type="character" w:customStyle="1" w:styleId="TextomacroCar">
+    <w:name w:val="Texto macro Car"/>
+    <w:basedOn w:val="Fuentedeprrafopredeter"/>
+    <w:link w:val="Textomacro"/>
     <w:uiPriority w:val="99"/>
     <w:rsid w:val="0029639D"/>
     <w:rPr>
@@ -3760,11 +4073,11 @@
       <w:szCs w:val="20"/>
     </w:rPr>
   </w:style>
-  <w:style w:type="paragraph" w:styleId="Quote">
+  <w:style w:type="paragraph" w:styleId="Cita">
     <w:name w:val="Quote"/>
     <w:basedOn w:val="Normal"/>
     <w:next w:val="Normal"/>
-    <w:link w:val="QuoteChar"/>
+    <w:link w:val="CitaCar"/>
     <w:uiPriority w:val="29"/>
     <w:qFormat/>
     <w:rsid w:val="00FC693F"/>
@@ -3774,10 +4087,10 @@
       <w:color w:val="000000" w:themeColor="text1"/>
     </w:rPr>
   </w:style>
-  <w:style w:type="character" w:customStyle="1" w:styleId="QuoteChar">
-    <w:name w:val="Quote Char"/>
-    <w:basedOn w:val="DefaultParagraphFont"/>
-    <w:link w:val="Quote"/>
+  <w:style w:type="character" w:customStyle="1" w:styleId="CitaCar">
+    <w:name w:val="Cita Car"/>
+    <w:basedOn w:val="Fuentedeprrafopredeter"/>
+    <w:link w:val="Cita"/>
     <w:uiPriority w:val="29"/>
     <w:rsid w:val="00FC693F"/>
     <w:rPr>
@@ -3786,10 +4099,10 @@
       <w:color w:val="000000" w:themeColor="text1"/>
     </w:rPr>
   </w:style>
-  <w:style w:type="character" w:customStyle="1" w:styleId="Heading4Char">
-    <w:name w:val="Heading 4 Char"/>
-    <w:basedOn w:val="DefaultParagraphFont"/>
-    <w:link w:val="Heading4"/>
+  <w:style w:type="character" w:customStyle="1" w:styleId="Ttulo4Car">
+    <w:name w:val="Título 4 Car"/>
+    <w:basedOn w:val="Fuentedeprrafopredeter"/>
+    <w:link w:val="Ttulo4"/>
     <w:uiPriority w:val="9"/>
     <w:semiHidden/>
     <w:rsid w:val="00FC693F"/>
@@ -3802,10 +4115,10 @@
       <w:color w:val="4F81BD" w:themeColor="accent1"/>
     </w:rPr>
   </w:style>
-  <w:style w:type="character" w:customStyle="1" w:styleId="Heading5Char">
-    <w:name w:val="Heading 5 Char"/>
-    <w:basedOn w:val="DefaultParagraphFont"/>
-    <w:link w:val="Heading5"/>
+  <w:style w:type="character" w:customStyle="1" w:styleId="Ttulo5Car">
+    <w:name w:val="Título 5 Car"/>
+    <w:basedOn w:val="Fuentedeprrafopredeter"/>
+    <w:link w:val="Ttulo5"/>
     <w:uiPriority w:val="9"/>
     <w:semiHidden/>
     <w:rsid w:val="00FC693F"/>
@@ -3814,10 +4127,10 @@
       <w:color w:val="243F60" w:themeColor="accent1" w:themeShade="7F"/>
     </w:rPr>
   </w:style>
-  <w:style w:type="character" w:customStyle="1" w:styleId="Heading6Char">
-    <w:name w:val="Heading 6 Char"/>
-    <w:basedOn w:val="DefaultParagraphFont"/>
-    <w:link w:val="Heading6"/>
+  <w:style w:type="character" w:customStyle="1" w:styleId="Ttulo6Car">
+    <w:name w:val="Título 6 Car"/>
+    <w:basedOn w:val="Fuentedeprrafopredeter"/>
+    <w:link w:val="Ttulo6"/>
     <w:uiPriority w:val="9"/>
     <w:semiHidden/>
     <w:rsid w:val="00FC693F"/>
@@ -3828,10 +4141,10 @@
       <w:color w:val="243F60" w:themeColor="accent1" w:themeShade="7F"/>
     </w:rPr>
   </w:style>
-  <w:style w:type="character" w:customStyle="1" w:styleId="Heading7Char">
-    <w:name w:val="Heading 7 Char"/>
-    <w:basedOn w:val="DefaultParagraphFont"/>
-    <w:link w:val="Heading7"/>
+  <w:style w:type="character" w:customStyle="1" w:styleId="Ttulo7Car">
+    <w:name w:val="Título 7 Car"/>
+    <w:basedOn w:val="Fuentedeprrafopredeter"/>
+    <w:link w:val="Ttulo7"/>
     <w:uiPriority w:val="9"/>
     <w:semiHidden/>
     <w:rsid w:val="00FC693F"/>
@@ -3842,10 +4155,10 @@
       <w:color w:val="404040" w:themeColor="text1" w:themeTint="BF"/>
     </w:rPr>
   </w:style>
-  <w:style w:type="character" w:customStyle="1" w:styleId="Heading8Char">
-    <w:name w:val="Heading 8 Char"/>
-    <w:basedOn w:val="DefaultParagraphFont"/>
-    <w:link w:val="Heading8"/>
+  <w:style w:type="character" w:customStyle="1" w:styleId="Ttulo8Car">
+    <w:name w:val="Título 8 Car"/>
+    <w:basedOn w:val="Fuentedeprrafopredeter"/>
+    <w:link w:val="Ttulo8"/>
     <w:uiPriority w:val="9"/>
     <w:semiHidden/>
     <w:rsid w:val="00FC693F"/>
@@ -3856,10 +4169,10 @@
       <w:szCs w:val="20"/>
     </w:rPr>
   </w:style>
-  <w:style w:type="character" w:customStyle="1" w:styleId="Heading9Char">
-    <w:name w:val="Heading 9 Char"/>
-    <w:basedOn w:val="DefaultParagraphFont"/>
-    <w:link w:val="Heading9"/>
+  <w:style w:type="character" w:customStyle="1" w:styleId="Ttulo9Car">
+    <w:name w:val="Título 9 Car"/>
+    <w:basedOn w:val="Fuentedeprrafopredeter"/>
+    <w:link w:val="Ttulo9"/>
     <w:uiPriority w:val="9"/>
     <w:semiHidden/>
     <w:rsid w:val="00FC693F"/>
@@ -3872,7 +4185,7 @@
       <w:szCs w:val="20"/>
     </w:rPr>
   </w:style>
-  <w:style w:type="paragraph" w:styleId="Caption">
+  <w:style w:type="paragraph" w:styleId="Descripcin">
     <w:name w:val="caption"/>
     <w:basedOn w:val="Normal"/>
     <w:next w:val="Normal"/>
@@ -3892,9 +4205,9 @@
       <w:szCs w:val="18"/>
     </w:rPr>
   </w:style>
-  <w:style w:type="character" w:styleId="Strong">
+  <w:style w:type="character" w:styleId="Fuerte">
     <w:name w:val="Strong"/>
-    <w:basedOn w:val="DefaultParagraphFont"/>
+    <w:basedOn w:val="Fuentedeprrafopredeter"/>
     <w:uiPriority w:val="22"/>
     <w:qFormat/>
     <w:rsid w:val="00FC693F"/>
@@ -3903,9 +4216,9 @@
       <w:bCs/>
     </w:rPr>
   </w:style>
-  <w:style w:type="character" w:styleId="Emphasis">
+  <w:style w:type="character" w:styleId="nfasis">
     <w:name w:val="Emphasis"/>
-    <w:basedOn w:val="DefaultParagraphFont"/>
+    <w:basedOn w:val="Fuentedeprrafopredeter"/>
     <w:uiPriority w:val="20"/>
     <w:qFormat/>
     <w:rsid w:val="00FC693F"/>
@@ -3914,11 +4227,11 @@
       <w:iCs/>
     </w:rPr>
   </w:style>
-  <w:style w:type="paragraph" w:styleId="IntenseQuote">
+  <w:style w:type="paragraph" w:styleId="Citadestacada">
     <w:name w:val="Intense Quote"/>
     <w:basedOn w:val="Normal"/>
     <w:next w:val="Normal"/>
-    <w:link w:val="IntenseQuoteChar"/>
+    <w:link w:val="CitadestacadaCar"/>
     <w:uiPriority w:val="30"/>
     <w:qFormat/>
     <w:rsid w:val="00FC693F"/>
@@ -3937,10 +4250,10 @@
       <w:color w:val="4F81BD" w:themeColor="accent1"/>
     </w:rPr>
   </w:style>
-  <w:style w:type="character" w:customStyle="1" w:styleId="IntenseQuoteChar">
-    <w:name w:val="Intense Quote Char"/>
-    <w:basedOn w:val="DefaultParagraphFont"/>
-    <w:link w:val="IntenseQuote"/>
+  <w:style w:type="character" w:customStyle="1" w:styleId="CitadestacadaCar">
+    <w:name w:val="Cita destacada Car"/>
+    <w:basedOn w:val="Fuentedeprrafopredeter"/>
+    <w:link w:val="Citadestacada"/>
     <w:uiPriority w:val="30"/>
     <w:rsid w:val="00FC693F"/>
     <w:rPr>
@@ -3951,9 +4264,9 @@
       <w:color w:val="4F81BD" w:themeColor="accent1"/>
     </w:rPr>
   </w:style>
-  <w:style w:type="character" w:styleId="SubtleEmphasis">
+  <w:style w:type="character" w:styleId="nfasissutil">
     <w:name w:val="Subtle Emphasis"/>
-    <w:basedOn w:val="DefaultParagraphFont"/>
+    <w:basedOn w:val="Fuentedeprrafopredeter"/>
     <w:uiPriority w:val="19"/>
     <w:qFormat/>
     <w:rsid w:val="00FC693F"/>
@@ -3963,9 +4276,9 @@
       <w:color w:val="808080" w:themeColor="text1" w:themeTint="7F"/>
     </w:rPr>
   </w:style>
-  <w:style w:type="character" w:styleId="IntenseEmphasis">
+  <w:style w:type="character" w:styleId="nfasisintenso">
     <w:name w:val="Intense Emphasis"/>
-    <w:basedOn w:val="DefaultParagraphFont"/>
+    <w:basedOn w:val="Fuentedeprrafopredeter"/>
     <w:uiPriority w:val="21"/>
     <w:qFormat/>
     <w:rsid w:val="00FC693F"/>
@@ -3977,9 +4290,9 @@
       <w:color w:val="4F81BD" w:themeColor="accent1"/>
     </w:rPr>
   </w:style>
-  <w:style w:type="character" w:styleId="SubtleReference">
+  <w:style w:type="character" w:styleId="Referenciasutil">
     <w:name w:val="Subtle Reference"/>
-    <w:basedOn w:val="DefaultParagraphFont"/>
+    <w:basedOn w:val="Fuentedeprrafopredeter"/>
     <w:uiPriority w:val="31"/>
     <w:qFormat/>
     <w:rsid w:val="00FC693F"/>
@@ -3989,9 +4302,9 @@
       <w:u w:val="single"/>
     </w:rPr>
   </w:style>
-  <w:style w:type="character" w:styleId="IntenseReference">
+  <w:style w:type="character" w:styleId="Referenciaintensa">
     <w:name w:val="Intense Reference"/>
-    <w:basedOn w:val="DefaultParagraphFont"/>
+    <w:basedOn w:val="Fuentedeprrafopredeter"/>
     <w:uiPriority w:val="32"/>
     <w:qFormat/>
     <w:rsid w:val="00FC693F"/>
@@ -4004,9 +4317,9 @@
       <w:u w:val="single"/>
     </w:rPr>
   </w:style>
-  <w:style w:type="character" w:styleId="BookTitle">
+  <w:style w:type="character" w:styleId="Ttulodellibro">
     <w:name w:val="Book Title"/>
-    <w:basedOn w:val="DefaultParagraphFont"/>
+    <w:basedOn w:val="Fuentedeprrafopredeter"/>
     <w:uiPriority w:val="33"/>
     <w:qFormat/>
     <w:rsid w:val="00FC693F"/>
@@ -4017,9 +4330,9 @@
       <w:spacing w:val="5"/>
     </w:rPr>
   </w:style>
-  <w:style w:type="paragraph" w:styleId="TOCHeading">
+  <w:style w:type="paragraph" w:styleId="TtuloTDC">
     <w:name w:val="TOC Heading"/>
-    <w:basedOn w:val="Heading1"/>
+    <w:basedOn w:val="Ttulo1"/>
     <w:next w:val="Normal"/>
     <w:uiPriority w:val="39"/>
     <w:semiHidden/>
@@ -4030,9 +4343,9 @@
       <w:outlineLvl w:val="9"/>
     </w:pPr>
   </w:style>
-  <w:style w:type="table" w:styleId="TableGrid">
+  <w:style w:type="table" w:styleId="Tablaconcuadrcula">
     <w:name w:val="Table Grid"/>
-    <w:basedOn w:val="TableNormal"/>
+    <w:basedOn w:val="Tablanormal"/>
     <w:uiPriority w:val="59"/>
     <w:rsid w:val="00FC693F"/>
     <w:pPr>
@@ -4049,9 +4362,9 @@
       </w:tblBorders>
     </w:tblPr>
   </w:style>
-  <w:style w:type="table" w:styleId="LightShading">
+  <w:style w:type="table" w:styleId="Sombreadoclaro">
     <w:name w:val="Light Shading"/>
-    <w:basedOn w:val="TableNormal"/>
+    <w:basedOn w:val="Tablanormal"/>
     <w:uiPriority w:val="60"/>
     <w:rsid w:val="00FC693F"/>
     <w:pPr>
@@ -4145,9 +4458,9 @@
       </w:tcPr>
     </w:tblStylePr>
   </w:style>
-  <w:style w:type="table" w:styleId="LightShading-Accent1">
+  <w:style w:type="table" w:styleId="Sombreadoclaro-nfasis1">
     <w:name w:val="Light Shading Accent 1"/>
-    <w:basedOn w:val="TableNormal"/>
+    <w:basedOn w:val="Tablanormal"/>
     <w:uiPriority w:val="60"/>
     <w:rsid w:val="00FC693F"/>
     <w:pPr>
@@ -4241,9 +4554,9 @@
       </w:tcPr>
     </w:tblStylePr>
   </w:style>
-  <w:style w:type="table" w:styleId="LightShading-Accent2">
+  <w:style w:type="table" w:styleId="Sombreadoclaro-nfasis2">
     <w:name w:val="Light Shading Accent 2"/>
-    <w:basedOn w:val="TableNormal"/>
+    <w:basedOn w:val="Tablanormal"/>
     <w:uiPriority w:val="60"/>
     <w:rsid w:val="00FC693F"/>
     <w:pPr>
@@ -4337,9 +4650,9 @@
       </w:tcPr>
     </w:tblStylePr>
   </w:style>
-  <w:style w:type="table" w:styleId="LightShading-Accent3">
+  <w:style w:type="table" w:styleId="Sombreadoclaro-nfasis3">
     <w:name w:val="Light Shading Accent 3"/>
-    <w:basedOn w:val="TableNormal"/>
+    <w:basedOn w:val="Tablanormal"/>
     <w:uiPriority w:val="60"/>
     <w:rsid w:val="00FC693F"/>
     <w:pPr>
@@ -4433,9 +4746,9 @@
       </w:tcPr>
     </w:tblStylePr>
   </w:style>
-  <w:style w:type="table" w:styleId="LightShading-Accent4">
+  <w:style w:type="table" w:styleId="Sombreadoclaro-nfasis4">
     <w:name w:val="Light Shading Accent 4"/>
-    <w:basedOn w:val="TableNormal"/>
+    <w:basedOn w:val="Tablanormal"/>
     <w:uiPriority w:val="60"/>
     <w:rsid w:val="00FC693F"/>
     <w:pPr>
@@ -4529,9 +4842,9 @@
       </w:tcPr>
     </w:tblStylePr>
   </w:style>
-  <w:style w:type="table" w:styleId="LightShading-Accent5">
+  <w:style w:type="table" w:styleId="Sombreadoclaro-nfasis5">
     <w:name w:val="Light Shading Accent 5"/>
-    <w:basedOn w:val="TableNormal"/>
+    <w:basedOn w:val="Tablanormal"/>
     <w:uiPriority w:val="60"/>
     <w:rsid w:val="00FC693F"/>
     <w:pPr>
@@ -4625,9 +4938,9 @@
       </w:tcPr>
     </w:tblStylePr>
   </w:style>
-  <w:style w:type="table" w:styleId="LightShading-Accent6">
+  <w:style w:type="table" w:styleId="Sombreadoclaro-nfasis6">
     <w:name w:val="Light Shading Accent 6"/>
-    <w:basedOn w:val="TableNormal"/>
+    <w:basedOn w:val="Tablanormal"/>
     <w:uiPriority w:val="60"/>
     <w:rsid w:val="00FC693F"/>
     <w:pPr>
@@ -4721,9 +5034,9 @@
       </w:tcPr>
     </w:tblStylePr>
   </w:style>
-  <w:style w:type="table" w:styleId="LightList">
+  <w:style w:type="table" w:styleId="Listaclara">
     <w:name w:val="Light List"/>
-    <w:basedOn w:val="TableNormal"/>
+    <w:basedOn w:val="Tablanormal"/>
     <w:uiPriority w:val="61"/>
     <w:rsid w:val="00FC693F"/>
     <w:pPr>
@@ -4806,9 +5119,9 @@
       </w:tcPr>
     </w:tblStylePr>
   </w:style>
-  <w:style w:type="table" w:styleId="LightList-Accent1">
+  <w:style w:type="table" w:styleId="Listaclara-nfasis1">
     <w:name w:val="Light List Accent 1"/>
-    <w:basedOn w:val="TableNormal"/>
+    <w:basedOn w:val="Tablanormal"/>
     <w:uiPriority w:val="61"/>
     <w:rsid w:val="00FC693F"/>
     <w:pPr>
@@ -4891,9 +5204,9 @@
       </w:tcPr>
     </w:tblStylePr>
   </w:style>
-  <w:style w:type="table" w:styleId="LightList-Accent2">
+  <w:style w:type="table" w:styleId="Listaclara-nfasis2">
     <w:name w:val="Light List Accent 2"/>
-    <w:basedOn w:val="TableNormal"/>
+    <w:basedOn w:val="Tablanormal"/>
     <w:uiPriority w:val="61"/>
     <w:rsid w:val="00CB0664"/>
     <w:pPr>
@@ -4976,9 +5289,9 @@
       </w:tcPr>
     </w:tblStylePr>
   </w:style>
-  <w:style w:type="table" w:styleId="LightList-Accent3">
+  <w:style w:type="table" w:styleId="Listaclara-nfasis3">
     <w:name w:val="Light List Accent 3"/>
-    <w:basedOn w:val="TableNormal"/>
+    <w:basedOn w:val="Tablanormal"/>
     <w:uiPriority w:val="61"/>
     <w:rsid w:val="00CB0664"/>
     <w:pPr>
@@ -5061,9 +5374,9 @@
       </w:tcPr>
     </w:tblStylePr>
   </w:style>
-  <w:style w:type="table" w:styleId="LightList-Accent4">
+  <w:style w:type="table" w:styleId="Listaclara-nfasis4">
     <w:name w:val="Light List Accent 4"/>
-    <w:basedOn w:val="TableNormal"/>
+    <w:basedOn w:val="Tablanormal"/>
     <w:uiPriority w:val="61"/>
     <w:rsid w:val="00CB0664"/>
     <w:pPr>
@@ -5146,9 +5459,9 @@
       </w:tcPr>
     </w:tblStylePr>
   </w:style>
-  <w:style w:type="table" w:styleId="LightList-Accent5">
+  <w:style w:type="table" w:styleId="Listaclara-nfasis5">
     <w:name w:val="Light List Accent 5"/>
-    <w:basedOn w:val="TableNormal"/>
+    <w:basedOn w:val="Tablanormal"/>
     <w:uiPriority w:val="61"/>
     <w:rsid w:val="00CB0664"/>
     <w:pPr>
@@ -5231,9 +5544,9 @@
       </w:tcPr>
     </w:tblStylePr>
   </w:style>
-  <w:style w:type="table" w:styleId="LightList-Accent6">
+  <w:style w:type="table" w:styleId="Listaclara-nfasis6">
     <w:name w:val="Light List Accent 6"/>
-    <w:basedOn w:val="TableNormal"/>
+    <w:basedOn w:val="Tablanormal"/>
     <w:uiPriority w:val="61"/>
     <w:rsid w:val="00CB0664"/>
     <w:pPr>
@@ -5316,9 +5629,9 @@
       </w:tcPr>
     </w:tblStylePr>
   </w:style>
-  <w:style w:type="table" w:styleId="LightGrid">
+  <w:style w:type="table" w:styleId="Cuadrculaclara">
     <w:name w:val="Light Grid"/>
-    <w:basedOn w:val="TableNormal"/>
+    <w:basedOn w:val="Tablanormal"/>
     <w:uiPriority w:val="62"/>
     <w:rsid w:val="00CB0664"/>
     <w:pPr>
@@ -5439,9 +5752,9 @@
       </w:tcPr>
     </w:tblStylePr>
   </w:style>
-  <w:style w:type="table" w:styleId="LightGrid-Accent1">
+  <w:style w:type="table" w:styleId="Cuadrculaclara-nfasis1">
     <w:name w:val="Light Grid Accent 1"/>
-    <w:basedOn w:val="TableNormal"/>
+    <w:basedOn w:val="Tablanormal"/>
     <w:uiPriority w:val="62"/>
     <w:rsid w:val="00CB0664"/>
     <w:pPr>
@@ -5562,9 +5875,9 @@
       </w:tcPr>
     </w:tblStylePr>
   </w:style>
-  <w:style w:type="table" w:styleId="LightGrid-Accent2">
+  <w:style w:type="table" w:styleId="Cuadrculaclara-nfasis2">
     <w:name w:val="Light Grid Accent 2"/>
-    <w:basedOn w:val="TableNormal"/>
+    <w:basedOn w:val="Tablanormal"/>
     <w:uiPriority w:val="62"/>
     <w:rsid w:val="00CB0664"/>
     <w:pPr>
@@ -5685,9 +5998,9 @@
       </w:tcPr>
     </w:tblStylePr>
   </w:style>
-  <w:style w:type="table" w:styleId="LightGrid-Accent3">
+  <w:style w:type="table" w:styleId="Cuadrculaclara-nfasis3">
     <w:name w:val="Light Grid Accent 3"/>
-    <w:basedOn w:val="TableNormal"/>
+    <w:basedOn w:val="Tablanormal"/>
     <w:uiPriority w:val="62"/>
     <w:rsid w:val="00CB0664"/>
     <w:pPr>
@@ -5808,9 +6121,9 @@
       </w:tcPr>
     </w:tblStylePr>
   </w:style>
-  <w:style w:type="table" w:styleId="LightGrid-Accent4">
+  <w:style w:type="table" w:styleId="Cuadrculaclara-nfasis4">
     <w:name w:val="Light Grid Accent 4"/>
-    <w:basedOn w:val="TableNormal"/>
+    <w:basedOn w:val="Tablanormal"/>
     <w:uiPriority w:val="62"/>
     <w:rsid w:val="00CB0664"/>
     <w:pPr>
@@ -5931,9 +6244,9 @@
       </w:tcPr>
     </w:tblStylePr>
   </w:style>
-  <w:style w:type="table" w:styleId="LightGrid-Accent5">
+  <w:style w:type="table" w:styleId="Cuadrculaclara-nfasis5">
     <w:name w:val="Light Grid Accent 5"/>
-    <w:basedOn w:val="TableNormal"/>
+    <w:basedOn w:val="Tablanormal"/>
     <w:uiPriority w:val="62"/>
     <w:rsid w:val="00CB0664"/>
     <w:pPr>
@@ -6054,9 +6367,9 @@
       </w:tcPr>
     </w:tblStylePr>
   </w:style>
-  <w:style w:type="table" w:styleId="LightGrid-Accent6">
+  <w:style w:type="table" w:styleId="Cuadrculaclara-nfasis6">
     <w:name w:val="Light Grid Accent 6"/>
-    <w:basedOn w:val="TableNormal"/>
+    <w:basedOn w:val="Tablanormal"/>
     <w:uiPriority w:val="62"/>
     <w:rsid w:val="00CB0664"/>
     <w:pPr>
@@ -6177,9 +6490,9 @@
       </w:tcPr>
     </w:tblStylePr>
   </w:style>
-  <w:style w:type="table" w:styleId="MediumShading1">
+  <w:style w:type="table" w:styleId="Sombreadomedio1">
     <w:name w:val="Medium Shading 1"/>
-    <w:basedOn w:val="TableNormal"/>
+    <w:basedOn w:val="Tablanormal"/>
     <w:uiPriority w:val="63"/>
     <w:rsid w:val="00CB0664"/>
     <w:pPr>
@@ -6276,9 +6589,9 @@
       </w:tcPr>
     </w:tblStylePr>
   </w:style>
-  <w:style w:type="table" w:styleId="MediumShading1-Accent1">
+  <w:style w:type="table" w:styleId="Sombreadomedio1-nfasis1">
     <w:name w:val="Medium Shading 1 Accent 1"/>
-    <w:basedOn w:val="TableNormal"/>
+    <w:basedOn w:val="Tablanormal"/>
     <w:uiPriority w:val="63"/>
     <w:rsid w:val="00CB0664"/>
     <w:pPr>
@@ -6375,9 +6688,9 @@
       </w:tcPr>
     </w:tblStylePr>
   </w:style>
-  <w:style w:type="table" w:styleId="MediumShading1-Accent2">
+  <w:style w:type="table" w:styleId="Sombreadomedio1-nfasis2">
     <w:name w:val="Medium Shading 1 Accent 2"/>
-    <w:basedOn w:val="TableNormal"/>
+    <w:basedOn w:val="Tablanormal"/>
     <w:uiPriority w:val="63"/>
     <w:rsid w:val="00CB0664"/>
     <w:pPr>
@@ -6474,9 +6787,9 @@
       </w:tcPr>
     </w:tblStylePr>
   </w:style>
-  <w:style w:type="table" w:styleId="MediumShading1-Accent3">
+  <w:style w:type="table" w:styleId="Sombreadomedio1-nfasis3">
     <w:name w:val="Medium Shading 1 Accent 3"/>
-    <w:basedOn w:val="TableNormal"/>
+    <w:basedOn w:val="Tablanormal"/>
     <w:uiPriority w:val="63"/>
     <w:rsid w:val="00CB0664"/>
     <w:pPr>
@@ -6573,9 +6886,9 @@
       </w:tcPr>
     </w:tblStylePr>
   </w:style>
-  <w:style w:type="table" w:styleId="MediumShading1-Accent4">
+  <w:style w:type="table" w:styleId="Sombreadomedio1-nfasis4">
     <w:name w:val="Medium Shading 1 Accent 4"/>
-    <w:basedOn w:val="TableNormal"/>
+    <w:basedOn w:val="Tablanormal"/>
     <w:uiPriority w:val="63"/>
     <w:rsid w:val="00CB0664"/>
     <w:pPr>
@@ -6672,9 +6985,9 @@
       </w:tcPr>
     </w:tblStylePr>
   </w:style>
-  <w:style w:type="table" w:styleId="MediumShading1-Accent5">
+  <w:style w:type="table" w:styleId="Sombreadomedio1-nfasis5">
     <w:name w:val="Medium Shading 1 Accent 5"/>
-    <w:basedOn w:val="TableNormal"/>
+    <w:basedOn w:val="Tablanormal"/>
     <w:uiPriority w:val="63"/>
     <w:rsid w:val="00CB0664"/>
     <w:pPr>
@@ -6771,9 +7084,9 @@
       </w:tcPr>
     </w:tblStylePr>
   </w:style>
-  <w:style w:type="table" w:styleId="MediumShading1-Accent6">
+  <w:style w:type="table" w:styleId="Sombreadomedio1-nfasis6">
     <w:name w:val="Medium Shading 1 Accent 6"/>
-    <w:basedOn w:val="TableNormal"/>
+    <w:basedOn w:val="Tablanormal"/>
     <w:uiPriority w:val="63"/>
     <w:rsid w:val="00CB0664"/>
     <w:pPr>
@@ -6870,9 +7183,9 @@
       </w:tcPr>
     </w:tblStylePr>
   </w:style>
-  <w:style w:type="table" w:styleId="MediumShading2">
+  <w:style w:type="table" w:styleId="Sombreadomedio2">
     <w:name w:val="Medium Shading 2"/>
-    <w:basedOn w:val="TableNormal"/>
+    <w:basedOn w:val="Tablanormal"/>
     <w:uiPriority w:val="64"/>
     <w:rsid w:val="00CB0664"/>
     <w:pPr>
@@ -7012,9 +7325,9 @@
       </w:tcPr>
     </w:tblStylePr>
   </w:style>
-  <w:style w:type="table" w:styleId="MediumShading2-Accent1">
+  <w:style w:type="table" w:styleId="Sombreadomedio2-nfasis1">
     <w:name w:val="Medium Shading 2 Accent 1"/>
-    <w:basedOn w:val="TableNormal"/>
+    <w:basedOn w:val="Tablanormal"/>
     <w:uiPriority w:val="64"/>
     <w:rsid w:val="00CB0664"/>
     <w:pPr>
@@ -7154,9 +7467,9 @@
       </w:tcPr>
     </w:tblStylePr>
   </w:style>
-  <w:style w:type="table" w:styleId="MediumShading2-Accent2">
+  <w:style w:type="table" w:styleId="Sombreadomedio2-nfasis2">
     <w:name w:val="Medium Shading 2 Accent 2"/>
-    <w:basedOn w:val="TableNormal"/>
+    <w:basedOn w:val="Tablanormal"/>
     <w:uiPriority w:val="64"/>
     <w:rsid w:val="00CB0664"/>
     <w:pPr>
@@ -7296,9 +7609,9 @@
       </w:tcPr>
     </w:tblStylePr>
   </w:style>
-  <w:style w:type="table" w:styleId="MediumShading2-Accent3">
+  <w:style w:type="table" w:styleId="Sombreadomedio2-nfasis3">
     <w:name w:val="Medium Shading 2 Accent 3"/>
-    <w:basedOn w:val="TableNormal"/>
+    <w:basedOn w:val="Tablanormal"/>
     <w:uiPriority w:val="64"/>
     <w:rsid w:val="00CB0664"/>
     <w:pPr>
@@ -7438,9 +7751,9 @@
       </w:tcPr>
     </w:tblStylePr>
   </w:style>
-  <w:style w:type="table" w:styleId="MediumShading2-Accent4">
+  <w:style w:type="table" w:styleId="Sombreadomedio2-nfasis4">
     <w:name w:val="Medium Shading 2 Accent 4"/>
-    <w:basedOn w:val="TableNormal"/>
+    <w:basedOn w:val="Tablanormal"/>
     <w:uiPriority w:val="64"/>
     <w:rsid w:val="00CB0664"/>
     <w:pPr>
@@ -7580,9 +7893,9 @@
       </w:tcPr>
     </w:tblStylePr>
   </w:style>
-  <w:style w:type="table" w:styleId="MediumShading2-Accent5">
+  <w:style w:type="table" w:styleId="Sombreadomedio2-nfasis5">
     <w:name w:val="Medium Shading 2 Accent 5"/>
-    <w:basedOn w:val="TableNormal"/>
+    <w:basedOn w:val="Tablanormal"/>
     <w:uiPriority w:val="64"/>
     <w:rsid w:val="00CB0664"/>
     <w:pPr>
@@ -7722,9 +8035,9 @@
       </w:tcPr>
     </w:tblStylePr>
   </w:style>
-  <w:style w:type="table" w:styleId="MediumShading2-Accent6">
+  <w:style w:type="table" w:styleId="Sombreadomedio2-nfasis6">
     <w:name w:val="Medium Shading 2 Accent 6"/>
-    <w:basedOn w:val="TableNormal"/>
+    <w:basedOn w:val="Tablanormal"/>
     <w:uiPriority w:val="64"/>
     <w:rsid w:val="00CB0664"/>
     <w:pPr>
@@ -7864,9 +8177,9 @@
       </w:tcPr>
     </w:tblStylePr>
   </w:style>
-  <w:style w:type="table" w:styleId="MediumList1">
+  <w:style w:type="table" w:styleId="Listamedia1">
     <w:name w:val="Medium List 1"/>
-    <w:basedOn w:val="TableNormal"/>
+    <w:basedOn w:val="Tablanormal"/>
     <w:uiPriority w:val="65"/>
     <w:rsid w:val="00CB0664"/>
     <w:pPr>
@@ -7941,9 +8254,9 @@
       </w:tcPr>
     </w:tblStylePr>
   </w:style>
-  <w:style w:type="table" w:styleId="MediumList1-Accent1">
+  <w:style w:type="table" w:styleId="Listamedia1-nfasis1">
     <w:name w:val="Medium List 1 Accent 1"/>
-    <w:basedOn w:val="TableNormal"/>
+    <w:basedOn w:val="Tablanormal"/>
     <w:uiPriority w:val="65"/>
     <w:rsid w:val="00CB0664"/>
     <w:pPr>
@@ -8018,9 +8331,9 @@
       </w:tcPr>
     </w:tblStylePr>
   </w:style>
-  <w:style w:type="table" w:styleId="MediumList1-Accent2">
+  <w:style w:type="table" w:styleId="Listamedia1-nfasis2">
     <w:name w:val="Medium List 1 Accent 2"/>
-    <w:basedOn w:val="TableNormal"/>
+    <w:basedOn w:val="Tablanormal"/>
     <w:uiPriority w:val="65"/>
     <w:rsid w:val="00CB0664"/>
     <w:pPr>
@@ -8095,9 +8408,9 @@
       </w:tcPr>
     </w:tblStylePr>
   </w:style>
-  <w:style w:type="table" w:styleId="MediumList1-Accent3">
+  <w:style w:type="table" w:styleId="Listamedia1-nfasis3">
     <w:name w:val="Medium List 1 Accent 3"/>
-    <w:basedOn w:val="TableNormal"/>
+    <w:basedOn w:val="Tablanormal"/>
     <w:uiPriority w:val="65"/>
     <w:rsid w:val="00CB0664"/>
     <w:pPr>
@@ -8172,9 +8485,9 @@
       </w:tcPr>
     </w:tblStylePr>
   </w:style>
-  <w:style w:type="table" w:styleId="MediumList1-Accent4">
+  <w:style w:type="table" w:styleId="Listamedia1-nfasis4">
     <w:name w:val="Medium List 1 Accent 4"/>
-    <w:basedOn w:val="TableNormal"/>
+    <w:basedOn w:val="Tablanormal"/>
     <w:uiPriority w:val="65"/>
     <w:rsid w:val="00CB0664"/>
     <w:pPr>
@@ -8249,9 +8562,9 @@
       </w:tcPr>
     </w:tblStylePr>
   </w:style>
-  <w:style w:type="table" w:styleId="MediumList1-Accent5">
+  <w:style w:type="table" w:styleId="Listamedia1-nfasis5">
     <w:name w:val="Medium List 1 Accent 5"/>
-    <w:basedOn w:val="TableNormal"/>
+    <w:basedOn w:val="Tablanormal"/>
     <w:uiPriority w:val="65"/>
     <w:rsid w:val="00CB0664"/>
     <w:pPr>
@@ -8326,9 +8639,9 @@
       </w:tcPr>
     </w:tblStylePr>
   </w:style>
-  <w:style w:type="table" w:styleId="MediumList1-Accent6">
+  <w:style w:type="table" w:styleId="Listamedia1-nfasis6">
     <w:name w:val="Medium List 1 Accent 6"/>
-    <w:basedOn w:val="TableNormal"/>
+    <w:basedOn w:val="Tablanormal"/>
     <w:uiPriority w:val="65"/>
     <w:rsid w:val="00CB0664"/>
     <w:pPr>
@@ -8403,9 +8716,9 @@
       </w:tcPr>
     </w:tblStylePr>
   </w:style>
-  <w:style w:type="table" w:styleId="MediumList2">
+  <w:style w:type="table" w:styleId="Listamedia2">
     <w:name w:val="Medium List 2"/>
-    <w:basedOn w:val="TableNormal"/>
+    <w:basedOn w:val="Tablanormal"/>
     <w:uiPriority w:val="66"/>
     <w:rsid w:val="00CB0664"/>
     <w:pPr>
@@ -8524,9 +8837,9 @@
       </w:tcPr>
     </w:tblStylePr>
   </w:style>
-  <w:style w:type="table" w:styleId="MediumList2-Accent1">
+  <w:style w:type="table" w:styleId="Listamedia2-nfasis1">
     <w:name w:val="Medium List 2 Accent 1"/>
-    <w:basedOn w:val="TableNormal"/>
+    <w:basedOn w:val="Tablanormal"/>
     <w:uiPriority w:val="66"/>
     <w:rsid w:val="00CB0664"/>
     <w:pPr>
@@ -8645,9 +8958,9 @@
       </w:tcPr>
     </w:tblStylePr>
   </w:style>
-  <w:style w:type="table" w:styleId="MediumList2-Accent2">
+  <w:style w:type="table" w:styleId="Listamedia2-nfasis2">
     <w:name w:val="Medium List 2 Accent 2"/>
-    <w:basedOn w:val="TableNormal"/>
+    <w:basedOn w:val="Tablanormal"/>
     <w:uiPriority w:val="66"/>
     <w:rsid w:val="00CB0664"/>
     <w:pPr>
@@ -8766,9 +9079,9 @@
       </w:tcPr>
     </w:tblStylePr>
   </w:style>
-  <w:style w:type="table" w:styleId="MediumList2-Accent3">
+  <w:style w:type="table" w:styleId="Listamedia2-nfasis3">
     <w:name w:val="Medium List 2 Accent 3"/>
-    <w:basedOn w:val="TableNormal"/>
+    <w:basedOn w:val="Tablanormal"/>
     <w:uiPriority w:val="66"/>
     <w:rsid w:val="00CB0664"/>
     <w:pPr>
@@ -8887,9 +9200,9 @@
       </w:tcPr>
     </w:tblStylePr>
   </w:style>
-  <w:style w:type="table" w:styleId="MediumList2-Accent4">
+  <w:style w:type="table" w:styleId="Listamedia2-nfasis4">
     <w:name w:val="Medium List 2 Accent 4"/>
-    <w:basedOn w:val="TableNormal"/>
+    <w:basedOn w:val="Tablanormal"/>
     <w:uiPriority w:val="66"/>
     <w:rsid w:val="00CB0664"/>
     <w:pPr>
@@ -9008,9 +9321,9 @@
       </w:tcPr>
     </w:tblStylePr>
   </w:style>
-  <w:style w:type="table" w:styleId="MediumList2-Accent5">
+  <w:style w:type="table" w:styleId="Listamedia2-nfasis5">
     <w:name w:val="Medium List 2 Accent 5"/>
-    <w:basedOn w:val="TableNormal"/>
+    <w:basedOn w:val="Tablanormal"/>
     <w:uiPriority w:val="66"/>
     <w:rsid w:val="00CB0664"/>
     <w:pPr>
@@ -9129,9 +9442,9 @@
       </w:tcPr>
     </w:tblStylePr>
   </w:style>
-  <w:style w:type="table" w:styleId="MediumList2-Accent6">
+  <w:style w:type="table" w:styleId="Listamedia2-nfasis6">
     <w:name w:val="Medium List 2 Accent 6"/>
-    <w:basedOn w:val="TableNormal"/>
+    <w:basedOn w:val="Tablanormal"/>
     <w:uiPriority w:val="66"/>
     <w:rsid w:val="00CB0664"/>
     <w:pPr>
@@ -9250,9 +9563,9 @@
       </w:tcPr>
     </w:tblStylePr>
   </w:style>
-  <w:style w:type="table" w:styleId="MediumGrid1">
+  <w:style w:type="table" w:styleId="Cuadrculamedia1">
     <w:name w:val="Medium Grid 1"/>
-    <w:basedOn w:val="TableNormal"/>
+    <w:basedOn w:val="Tablanormal"/>
     <w:uiPriority w:val="67"/>
     <w:rsid w:val="00CB0664"/>
     <w:pPr>
@@ -9316,9 +9629,9 @@
       </w:tcPr>
     </w:tblStylePr>
   </w:style>
-  <w:style w:type="table" w:styleId="MediumGrid1-Accent1">
+  <w:style w:type="table" w:styleId="Cuadrculamedia1-nfasis1">
     <w:name w:val="Medium Grid 1 Accent 1"/>
-    <w:basedOn w:val="TableNormal"/>
+    <w:basedOn w:val="Tablanormal"/>
     <w:uiPriority w:val="67"/>
     <w:rsid w:val="00CB0664"/>
     <w:pPr>
@@ -9382,9 +9695,9 @@
       </w:tcPr>
     </w:tblStylePr>
   </w:style>
-  <w:style w:type="table" w:styleId="MediumGrid1-Accent2">
+  <w:style w:type="table" w:styleId="Cuadrculamedia1-nfasis2">
     <w:name w:val="Medium Grid 1 Accent 2"/>
-    <w:basedOn w:val="TableNormal"/>
+    <w:basedOn w:val="Tablanormal"/>
     <w:uiPriority w:val="67"/>
     <w:rsid w:val="00CB0664"/>
     <w:pPr>
@@ -9448,9 +9761,9 @@
       </w:tcPr>
     </w:tblStylePr>
   </w:style>
-  <w:style w:type="table" w:styleId="MediumGrid1-Accent3">
+  <w:style w:type="table" w:styleId="Cuadrculamedia1-nfasis3">
     <w:name w:val="Medium Grid 1 Accent 3"/>
-    <w:basedOn w:val="TableNormal"/>
+    <w:basedOn w:val="Tablanormal"/>
     <w:uiPriority w:val="67"/>
     <w:rsid w:val="00CB0664"/>
     <w:pPr>
@@ -9514,9 +9827,9 @@
       </w:tcPr>
     </w:tblStylePr>
   </w:style>
-  <w:style w:type="table" w:styleId="MediumGrid1-Accent4">
+  <w:style w:type="table" w:styleId="Cuadrculamedia1-nfasis4">
     <w:name w:val="Medium Grid 1 Accent 4"/>
-    <w:basedOn w:val="TableNormal"/>
+    <w:basedOn w:val="Tablanormal"/>
     <w:uiPriority w:val="67"/>
     <w:rsid w:val="00CB0664"/>
     <w:pPr>
@@ -9580,9 +9893,9 @@
       </w:tcPr>
     </w:tblStylePr>
   </w:style>
-  <w:style w:type="table" w:styleId="MediumGrid1-Accent5">
+  <w:style w:type="table" w:styleId="Cuadrculamedia1-nfasis5">
     <w:name w:val="Medium Grid 1 Accent 5"/>
-    <w:basedOn w:val="TableNormal"/>
+    <w:basedOn w:val="Tablanormal"/>
     <w:uiPriority w:val="67"/>
     <w:rsid w:val="00CB0664"/>
     <w:pPr>
@@ -9646,9 +9959,9 @@
       </w:tcPr>
     </w:tblStylePr>
   </w:style>
-  <w:style w:type="table" w:styleId="MediumGrid1-Accent6">
+  <w:style w:type="table" w:styleId="Cuadrculamedia1-nfasis6">
     <w:name w:val="Medium Grid 1 Accent 6"/>
-    <w:basedOn w:val="TableNormal"/>
+    <w:basedOn w:val="Tablanormal"/>
     <w:uiPriority w:val="67"/>
     <w:rsid w:val="00CB0664"/>
     <w:pPr>
@@ -9712,9 +10025,9 @@
       </w:tcPr>
     </w:tblStylePr>
   </w:style>
-  <w:style w:type="table" w:styleId="MediumGrid2">
+  <w:style w:type="table" w:styleId="Cuadrculamedia2">
     <w:name w:val="Medium Grid 2"/>
-    <w:basedOn w:val="TableNormal"/>
+    <w:basedOn w:val="Tablanormal"/>
     <w:uiPriority w:val="68"/>
     <w:rsid w:val="00CB0664"/>
     <w:pPr>
@@ -9830,9 +10143,9 @@
       </w:tcPr>
     </w:tblStylePr>
   </w:style>
-  <w:style w:type="table" w:styleId="MediumGrid2-Accent1">
+  <w:style w:type="table" w:styleId="Cuadrculamedia2-nfasis1">
     <w:name w:val="Medium Grid 2 Accent 1"/>
-    <w:basedOn w:val="TableNormal"/>
+    <w:basedOn w:val="Tablanormal"/>
     <w:uiPriority w:val="68"/>
     <w:rsid w:val="00CB0664"/>
     <w:pPr>
@@ -9948,9 +10261,9 @@
       </w:tcPr>
     </w:tblStylePr>
   </w:style>
-  <w:style w:type="table" w:styleId="MediumGrid2-Accent2">
+  <w:style w:type="table" w:styleId="Cuadrculamedia2-nfasis2">
     <w:name w:val="Medium Grid 2 Accent 2"/>
-    <w:basedOn w:val="TableNormal"/>
+    <w:basedOn w:val="Tablanormal"/>
     <w:uiPriority w:val="68"/>
     <w:rsid w:val="00CB0664"/>
     <w:pPr>
@@ -10066,9 +10379,9 @@
       </w:tcPr>
     </w:tblStylePr>
   </w:style>
-  <w:style w:type="table" w:styleId="MediumGrid2-Accent3">
+  <w:style w:type="table" w:styleId="Cuadrculamedia2-nfasis3">
     <w:name w:val="Medium Grid 2 Accent 3"/>
-    <w:basedOn w:val="TableNormal"/>
+    <w:basedOn w:val="Tablanormal"/>
     <w:uiPriority w:val="68"/>
     <w:rsid w:val="00CB0664"/>
     <w:pPr>
@@ -10184,9 +10497,9 @@
       </w:tcPr>
     </w:tblStylePr>
   </w:style>
-  <w:style w:type="table" w:styleId="MediumGrid2-Accent4">
+  <w:style w:type="table" w:styleId="Cuadrculamedia2-nfasis4">
     <w:name w:val="Medium Grid 2 Accent 4"/>
-    <w:basedOn w:val="TableNormal"/>
+    <w:basedOn w:val="Tablanormal"/>
     <w:uiPriority w:val="68"/>
     <w:rsid w:val="00CB0664"/>
     <w:pPr>
@@ -10302,9 +10615,9 @@
       </w:tcPr>
     </w:tblStylePr>
   </w:style>
-  <w:style w:type="table" w:styleId="MediumGrid2-Accent5">
+  <w:style w:type="table" w:styleId="Cuadrculamedia2-nfasis5">
     <w:name w:val="Medium Grid 2 Accent 5"/>
-    <w:basedOn w:val="TableNormal"/>
+    <w:basedOn w:val="Tablanormal"/>
     <w:uiPriority w:val="68"/>
     <w:rsid w:val="00CB0664"/>
     <w:pPr>
@@ -10420,9 +10733,9 @@
       </w:tcPr>
     </w:tblStylePr>
   </w:style>
-  <w:style w:type="table" w:styleId="MediumGrid2-Accent6">
+  <w:style w:type="table" w:styleId="Cuadrculamedia2-nfasis6">
     <w:name w:val="Medium Grid 2 Accent 6"/>
-    <w:basedOn w:val="TableNormal"/>
+    <w:basedOn w:val="Tablanormal"/>
     <w:uiPriority w:val="68"/>
     <w:rsid w:val="00CB0664"/>
     <w:pPr>
@@ -10538,9 +10851,9 @@
       </w:tcPr>
     </w:tblStylePr>
   </w:style>
-  <w:style w:type="table" w:styleId="MediumGrid3">
+  <w:style w:type="table" w:styleId="Cuadrculamedia3">
     <w:name w:val="Medium Grid 3"/>
-    <w:basedOn w:val="TableNormal"/>
+    <w:basedOn w:val="Tablanormal"/>
     <w:uiPriority w:val="69"/>
     <w:rsid w:val="00CB0664"/>
     <w:pPr>
@@ -10672,9 +10985,9 @@
       </w:tcPr>
     </w:tblStylePr>
   </w:style>
-  <w:style w:type="table" w:styleId="MediumGrid3-Accent1">
+  <w:style w:type="table" w:styleId="Cuadrculamedia3-nfasis1">
     <w:name w:val="Medium Grid 3 Accent 1"/>
-    <w:basedOn w:val="TableNormal"/>
+    <w:basedOn w:val="Tablanormal"/>
     <w:uiPriority w:val="69"/>
     <w:rsid w:val="00CB0664"/>
     <w:pPr>
@@ -10806,9 +11119,9 @@
       </w:tcPr>
     </w:tblStylePr>
   </w:style>
-  <w:style w:type="table" w:styleId="MediumGrid3-Accent2">
+  <w:style w:type="table" w:styleId="Cuadrculamedia3-nfasis2">
     <w:name w:val="Medium Grid 3 Accent 2"/>
-    <w:basedOn w:val="TableNormal"/>
+    <w:basedOn w:val="Tablanormal"/>
     <w:uiPriority w:val="69"/>
     <w:rsid w:val="00CB0664"/>
     <w:pPr>
@@ -10940,9 +11253,9 @@
       </w:tcPr>
     </w:tblStylePr>
   </w:style>
-  <w:style w:type="table" w:styleId="MediumGrid3-Accent3">
+  <w:style w:type="table" w:styleId="Cuadrculamedia3-nfasis3">
     <w:name w:val="Medium Grid 3 Accent 3"/>
-    <w:basedOn w:val="TableNormal"/>
+    <w:basedOn w:val="Tablanormal"/>
     <w:uiPriority w:val="69"/>
     <w:rsid w:val="00CB0664"/>
     <w:pPr>
@@ -11074,9 +11387,9 @@
       </w:tcPr>
     </w:tblStylePr>
   </w:style>
-  <w:style w:type="table" w:styleId="MediumGrid3-Accent4">
+  <w:style w:type="table" w:styleId="Cuadrculamedia3-nfasis4">
     <w:name w:val="Medium Grid 3 Accent 4"/>
-    <w:basedOn w:val="TableNormal"/>
+    <w:basedOn w:val="Tablanormal"/>
     <w:uiPriority w:val="69"/>
     <w:rsid w:val="00CB0664"/>
     <w:pPr>
@@ -11208,9 +11521,9 @@
       </w:tcPr>
     </w:tblStylePr>
   </w:style>
-  <w:style w:type="table" w:styleId="MediumGrid3-Accent5">
+  <w:style w:type="table" w:styleId="Cuadrculamedia3-nfasis5">
     <w:name w:val="Medium Grid 3 Accent 5"/>
-    <w:basedOn w:val="TableNormal"/>
+    <w:basedOn w:val="Tablanormal"/>
     <w:uiPriority w:val="69"/>
     <w:rsid w:val="00CB0664"/>
     <w:pPr>
@@ -11342,9 +11655,9 @@
       </w:tcPr>
     </w:tblStylePr>
   </w:style>
-  <w:style w:type="table" w:styleId="MediumGrid3-Accent6">
+  <w:style w:type="table" w:styleId="Cuadrculamedia3-nfasis6">
     <w:name w:val="Medium Grid 3 Accent 6"/>
-    <w:basedOn w:val="TableNormal"/>
+    <w:basedOn w:val="Tablanormal"/>
     <w:uiPriority w:val="69"/>
     <w:rsid w:val="00CB0664"/>
     <w:pPr>
@@ -11476,9 +11789,9 @@
       </w:tcPr>
     </w:tblStylePr>
   </w:style>
-  <w:style w:type="table" w:styleId="DarkList">
+  <w:style w:type="table" w:styleId="Listaoscura">
     <w:name w:val="Dark List"/>
-    <w:basedOn w:val="TableNormal"/>
+    <w:basedOn w:val="Tablanormal"/>
     <w:uiPriority w:val="70"/>
     <w:rsid w:val="00CB0664"/>
     <w:pPr>
@@ -11583,9 +11896,9 @@
       </w:tcPr>
     </w:tblStylePr>
   </w:style>
-  <w:style w:type="table" w:styleId="DarkList-Accent1">
+  <w:style w:type="table" w:styleId="Listaoscura-nfasis1">
     <w:name w:val="Dark List Accent 1"/>
-    <w:basedOn w:val="TableNormal"/>
+    <w:basedOn w:val="Tablanormal"/>
     <w:uiPriority w:val="70"/>
     <w:rsid w:val="00CB0664"/>
     <w:pPr>
@@ -11690,9 +12003,9 @@
       </w:tcPr>
     </w:tblStylePr>
   </w:style>
-  <w:style w:type="table" w:styleId="DarkList-Accent2">
+  <w:style w:type="table" w:styleId="Listaoscura-nfasis2">
     <w:name w:val="Dark List Accent 2"/>
-    <w:basedOn w:val="TableNormal"/>
+    <w:basedOn w:val="Tablanormal"/>
     <w:uiPriority w:val="70"/>
     <w:rsid w:val="00CB0664"/>
     <w:pPr>
@@ -11797,9 +12110,9 @@
       </w:tcPr>
     </w:tblStylePr>
   </w:style>
-  <w:style w:type="table" w:styleId="DarkList-Accent3">
+  <w:style w:type="table" w:styleId="Listaoscura-nfasis3">
     <w:name w:val="Dark List Accent 3"/>
-    <w:basedOn w:val="TableNormal"/>
+    <w:basedOn w:val="Tablanormal"/>
     <w:uiPriority w:val="70"/>
     <w:rsid w:val="00CB0664"/>
     <w:pPr>
@@ -11904,9 +12217,9 @@
       </w:tcPr>
     </w:tblStylePr>
   </w:style>
-  <w:style w:type="table" w:styleId="DarkList-Accent4">
+  <w:style w:type="table" w:styleId="Listaoscura-nfasis4">
     <w:name w:val="Dark List Accent 4"/>
-    <w:basedOn w:val="TableNormal"/>
+    <w:basedOn w:val="Tablanormal"/>
     <w:uiPriority w:val="70"/>
     <w:rsid w:val="00CB0664"/>
     <w:pPr>
@@ -12011,9 +12324,9 @@
       </w:tcPr>
     </w:tblStylePr>
   </w:style>
-  <w:style w:type="table" w:styleId="DarkList-Accent5">
+  <w:style w:type="table" w:styleId="Listaoscura-nfasis5">
     <w:name w:val="Dark List Accent 5"/>
-    <w:basedOn w:val="TableNormal"/>
+    <w:basedOn w:val="Tablanormal"/>
     <w:uiPriority w:val="70"/>
     <w:rsid w:val="00CB0664"/>
     <w:pPr>
@@ -12118,9 +12431,9 @@
       </w:tcPr>
     </w:tblStylePr>
   </w:style>
-  <w:style w:type="table" w:styleId="DarkList-Accent6">
+  <w:style w:type="table" w:styleId="Listaoscura-nfasis6">
     <w:name w:val="Dark List Accent 6"/>
-    <w:basedOn w:val="TableNormal"/>
+    <w:basedOn w:val="Tablanormal"/>
     <w:uiPriority w:val="70"/>
     <w:rsid w:val="00CB0664"/>
     <w:pPr>
@@ -12225,9 +12538,9 @@
       </w:tcPr>
     </w:tblStylePr>
   </w:style>
-  <w:style w:type="table" w:styleId="ColorfulShading">
+  <w:style w:type="table" w:styleId="Sombreadovistoso">
     <w:name w:val="Colorful Shading"/>
-    <w:basedOn w:val="TableNormal"/>
+    <w:basedOn w:val="Tablanormal"/>
     <w:uiPriority w:val="71"/>
     <w:rsid w:val="00CB0664"/>
     <w:pPr>
@@ -12340,9 +12653,9 @@
       </w:rPr>
     </w:tblStylePr>
   </w:style>
-  <w:style w:type="table" w:styleId="ColorfulShading-Accent1">
+  <w:style w:type="table" w:styleId="Sombreadovistoso-nfasis1">
     <w:name w:val="Colorful Shading Accent 1"/>
-    <w:basedOn w:val="TableNormal"/>
+    <w:basedOn w:val="Tablanormal"/>
     <w:uiPriority w:val="71"/>
     <w:rsid w:val="00CB0664"/>
     <w:pPr>
@@ -12455,9 +12768,9 @@
       </w:rPr>
     </w:tblStylePr>
   </w:style>
-  <w:style w:type="table" w:styleId="ColorfulShading-Accent2">
+  <w:style w:type="table" w:styleId="Sombreadovistoso-nfasis2">
     <w:name w:val="Colorful Shading Accent 2"/>
-    <w:basedOn w:val="TableNormal"/>
+    <w:basedOn w:val="Tablanormal"/>
     <w:uiPriority w:val="71"/>
     <w:rsid w:val="00CB0664"/>
     <w:pPr>
@@ -12570,9 +12883,9 @@
       </w:rPr>
     </w:tblStylePr>
   </w:style>
-  <w:style w:type="table" w:styleId="ColorfulShading-Accent3">
+  <w:style w:type="table" w:styleId="Sombreadovistoso-nfasis3">
     <w:name w:val="Colorful Shading Accent 3"/>
-    <w:basedOn w:val="TableNormal"/>
+    <w:basedOn w:val="Tablanormal"/>
     <w:uiPriority w:val="71"/>
     <w:rsid w:val="00CB0664"/>
     <w:pPr>
@@ -12675,9 +12988,9 @@
       </w:tcPr>
     </w:tblStylePr>
   </w:style>
-  <w:style w:type="table" w:styleId="ColorfulShading-Accent4">
+  <w:style w:type="table" w:styleId="Sombreadovistoso-nfasis4">
     <w:name w:val="Colorful Shading Accent 4"/>
-    <w:basedOn w:val="TableNormal"/>
+    <w:basedOn w:val="Tablanormal"/>
     <w:uiPriority w:val="71"/>
     <w:rsid w:val="00CB0664"/>
     <w:pPr>
@@ -12790,9 +13103,9 @@
       </w:rPr>
     </w:tblStylePr>
   </w:style>
-  <w:style w:type="table" w:styleId="ColorfulShading-Accent5">
+  <w:style w:type="table" w:styleId="Sombreadovistoso-nfasis5">
     <w:name w:val="Colorful Shading Accent 5"/>
-    <w:basedOn w:val="TableNormal"/>
+    <w:basedOn w:val="Tablanormal"/>
     <w:uiPriority w:val="71"/>
     <w:rsid w:val="00CB0664"/>
     <w:pPr>
@@ -12905,9 +13218,9 @@
       </w:rPr>
     </w:tblStylePr>
   </w:style>
-  <w:style w:type="table" w:styleId="ColorfulShading-Accent6">
+  <w:style w:type="table" w:styleId="Sombreadovistoso-nfasis6">
     <w:name w:val="Colorful Shading Accent 6"/>
-    <w:basedOn w:val="TableNormal"/>
+    <w:basedOn w:val="Tablanormal"/>
     <w:uiPriority w:val="71"/>
     <w:rsid w:val="00CB0664"/>
     <w:pPr>
@@ -13020,9 +13333,9 @@
       </w:rPr>
     </w:tblStylePr>
   </w:style>
-  <w:style w:type="table" w:styleId="ColorfulList">
+  <w:style w:type="table" w:styleId="Listavistosa">
     <w:name w:val="Colorful List"/>
-    <w:basedOn w:val="TableNormal"/>
+    <w:basedOn w:val="Tablanormal"/>
     <w:uiPriority w:val="72"/>
     <w:rsid w:val="00CB0664"/>
     <w:pPr>
@@ -13099,9 +13412,9 @@
       </w:tcPr>
     </w:tblStylePr>
   </w:style>
-  <w:style w:type="table" w:styleId="ColorfulList-Accent1">
+  <w:style w:type="table" w:styleId="Listavistosa-nfasis1">
     <w:name w:val="Colorful List Accent 1"/>
-    <w:basedOn w:val="TableNormal"/>
+    <w:basedOn w:val="Tablanormal"/>
     <w:uiPriority w:val="72"/>
     <w:rsid w:val="00CB0664"/>
     <w:pPr>
@@ -13178,9 +13491,9 @@
       </w:tcPr>
     </w:tblStylePr>
   </w:style>
-  <w:style w:type="table" w:styleId="ColorfulList-Accent2">
+  <w:style w:type="table" w:styleId="Listavistosa-nfasis2">
     <w:name w:val="Colorful List Accent 2"/>
-    <w:basedOn w:val="TableNormal"/>
+    <w:basedOn w:val="Tablanormal"/>
     <w:uiPriority w:val="72"/>
     <w:rsid w:val="00CB0664"/>
     <w:pPr>
@@ -13257,9 +13570,9 @@
       </w:tcPr>
     </w:tblStylePr>
   </w:style>
-  <w:style w:type="table" w:styleId="ColorfulList-Accent3">
+  <w:style w:type="table" w:styleId="Listavistosa-nfasis3">
     <w:name w:val="Colorful List Accent 3"/>
-    <w:basedOn w:val="TableNormal"/>
+    <w:basedOn w:val="Tablanormal"/>
     <w:uiPriority w:val="72"/>
     <w:rsid w:val="00CB0664"/>
     <w:pPr>
@@ -13336,9 +13649,9 @@
       </w:tcPr>
     </w:tblStylePr>
   </w:style>
-  <w:style w:type="table" w:styleId="ColorfulList-Accent4">
+  <w:style w:type="table" w:styleId="Listavistosa-nfasis4">
     <w:name w:val="Colorful List Accent 4"/>
-    <w:basedOn w:val="TableNormal"/>
+    <w:basedOn w:val="Tablanormal"/>
     <w:uiPriority w:val="72"/>
     <w:rsid w:val="00CB0664"/>
     <w:pPr>
@@ -13415,9 +13728,9 @@
       </w:tcPr>
     </w:tblStylePr>
   </w:style>
-  <w:style w:type="table" w:styleId="ColorfulList-Accent5">
+  <w:style w:type="table" w:styleId="Listavistosa-nfasis5">
     <w:name w:val="Colorful List Accent 5"/>
-    <w:basedOn w:val="TableNormal"/>
+    <w:basedOn w:val="Tablanormal"/>
     <w:uiPriority w:val="72"/>
     <w:rsid w:val="00CB0664"/>
     <w:pPr>
@@ -13494,9 +13807,9 @@
       </w:tcPr>
     </w:tblStylePr>
   </w:style>
-  <w:style w:type="table" w:styleId="ColorfulList-Accent6">
+  <w:style w:type="table" w:styleId="Listavistosa-nfasis6">
     <w:name w:val="Colorful List Accent 6"/>
-    <w:basedOn w:val="TableNormal"/>
+    <w:basedOn w:val="Tablanormal"/>
     <w:uiPriority w:val="72"/>
     <w:rsid w:val="00CB0664"/>
     <w:pPr>
@@ -13573,9 +13886,9 @@
       </w:tcPr>
     </w:tblStylePr>
   </w:style>
-  <w:style w:type="table" w:styleId="ColorfulGrid">
+  <w:style w:type="table" w:styleId="Cuadrculavistosa">
     <w:name w:val="Colorful Grid"/>
-    <w:basedOn w:val="TableNormal"/>
+    <w:basedOn w:val="Tablanormal"/>
     <w:uiPriority w:val="73"/>
     <w:rsid w:val="00CB0664"/>
     <w:pPr>
@@ -13646,9 +13959,9 @@
       </w:tcPr>
     </w:tblStylePr>
   </w:style>
-  <w:style w:type="table" w:styleId="ColorfulGrid-Accent1">
+  <w:style w:type="table" w:styleId="Cuadrculavistosa-nfasis1">
     <w:name w:val="Colorful Grid Accent 1"/>
-    <w:basedOn w:val="TableNormal"/>
+    <w:basedOn w:val="Tablanormal"/>
     <w:uiPriority w:val="73"/>
     <w:rsid w:val="00CB0664"/>
     <w:pPr>
@@ -13719,9 +14032,9 @@
       </w:tcPr>
     </w:tblStylePr>
   </w:style>
-  <w:style w:type="table" w:styleId="ColorfulGrid-Accent2">
+  <w:style w:type="table" w:styleId="Cuadrculavistosa-nfasis2">
     <w:name w:val="Colorful Grid Accent 2"/>
-    <w:basedOn w:val="TableNormal"/>
+    <w:basedOn w:val="Tablanormal"/>
     <w:uiPriority w:val="73"/>
     <w:rsid w:val="00CB0664"/>
     <w:pPr>
@@ -13792,9 +14105,9 @@
       </w:tcPr>
     </w:tblStylePr>
   </w:style>
-  <w:style w:type="table" w:styleId="ColorfulGrid-Accent3">
+  <w:style w:type="table" w:styleId="Cuadrculavistosa-nfasis3">
     <w:name w:val="Colorful Grid Accent 3"/>
-    <w:basedOn w:val="TableNormal"/>
+    <w:basedOn w:val="Tablanormal"/>
     <w:uiPriority w:val="73"/>
     <w:rsid w:val="00CB0664"/>
     <w:pPr>
@@ -13865,9 +14178,9 @@
       </w:tcPr>
     </w:tblStylePr>
   </w:style>
-  <w:style w:type="table" w:styleId="ColorfulGrid-Accent4">
+  <w:style w:type="table" w:styleId="Cuadrculavistosa-nfasis4">
     <w:name w:val="Colorful Grid Accent 4"/>
-    <w:basedOn w:val="TableNormal"/>
+    <w:basedOn w:val="Tablanormal"/>
     <w:uiPriority w:val="73"/>
     <w:rsid w:val="00CB0664"/>
     <w:pPr>
@@ -13938,9 +14251,9 @@
       </w:tcPr>
     </w:tblStylePr>
   </w:style>
-  <w:style w:type="table" w:styleId="ColorfulGrid-Accent5">
+  <w:style w:type="table" w:styleId="Cuadrculavistosa-nfasis5">
     <w:name w:val="Colorful Grid Accent 5"/>
-    <w:basedOn w:val="TableNormal"/>
+    <w:basedOn w:val="Tablanormal"/>
     <w:uiPriority w:val="73"/>
     <w:rsid w:val="00CB0664"/>
     <w:pPr>
@@ -14011,9 +14324,9 @@
       </w:tcPr>
     </w:tblStylePr>
   </w:style>
-  <w:style w:type="table" w:styleId="ColorfulGrid-Accent6">
+  <w:style w:type="table" w:styleId="Cuadrculavistosa-nfasis6">
     <w:name w:val="Colorful Grid Accent 6"/>
-    <w:basedOn w:val="TableNormal"/>
+    <w:basedOn w:val="Tablanormal"/>
     <w:uiPriority w:val="73"/>
     <w:rsid w:val="00CB0664"/>
     <w:pPr>
@@ -14084,9 +14397,9 @@
       </w:tcPr>
     </w:tblStylePr>
   </w:style>
-  <w:style w:type="character" w:styleId="HTMLCode">
+  <w:style w:type="character" w:styleId="CdigoHTML">
     <w:name w:val="HTML Code"/>
-    <w:basedOn w:val="DefaultParagraphFont"/>
+    <w:basedOn w:val="Fuentedeprrafopredeter"/>
     <w:uiPriority w:val="99"/>
     <w:semiHidden/>
     <w:unhideWhenUsed/>
@@ -14097,9 +14410,9 @@
       <w:szCs w:val="20"/>
     </w:rPr>
   </w:style>
-  <w:style w:type="character" w:styleId="Hyperlink">
+  <w:style w:type="character" w:styleId="Hipervnculo">
     <w:name w:val="Hyperlink"/>
-    <w:basedOn w:val="DefaultParagraphFont"/>
+    <w:basedOn w:val="Fuentedeprrafopredeter"/>
     <w:uiPriority w:val="99"/>
     <w:unhideWhenUsed/>
     <w:rsid w:val="005709EB"/>
@@ -14108,9 +14421,9 @@
       <w:u w:val="single"/>
     </w:rPr>
   </w:style>
-  <w:style w:type="character" w:styleId="UnresolvedMention">
+  <w:style w:type="character" w:styleId="Mencinsinresolver">
     <w:name w:val="Unresolved Mention"/>
-    <w:basedOn w:val="DefaultParagraphFont"/>
+    <w:basedOn w:val="Fuentedeprrafopredeter"/>
     <w:uiPriority w:val="99"/>
     <w:semiHidden/>
     <w:unhideWhenUsed/>
@@ -14118,6 +14431,20 @@
     <w:rPr>
       <w:color w:val="605E5C"/>
       <w:shd w:val="clear" w:color="auto" w:fill="E1DFDD"/>
+    </w:rPr>
+  </w:style>
+  <w:style w:type="paragraph" w:customStyle="1" w:styleId="font-claude-response-body">
+    <w:name w:val="font-claude-response-body"/>
+    <w:basedOn w:val="Normal"/>
+    <w:rsid w:val="00CB6FD2"/>
+    <w:pPr>
+      <w:spacing w:before="100" w:beforeAutospacing="1" w:after="100" w:afterAutospacing="1" w:line="240" w:lineRule="auto"/>
+    </w:pPr>
+    <w:rPr>
+      <w:rFonts w:ascii="Times New Roman" w:eastAsia="Times New Roman" w:hAnsi="Times New Roman" w:cs="Times New Roman"/>
+      <w:sz w:val="24"/>
+      <w:szCs w:val="24"/>
+      <w:lang w:val="es-CO" w:eastAsia="es-CO"/>
     </w:rPr>
   </w:style>
 </w:styles>

</xml_diff>

<commit_message>
Update Taller 5 Bloomberg H.E. - Jess Gil y Antonio Gutiérrez.docx
</commit_message>
<xml_diff>
--- a/Documents/Taller 5 Bloomberg H.E. - Jess Gil y Antonio Gutiérrez.docx
+++ b/Documents/Taller 5 Bloomberg H.E. - Jess Gil y Antonio Gutiérrez.docx
@@ -4,7 +4,7 @@
   <w:body>
     <w:p>
       <w:pPr>
-        <w:pStyle w:val="Ttulo1"/>
+        <w:pStyle w:val="Heading1"/>
         <w:spacing w:before="0"/>
         <w:rPr>
           <w:rFonts w:cstheme="majorHAnsi"/>
@@ -52,7 +52,7 @@
     </w:p>
     <w:p>
       <w:pPr>
-        <w:pStyle w:val="Listaconvietas"/>
+        <w:pStyle w:val="ListBullet"/>
         <w:numPr>
           <w:ilvl w:val="0"/>
           <w:numId w:val="0"/>
@@ -76,7 +76,7 @@
       <w:hyperlink r:id="rId6" w:history="1">
         <w:r>
           <w:rPr>
-            <w:rStyle w:val="Hipervnculo"/>
+            <w:rStyle w:val="Hyperlink"/>
             <w:rFonts w:asciiTheme="majorHAnsi" w:hAnsiTheme="majorHAnsi" w:cstheme="majorHAnsi"/>
             <w:sz w:val="24"/>
             <w:szCs w:val="24"/>
@@ -88,7 +88,7 @@
     </w:p>
     <w:p>
       <w:pPr>
-        <w:pStyle w:val="Listaconvietas"/>
+        <w:pStyle w:val="ListBullet"/>
         <w:numPr>
           <w:ilvl w:val="0"/>
           <w:numId w:val="0"/>
@@ -104,7 +104,7 @@
     </w:p>
     <w:p>
       <w:pPr>
-        <w:pStyle w:val="Listaconvietas"/>
+        <w:pStyle w:val="ListBullet"/>
         <w:numPr>
           <w:ilvl w:val="0"/>
           <w:numId w:val="11"/>
@@ -303,7 +303,7 @@
     </w:p>
     <w:p>
       <w:pPr>
-        <w:pStyle w:val="Listaconvietas"/>
+        <w:pStyle w:val="ListBullet"/>
         <w:numPr>
           <w:ilvl w:val="0"/>
           <w:numId w:val="0"/>
@@ -433,7 +433,7 @@
     </w:p>
     <w:p>
       <w:pPr>
-        <w:pStyle w:val="Listaconvietas"/>
+        <w:pStyle w:val="ListBullet"/>
         <w:numPr>
           <w:ilvl w:val="0"/>
           <w:numId w:val="11"/>
@@ -461,7 +461,7 @@
     </w:p>
     <w:p>
       <w:pPr>
-        <w:pStyle w:val="Listaconvietas"/>
+        <w:pStyle w:val="ListBullet"/>
         <w:numPr>
           <w:ilvl w:val="1"/>
           <w:numId w:val="11"/>
@@ -618,7 +618,7 @@
     </w:p>
     <w:p>
       <w:pPr>
-        <w:pStyle w:val="Listaconvietas"/>
+        <w:pStyle w:val="ListBullet"/>
         <w:numPr>
           <w:ilvl w:val="1"/>
           <w:numId w:val="11"/>
@@ -799,7 +799,7 @@
     </w:p>
     <w:p>
       <w:pPr>
-        <w:pStyle w:val="Listaconvietas"/>
+        <w:pStyle w:val="ListBullet"/>
         <w:numPr>
           <w:ilvl w:val="0"/>
           <w:numId w:val="11"/>
@@ -827,7 +827,7 @@
     </w:p>
     <w:p>
       <w:pPr>
-        <w:pStyle w:val="Listaconvietas"/>
+        <w:pStyle w:val="ListBullet"/>
         <w:numPr>
           <w:ilvl w:val="1"/>
           <w:numId w:val="11"/>
@@ -915,7 +915,7 @@
     </w:p>
     <w:p>
       <w:pPr>
-        <w:pStyle w:val="Prrafodelista"/>
+        <w:pStyle w:val="ListParagraph"/>
         <w:numPr>
           <w:ilvl w:val="0"/>
           <w:numId w:val="13"/>
@@ -990,7 +990,7 @@
     </w:p>
     <w:p>
       <w:pPr>
-        <w:pStyle w:val="Prrafodelista"/>
+        <w:pStyle w:val="ListParagraph"/>
         <w:numPr>
           <w:ilvl w:val="0"/>
           <w:numId w:val="13"/>
@@ -1030,7 +1030,7 @@
     </w:p>
     <w:p>
       <w:pPr>
-        <w:pStyle w:val="Prrafodelista"/>
+        <w:pStyle w:val="ListParagraph"/>
         <w:numPr>
           <w:ilvl w:val="0"/>
           <w:numId w:val="13"/>
@@ -1124,7 +1124,7 @@
     </w:p>
     <w:p>
       <w:pPr>
-        <w:pStyle w:val="Listaconvietas"/>
+        <w:pStyle w:val="ListBullet"/>
         <w:numPr>
           <w:ilvl w:val="1"/>
           <w:numId w:val="11"/>
@@ -1258,7 +1258,7 @@
     </w:p>
     <w:p>
       <w:pPr>
-        <w:pStyle w:val="Listaconvietas"/>
+        <w:pStyle w:val="ListBullet"/>
         <w:numPr>
           <w:ilvl w:val="1"/>
           <w:numId w:val="11"/>
@@ -1411,7 +1411,7 @@
     </w:p>
     <w:p>
       <w:pPr>
-        <w:pStyle w:val="Listaconvietas"/>
+        <w:pStyle w:val="ListBullet"/>
         <w:numPr>
           <w:ilvl w:val="1"/>
           <w:numId w:val="11"/>
@@ -1566,7 +1566,7 @@
     </w:p>
     <w:p>
       <w:pPr>
-        <w:pStyle w:val="Listaconvietas"/>
+        <w:pStyle w:val="ListBullet"/>
         <w:numPr>
           <w:ilvl w:val="0"/>
           <w:numId w:val="0"/>
@@ -1582,7 +1582,7 @@
     </w:p>
     <w:p>
       <w:pPr>
-        <w:pStyle w:val="Listaconvietas"/>
+        <w:pStyle w:val="ListBullet"/>
         <w:numPr>
           <w:ilvl w:val="1"/>
           <w:numId w:val="11"/>
@@ -1790,7 +1790,7 @@
     </w:p>
     <w:p>
       <w:pPr>
-        <w:pStyle w:val="Listaconvietas"/>
+        <w:pStyle w:val="ListBullet"/>
         <w:numPr>
           <w:ilvl w:val="0"/>
           <w:numId w:val="11"/>
@@ -1862,7 +1862,7 @@
     </w:p>
     <w:p>
       <w:pPr>
-        <w:pStyle w:val="Listaconvietas"/>
+        <w:pStyle w:val="ListBullet"/>
         <w:numPr>
           <w:ilvl w:val="1"/>
           <w:numId w:val="11"/>
@@ -1913,7 +1913,7 @@
     </w:p>
     <w:p>
       <w:pPr>
-        <w:pStyle w:val="Listaconvietas"/>
+        <w:pStyle w:val="ListBullet"/>
         <w:numPr>
           <w:ilvl w:val="0"/>
           <w:numId w:val="0"/>
@@ -1991,7 +1991,7 @@
     </w:p>
     <w:p>
       <w:pPr>
-        <w:pStyle w:val="Listaconvietas"/>
+        <w:pStyle w:val="ListBullet"/>
         <w:numPr>
           <w:ilvl w:val="0"/>
           <w:numId w:val="0"/>
@@ -2007,7 +2007,7 @@
     </w:p>
     <w:p>
       <w:pPr>
-        <w:pStyle w:val="Listaconvietas"/>
+        <w:pStyle w:val="ListBullet"/>
         <w:numPr>
           <w:ilvl w:val="1"/>
           <w:numId w:val="11"/>
@@ -2040,7 +2040,7 @@
     </w:p>
     <w:p>
       <w:pPr>
-        <w:pStyle w:val="Listaconvietas"/>
+        <w:pStyle w:val="ListBullet"/>
         <w:numPr>
           <w:ilvl w:val="0"/>
           <w:numId w:val="0"/>
@@ -2118,7 +2118,7 @@
     </w:p>
     <w:p>
       <w:pPr>
-        <w:pStyle w:val="Listaconvietas"/>
+        <w:pStyle w:val="ListBullet"/>
         <w:numPr>
           <w:ilvl w:val="0"/>
           <w:numId w:val="0"/>
@@ -2134,7 +2134,7 @@
     </w:p>
     <w:p>
       <w:pPr>
-        <w:pStyle w:val="Listaconvietas"/>
+        <w:pStyle w:val="ListBullet"/>
         <w:numPr>
           <w:ilvl w:val="1"/>
           <w:numId w:val="11"/>
@@ -2176,7 +2176,7 @@
     </w:p>
     <w:p>
       <w:pPr>
-        <w:pStyle w:val="Listaconvietas"/>
+        <w:pStyle w:val="ListBullet"/>
         <w:numPr>
           <w:ilvl w:val="0"/>
           <w:numId w:val="0"/>
@@ -2184,8 +2184,7 @@
         <w:ind w:left="1440"/>
         <w:rPr>
           <w:rFonts w:asciiTheme="majorHAnsi" w:hAnsiTheme="majorHAnsi" w:cstheme="majorHAnsi"/>
-          <w:sz w:val="24"/>
-          <w:szCs w:val="24"/>
+          <w:highlight w:val="yellow"/>
           <w:lang w:val="es-CO"/>
         </w:rPr>
       </w:pPr>
@@ -2254,7 +2253,7 @@
     </w:p>
     <w:p>
       <w:pPr>
-        <w:pStyle w:val="Listaconvietas"/>
+        <w:pStyle w:val="ListBullet"/>
         <w:numPr>
           <w:ilvl w:val="0"/>
           <w:numId w:val="0"/>
@@ -2270,7 +2269,7 @@
     </w:p>
     <w:p>
       <w:pPr>
-        <w:pStyle w:val="Listaconvietas"/>
+        <w:pStyle w:val="ListBullet"/>
         <w:numPr>
           <w:ilvl w:val="1"/>
           <w:numId w:val="11"/>
@@ -2294,111 +2293,75 @@
     </w:p>
     <w:p>
       <w:pPr>
-        <w:pStyle w:val="font-claude-response-body"/>
-        <w:rPr>
-          <w:rFonts w:asciiTheme="majorHAnsi" w:hAnsiTheme="majorHAnsi" w:cstheme="majorHAnsi"/>
-        </w:rPr>
-      </w:pPr>
-      <w:r>
-        <w:rPr>
-          <w:rFonts w:asciiTheme="majorHAnsi" w:hAnsiTheme="majorHAnsi" w:cstheme="majorHAnsi"/>
+        <w:rPr>
+          <w:rFonts w:asciiTheme="majorHAnsi" w:hAnsiTheme="majorHAnsi" w:cstheme="majorHAnsi"/>
+          <w:highlight w:val="yellow"/>
+          <w:lang w:val="es-CO"/>
+        </w:rPr>
+      </w:pPr>
+      <w:r>
+        <w:rPr>
+          <w:rFonts w:asciiTheme="majorHAnsi" w:hAnsiTheme="majorHAnsi" w:cstheme="majorHAnsi"/>
+          <w:highlight w:val="yellow"/>
+          <w:lang w:val="es-CO"/>
         </w:rPr>
         <w:t>En el sector de tecnología se observa el cambio más notable: la desviación estándar pasó de 0,01453 en 2015 a 0,01959 en 2025, lo que representa un incremento de aproximadamente el 35%. Adicionalmente, los intervalos de confianza de ambos años no se solapan, lo cual indica que esta diferencia es estadísticamente significativa. Esto sugiere que el mercado tecnológico se volvió considerablemente más volátil, fenómeno que puede explicarse por el fuerte crecimiento del sector impulsado por la inteligencia artificial, la digitalización acelerada por la pandemia y los ciclos de auge y corrección propios de este tipo de activos.</w:t>
       </w:r>
     </w:p>
     <w:p>
       <w:pPr>
-        <w:pStyle w:val="font-claude-response-body"/>
-        <w:rPr>
-          <w:rFonts w:asciiTheme="majorHAnsi" w:hAnsiTheme="majorHAnsi" w:cstheme="majorHAnsi"/>
-        </w:rPr>
-      </w:pPr>
-      <w:r>
-        <w:rPr>
-          <w:rFonts w:asciiTheme="majorHAnsi" w:hAnsiTheme="majorHAnsi" w:cstheme="majorHAnsi"/>
-        </w:rPr>
-        <w:t>En el sector de consumo básico, la variación es mínima: la desviación estándar pasó de 0,00886 a 0,00911, un cambio de apenas el 2,8%. Los intervalos de confianza de ambos años se solapan ampliamente, lo que indica que no hay evidencia estadística de un cambio significativo en la volatilidad. Este comportamiento es consistente con la naturaleza defensiva del sector, cuyos productos</w:t>
-      </w:r>
-      <w:r>
-        <w:rPr>
-          <w:rFonts w:asciiTheme="majorHAnsi" w:hAnsiTheme="majorHAnsi" w:cstheme="majorHAnsi"/>
-        </w:rPr>
-        <w:t xml:space="preserve"> como </w:t>
-      </w:r>
-      <w:r>
-        <w:rPr>
-          <w:rFonts w:asciiTheme="majorHAnsi" w:hAnsiTheme="majorHAnsi" w:cstheme="majorHAnsi"/>
-        </w:rPr>
-        <w:t>alimentos, bebidas y artículos de higiene</w:t>
-      </w:r>
-      <w:r>
-        <w:rPr>
-          <w:rFonts w:asciiTheme="majorHAnsi" w:hAnsiTheme="majorHAnsi" w:cstheme="majorHAnsi"/>
-        </w:rPr>
-        <w:t xml:space="preserve"> </w:t>
-      </w:r>
-      <w:r>
-        <w:rPr>
-          <w:rFonts w:asciiTheme="majorHAnsi" w:hAnsiTheme="majorHAnsi" w:cstheme="majorHAnsi"/>
-        </w:rPr>
-        <w:t>mantienen una demanda estable independientemente del ciclo económico.</w:t>
+        <w:rPr>
+          <w:rFonts w:asciiTheme="majorHAnsi" w:hAnsiTheme="majorHAnsi" w:cstheme="majorHAnsi"/>
+          <w:highlight w:val="yellow"/>
+          <w:lang w:val="es-CO"/>
+        </w:rPr>
+      </w:pPr>
+      <w:r>
+        <w:rPr>
+          <w:rFonts w:asciiTheme="majorHAnsi" w:hAnsiTheme="majorHAnsi" w:cstheme="majorHAnsi"/>
+          <w:highlight w:val="yellow"/>
+          <w:lang w:val="es-CO"/>
+        </w:rPr>
+        <w:t>En el sector de consumo básico, la variación es mínima: la desviación estándar pasó de 0,00886 a 0,00911, un cambio de apenas el 2,8%. Los intervalos de confianza de ambos años se solapan ampliamente, lo que indica que no hay evidencia estadística de un cambio significativo en la volatilidad. Este comportamiento es consistente con la naturaleza defensiva del sector, cuyos productos como alimentos, bebidas y artículos de higiene mantienen una demanda estable independientemente del ciclo económico.</w:t>
       </w:r>
     </w:p>
     <w:p>
       <w:pPr>
-        <w:pStyle w:val="font-claude-response-body"/>
-        <w:rPr>
-          <w:rFonts w:asciiTheme="majorHAnsi" w:hAnsiTheme="majorHAnsi" w:cstheme="majorHAnsi"/>
-        </w:rPr>
-      </w:pPr>
-      <w:r>
-        <w:rPr>
-          <w:rFonts w:asciiTheme="majorHAnsi" w:hAnsiTheme="majorHAnsi" w:cstheme="majorHAnsi"/>
-        </w:rPr>
-        <w:t>En el sector inmobiliario, la desviación estándar disminuyó levemente de 0,01107 en 2015 a 0,01082 en 2025, una reducción de apenas el 2,3%. Al igual que en consumo básico, los intervalos de confianza se solapan, por lo que no se puede concluir que el cambio sea estadísticamente significativo. Sin embargo, este resultado es interesante dado el contexto</w:t>
-      </w:r>
-      <w:r>
-        <w:rPr>
-          <w:rFonts w:asciiTheme="majorHAnsi" w:hAnsiTheme="majorHAnsi" w:cstheme="majorHAnsi"/>
-        </w:rPr>
-        <w:t xml:space="preserve"> ya que </w:t>
-      </w:r>
-      <w:r>
-        <w:rPr>
-          <w:rFonts w:asciiTheme="majorHAnsi" w:hAnsiTheme="majorHAnsi" w:cstheme="majorHAnsi"/>
-        </w:rPr>
-        <w:t>el sector inmobiliario enfrentó presiones importantes en 2022 debido a las subidas de tasas de interés por parte de la Reserva Federal, lo que generó alta volatilidad en ese período intermedio que no necesariamente se refleja al comparar solo los años extremos.</w:t>
+        <w:rPr>
+          <w:rFonts w:asciiTheme="majorHAnsi" w:hAnsiTheme="majorHAnsi" w:cstheme="majorHAnsi"/>
+          <w:highlight w:val="yellow"/>
+          <w:lang w:val="es-CO"/>
+        </w:rPr>
+      </w:pPr>
+      <w:r>
+        <w:rPr>
+          <w:rFonts w:asciiTheme="majorHAnsi" w:hAnsiTheme="majorHAnsi" w:cstheme="majorHAnsi"/>
+          <w:highlight w:val="yellow"/>
+          <w:lang w:val="es-CO"/>
+        </w:rPr>
+        <w:t>En el sector inmobiliario, la desviación estándar disminuyó levemente de 0,01107 en 2015 a 0,01082 en 2025, una reducción de apenas el 2,3%. Al igual que en consumo básico, los intervalos de confianza se solapan, por lo que no se puede concluir que el cambio sea estadísticamente significativo. Sin embargo, este resultado es interesante dado el contexto ya que el sector inmobiliario enfrentó presiones importantes en 2022 debido a las subidas de tasas de interés por parte de la Reserva Federal, lo que generó alta volatilidad en ese período intermedio que no necesariamente se refleja al comparar solo los años extremos.</w:t>
       </w:r>
     </w:p>
     <w:p>
       <w:pPr>
-        <w:pStyle w:val="font-claude-response-body"/>
-        <w:rPr>
-          <w:rFonts w:asciiTheme="majorHAnsi" w:hAnsiTheme="majorHAnsi" w:cstheme="majorHAnsi"/>
-        </w:rPr>
-      </w:pPr>
-      <w:r>
-        <w:rPr>
-          <w:rFonts w:asciiTheme="majorHAnsi" w:hAnsiTheme="majorHAnsi" w:cstheme="majorHAnsi"/>
-        </w:rPr>
-        <w:t>En conclusión, el único sector que muestra evidencia clara de un cambio en la volatilidad entre 2015 y 2025 es el de tecnología. Los sectores de consumo básico e inmobiliario mantuvieron niveles de riesgo similares en ambos períodos, aunque por razones distintas</w:t>
-      </w:r>
-      <w:r>
-        <w:rPr>
-          <w:rFonts w:asciiTheme="majorHAnsi" w:hAnsiTheme="majorHAnsi" w:cstheme="majorHAnsi"/>
-        </w:rPr>
-        <w:t xml:space="preserve"> ya que, </w:t>
-      </w:r>
-      <w:r>
-        <w:rPr>
-          <w:rFonts w:asciiTheme="majorHAnsi" w:hAnsiTheme="majorHAnsi" w:cstheme="majorHAnsi"/>
-        </w:rPr>
-        <w:t>el primero por su estabilidad estructural, y el segundo a pesar de haber atravesado turbulencias significativas en el período intermedio.</w:t>
+        <w:rPr>
+          <w:rFonts w:asciiTheme="majorHAnsi" w:hAnsiTheme="majorHAnsi" w:cstheme="majorHAnsi"/>
+          <w:highlight w:val="yellow"/>
+          <w:lang w:val="es-CO"/>
+        </w:rPr>
+      </w:pPr>
+      <w:r>
+        <w:rPr>
+          <w:rFonts w:asciiTheme="majorHAnsi" w:hAnsiTheme="majorHAnsi" w:cstheme="majorHAnsi"/>
+          <w:highlight w:val="yellow"/>
+          <w:lang w:val="es-CO"/>
+        </w:rPr>
+        <w:t>En conclusión, el único sector que muestra evidencia clara de un cambio en la volatilidad entre 2015 y 2025 es el de tecnología. Los sectores de consumo básico e inmobiliario mantuvieron niveles de riesgo similares en ambos períodos, aunque por razones distintas ya que, el primero por su estabilidad estructural, y el segundo a pesar de haber atravesado turbulencias significativas en el período intermedio.</w:t>
       </w:r>
     </w:p>
     <w:p>
       <w:pPr>
-        <w:pStyle w:val="Listaconvietas"/>
+        <w:pStyle w:val="ListBullet"/>
         <w:numPr>
           <w:ilvl w:val="0"/>
           <w:numId w:val="0"/>
@@ -2465,7 +2428,7 @@
     <w:lvl w:ilvl="0">
       <w:start w:val="1"/>
       <w:numFmt w:val="decimal"/>
-      <w:pStyle w:val="Listaconnmeros3"/>
+      <w:pStyle w:val="ListNumber3"/>
       <w:lvlText w:val="%1."/>
       <w:lvlJc w:val="left"/>
       <w:pPr>
@@ -2483,7 +2446,7 @@
     <w:lvl w:ilvl="0">
       <w:start w:val="1"/>
       <w:numFmt w:val="decimal"/>
-      <w:pStyle w:val="Listaconnmeros2"/>
+      <w:pStyle w:val="ListNumber2"/>
       <w:lvlText w:val="%1."/>
       <w:lvlJc w:val="left"/>
       <w:pPr>
@@ -2521,7 +2484,7 @@
     <w:lvl w:ilvl="0">
       <w:start w:val="1"/>
       <w:numFmt w:val="bullet"/>
-      <w:pStyle w:val="Listaconvietas3"/>
+      <w:pStyle w:val="ListBullet3"/>
       <w:lvlText w:val=""/>
       <w:lvlJc w:val="left"/>
       <w:pPr>
@@ -2542,7 +2505,7 @@
     <w:lvl w:ilvl="0">
       <w:start w:val="1"/>
       <w:numFmt w:val="bullet"/>
-      <w:pStyle w:val="Listaconvietas2"/>
+      <w:pStyle w:val="ListBullet2"/>
       <w:lvlText w:val=""/>
       <w:lvlJc w:val="left"/>
       <w:pPr>
@@ -2563,7 +2526,7 @@
     <w:lvl w:ilvl="0">
       <w:start w:val="1"/>
       <w:numFmt w:val="decimal"/>
-      <w:pStyle w:val="Listaconnmeros"/>
+      <w:pStyle w:val="ListNumber"/>
       <w:lvlText w:val="%1."/>
       <w:lvlJc w:val="left"/>
       <w:pPr>
@@ -2581,7 +2544,7 @@
     <w:lvl w:ilvl="0">
       <w:start w:val="1"/>
       <w:numFmt w:val="bullet"/>
-      <w:pStyle w:val="Listaconvietas"/>
+      <w:pStyle w:val="ListBullet"/>
       <w:lvlText w:val=""/>
       <w:lvlJc w:val="left"/>
       <w:pPr>
@@ -3408,11 +3371,11 @@
     <w:qFormat/>
     <w:rsid w:val="00FC693F"/>
   </w:style>
-  <w:style w:type="paragraph" w:styleId="Ttulo1">
+  <w:style w:type="paragraph" w:styleId="Heading1">
     <w:name w:val="heading 1"/>
     <w:basedOn w:val="Normal"/>
     <w:next w:val="Normal"/>
-    <w:link w:val="Ttulo1Car"/>
+    <w:link w:val="Heading1Char"/>
     <w:uiPriority w:val="9"/>
     <w:qFormat/>
     <w:rsid w:val="00FC693F"/>
@@ -3431,11 +3394,11 @@
       <w:szCs w:val="28"/>
     </w:rPr>
   </w:style>
-  <w:style w:type="paragraph" w:styleId="Ttulo2">
+  <w:style w:type="paragraph" w:styleId="Heading2">
     <w:name w:val="heading 2"/>
     <w:basedOn w:val="Normal"/>
     <w:next w:val="Normal"/>
-    <w:link w:val="Ttulo2Car"/>
+    <w:link w:val="Heading2Char"/>
     <w:uiPriority w:val="9"/>
     <w:unhideWhenUsed/>
     <w:qFormat/>
@@ -3455,11 +3418,11 @@
       <w:szCs w:val="26"/>
     </w:rPr>
   </w:style>
-  <w:style w:type="paragraph" w:styleId="Ttulo3">
+  <w:style w:type="paragraph" w:styleId="Heading3">
     <w:name w:val="heading 3"/>
     <w:basedOn w:val="Normal"/>
     <w:next w:val="Normal"/>
-    <w:link w:val="Ttulo3Car"/>
+    <w:link w:val="Heading3Char"/>
     <w:uiPriority w:val="9"/>
     <w:unhideWhenUsed/>
     <w:qFormat/>
@@ -3477,11 +3440,11 @@
       <w:color w:val="4F81BD" w:themeColor="accent1"/>
     </w:rPr>
   </w:style>
-  <w:style w:type="paragraph" w:styleId="Ttulo4">
+  <w:style w:type="paragraph" w:styleId="Heading4">
     <w:name w:val="heading 4"/>
     <w:basedOn w:val="Normal"/>
     <w:next w:val="Normal"/>
-    <w:link w:val="Ttulo4Car"/>
+    <w:link w:val="Heading4Char"/>
     <w:uiPriority w:val="9"/>
     <w:semiHidden/>
     <w:unhideWhenUsed/>
@@ -3502,11 +3465,11 @@
       <w:color w:val="4F81BD" w:themeColor="accent1"/>
     </w:rPr>
   </w:style>
-  <w:style w:type="paragraph" w:styleId="Ttulo5">
+  <w:style w:type="paragraph" w:styleId="Heading5">
     <w:name w:val="heading 5"/>
     <w:basedOn w:val="Normal"/>
     <w:next w:val="Normal"/>
-    <w:link w:val="Ttulo5Car"/>
+    <w:link w:val="Heading5Char"/>
     <w:uiPriority w:val="9"/>
     <w:semiHidden/>
     <w:unhideWhenUsed/>
@@ -3523,11 +3486,11 @@
       <w:color w:val="243F60" w:themeColor="accent1" w:themeShade="7F"/>
     </w:rPr>
   </w:style>
-  <w:style w:type="paragraph" w:styleId="Ttulo6">
+  <w:style w:type="paragraph" w:styleId="Heading6">
     <w:name w:val="heading 6"/>
     <w:basedOn w:val="Normal"/>
     <w:next w:val="Normal"/>
-    <w:link w:val="Ttulo6Car"/>
+    <w:link w:val="Heading6Char"/>
     <w:uiPriority w:val="9"/>
     <w:semiHidden/>
     <w:unhideWhenUsed/>
@@ -3546,11 +3509,11 @@
       <w:color w:val="243F60" w:themeColor="accent1" w:themeShade="7F"/>
     </w:rPr>
   </w:style>
-  <w:style w:type="paragraph" w:styleId="Ttulo7">
+  <w:style w:type="paragraph" w:styleId="Heading7">
     <w:name w:val="heading 7"/>
     <w:basedOn w:val="Normal"/>
     <w:next w:val="Normal"/>
-    <w:link w:val="Ttulo7Car"/>
+    <w:link w:val="Heading7Char"/>
     <w:uiPriority w:val="9"/>
     <w:semiHidden/>
     <w:unhideWhenUsed/>
@@ -3569,11 +3532,11 @@
       <w:color w:val="404040" w:themeColor="text1" w:themeTint="BF"/>
     </w:rPr>
   </w:style>
-  <w:style w:type="paragraph" w:styleId="Ttulo8">
+  <w:style w:type="paragraph" w:styleId="Heading8">
     <w:name w:val="heading 8"/>
     <w:basedOn w:val="Normal"/>
     <w:next w:val="Normal"/>
-    <w:link w:val="Ttulo8Car"/>
+    <w:link w:val="Heading8Char"/>
     <w:uiPriority w:val="9"/>
     <w:semiHidden/>
     <w:unhideWhenUsed/>
@@ -3592,11 +3555,11 @@
       <w:szCs w:val="20"/>
     </w:rPr>
   </w:style>
-  <w:style w:type="paragraph" w:styleId="Ttulo9">
+  <w:style w:type="paragraph" w:styleId="Heading9">
     <w:name w:val="heading 9"/>
     <w:basedOn w:val="Normal"/>
     <w:next w:val="Normal"/>
-    <w:link w:val="Ttulo9Car"/>
+    <w:link w:val="Heading9Char"/>
     <w:uiPriority w:val="9"/>
     <w:semiHidden/>
     <w:unhideWhenUsed/>
@@ -3617,13 +3580,13 @@
       <w:szCs w:val="20"/>
     </w:rPr>
   </w:style>
-  <w:style w:type="character" w:default="1" w:styleId="Fuentedeprrafopredeter">
+  <w:style w:type="character" w:default="1" w:styleId="DefaultParagraphFont">
     <w:name w:val="Default Paragraph Font"/>
     <w:uiPriority w:val="1"/>
     <w:semiHidden/>
     <w:unhideWhenUsed/>
   </w:style>
-  <w:style w:type="table" w:default="1" w:styleId="Tablanormal">
+  <w:style w:type="table" w:default="1" w:styleId="TableNormal">
     <w:name w:val="Normal Table"/>
     <w:uiPriority w:val="99"/>
     <w:semiHidden/>
@@ -3638,16 +3601,16 @@
       </w:tblCellMar>
     </w:tblPr>
   </w:style>
-  <w:style w:type="numbering" w:default="1" w:styleId="Sinlista">
+  <w:style w:type="numbering" w:default="1" w:styleId="NoList">
     <w:name w:val="No List"/>
     <w:uiPriority w:val="99"/>
     <w:semiHidden/>
     <w:unhideWhenUsed/>
   </w:style>
-  <w:style w:type="paragraph" w:styleId="Encabezado">
+  <w:style w:type="paragraph" w:styleId="Header">
     <w:name w:val="header"/>
     <w:basedOn w:val="Normal"/>
-    <w:link w:val="EncabezadoCar"/>
+    <w:link w:val="HeaderChar"/>
     <w:uiPriority w:val="99"/>
     <w:unhideWhenUsed/>
     <w:rsid w:val="00E618BF"/>
@@ -3659,17 +3622,17 @@
       <w:spacing w:after="0" w:line="240" w:lineRule="auto"/>
     </w:pPr>
   </w:style>
-  <w:style w:type="character" w:customStyle="1" w:styleId="EncabezadoCar">
-    <w:name w:val="Encabezado Car"/>
-    <w:basedOn w:val="Fuentedeprrafopredeter"/>
-    <w:link w:val="Encabezado"/>
+  <w:style w:type="character" w:customStyle="1" w:styleId="HeaderChar">
+    <w:name w:val="Header Char"/>
+    <w:basedOn w:val="DefaultParagraphFont"/>
+    <w:link w:val="Header"/>
     <w:uiPriority w:val="99"/>
     <w:rsid w:val="00E618BF"/>
   </w:style>
-  <w:style w:type="paragraph" w:styleId="Piedepgina">
+  <w:style w:type="paragraph" w:styleId="Footer">
     <w:name w:val="footer"/>
     <w:basedOn w:val="Normal"/>
-    <w:link w:val="PiedepginaCar"/>
+    <w:link w:val="FooterChar"/>
     <w:uiPriority w:val="99"/>
     <w:unhideWhenUsed/>
     <w:rsid w:val="00E618BF"/>
@@ -3681,14 +3644,14 @@
       <w:spacing w:after="0" w:line="240" w:lineRule="auto"/>
     </w:pPr>
   </w:style>
-  <w:style w:type="character" w:customStyle="1" w:styleId="PiedepginaCar">
-    <w:name w:val="Pie de página Car"/>
-    <w:basedOn w:val="Fuentedeprrafopredeter"/>
-    <w:link w:val="Piedepgina"/>
+  <w:style w:type="character" w:customStyle="1" w:styleId="FooterChar">
+    <w:name w:val="Footer Char"/>
+    <w:basedOn w:val="DefaultParagraphFont"/>
+    <w:link w:val="Footer"/>
     <w:uiPriority w:val="99"/>
     <w:rsid w:val="00E618BF"/>
   </w:style>
-  <w:style w:type="paragraph" w:styleId="Sinespaciado">
+  <w:style w:type="paragraph" w:styleId="NoSpacing">
     <w:name w:val="No Spacing"/>
     <w:uiPriority w:val="1"/>
     <w:qFormat/>
@@ -3697,10 +3660,10 @@
       <w:spacing w:after="0" w:line="240" w:lineRule="auto"/>
     </w:pPr>
   </w:style>
-  <w:style w:type="character" w:customStyle="1" w:styleId="Ttulo1Car">
-    <w:name w:val="Título 1 Car"/>
-    <w:basedOn w:val="Fuentedeprrafopredeter"/>
-    <w:link w:val="Ttulo1"/>
+  <w:style w:type="character" w:customStyle="1" w:styleId="Heading1Char">
+    <w:name w:val="Heading 1 Char"/>
+    <w:basedOn w:val="DefaultParagraphFont"/>
+    <w:link w:val="Heading1"/>
     <w:uiPriority w:val="9"/>
     <w:rsid w:val="00FC693F"/>
     <w:rPr>
@@ -3712,10 +3675,10 @@
       <w:szCs w:val="28"/>
     </w:rPr>
   </w:style>
-  <w:style w:type="character" w:customStyle="1" w:styleId="Ttulo2Car">
-    <w:name w:val="Título 2 Car"/>
-    <w:basedOn w:val="Fuentedeprrafopredeter"/>
-    <w:link w:val="Ttulo2"/>
+  <w:style w:type="character" w:customStyle="1" w:styleId="Heading2Char">
+    <w:name w:val="Heading 2 Char"/>
+    <w:basedOn w:val="DefaultParagraphFont"/>
+    <w:link w:val="Heading2"/>
     <w:uiPriority w:val="9"/>
     <w:rsid w:val="00FC693F"/>
     <w:rPr>
@@ -3727,10 +3690,10 @@
       <w:szCs w:val="26"/>
     </w:rPr>
   </w:style>
-  <w:style w:type="character" w:customStyle="1" w:styleId="Ttulo3Car">
-    <w:name w:val="Título 3 Car"/>
-    <w:basedOn w:val="Fuentedeprrafopredeter"/>
-    <w:link w:val="Ttulo3"/>
+  <w:style w:type="character" w:customStyle="1" w:styleId="Heading3Char">
+    <w:name w:val="Heading 3 Char"/>
+    <w:basedOn w:val="DefaultParagraphFont"/>
+    <w:link w:val="Heading3"/>
     <w:uiPriority w:val="9"/>
     <w:rsid w:val="00FC693F"/>
     <w:rPr>
@@ -3740,11 +3703,11 @@
       <w:color w:val="4F81BD" w:themeColor="accent1"/>
     </w:rPr>
   </w:style>
-  <w:style w:type="paragraph" w:styleId="Ttulo">
+  <w:style w:type="paragraph" w:styleId="Title">
     <w:name w:val="Title"/>
     <w:basedOn w:val="Normal"/>
     <w:next w:val="Normal"/>
-    <w:link w:val="TtuloCar"/>
+    <w:link w:val="TitleChar"/>
     <w:uiPriority w:val="10"/>
     <w:qFormat/>
     <w:rsid w:val="00FC693F"/>
@@ -3764,10 +3727,10 @@
       <w:szCs w:val="52"/>
     </w:rPr>
   </w:style>
-  <w:style w:type="character" w:customStyle="1" w:styleId="TtuloCar">
-    <w:name w:val="Título Car"/>
-    <w:basedOn w:val="Fuentedeprrafopredeter"/>
-    <w:link w:val="Ttulo"/>
+  <w:style w:type="character" w:customStyle="1" w:styleId="TitleChar">
+    <w:name w:val="Title Char"/>
+    <w:basedOn w:val="DefaultParagraphFont"/>
+    <w:link w:val="Title"/>
     <w:uiPriority w:val="10"/>
     <w:rsid w:val="00FC693F"/>
     <w:rPr>
@@ -3779,11 +3742,11 @@
       <w:szCs w:val="52"/>
     </w:rPr>
   </w:style>
-  <w:style w:type="paragraph" w:styleId="Subttulo">
+  <w:style w:type="paragraph" w:styleId="Subtitle">
     <w:name w:val="Subtitle"/>
     <w:basedOn w:val="Normal"/>
     <w:next w:val="Normal"/>
-    <w:link w:val="SubttuloCar"/>
+    <w:link w:val="SubtitleChar"/>
     <w:uiPriority w:val="11"/>
     <w:qFormat/>
     <w:rsid w:val="00FC693F"/>
@@ -3802,10 +3765,10 @@
       <w:szCs w:val="24"/>
     </w:rPr>
   </w:style>
-  <w:style w:type="character" w:customStyle="1" w:styleId="SubttuloCar">
-    <w:name w:val="Subtítulo Car"/>
-    <w:basedOn w:val="Fuentedeprrafopredeter"/>
-    <w:link w:val="Subttulo"/>
+  <w:style w:type="character" w:customStyle="1" w:styleId="SubtitleChar">
+    <w:name w:val="Subtitle Char"/>
+    <w:basedOn w:val="DefaultParagraphFont"/>
+    <w:link w:val="Subtitle"/>
     <w:uiPriority w:val="11"/>
     <w:rsid w:val="00FC693F"/>
     <w:rPr>
@@ -3818,7 +3781,7 @@
       <w:szCs w:val="24"/>
     </w:rPr>
   </w:style>
-  <w:style w:type="paragraph" w:styleId="Prrafodelista">
+  <w:style w:type="paragraph" w:styleId="ListParagraph">
     <w:name w:val="List Paragraph"/>
     <w:basedOn w:val="Normal"/>
     <w:uiPriority w:val="34"/>
@@ -3829,10 +3792,10 @@
       <w:contextualSpacing/>
     </w:pPr>
   </w:style>
-  <w:style w:type="paragraph" w:styleId="Textoindependiente">
+  <w:style w:type="paragraph" w:styleId="BodyText">
     <w:name w:val="Body Text"/>
     <w:basedOn w:val="Normal"/>
-    <w:link w:val="TextoindependienteCar"/>
+    <w:link w:val="BodyTextChar"/>
     <w:uiPriority w:val="99"/>
     <w:unhideWhenUsed/>
     <w:rsid w:val="00AA1D8D"/>
@@ -3840,17 +3803,17 @@
       <w:spacing w:after="120"/>
     </w:pPr>
   </w:style>
-  <w:style w:type="character" w:customStyle="1" w:styleId="TextoindependienteCar">
-    <w:name w:val="Texto independiente Car"/>
-    <w:basedOn w:val="Fuentedeprrafopredeter"/>
-    <w:link w:val="Textoindependiente"/>
+  <w:style w:type="character" w:customStyle="1" w:styleId="BodyTextChar">
+    <w:name w:val="Body Text Char"/>
+    <w:basedOn w:val="DefaultParagraphFont"/>
+    <w:link w:val="BodyText"/>
     <w:uiPriority w:val="99"/>
     <w:rsid w:val="00AA1D8D"/>
   </w:style>
-  <w:style w:type="paragraph" w:styleId="Textoindependiente2">
+  <w:style w:type="paragraph" w:styleId="BodyText2">
     <w:name w:val="Body Text 2"/>
     <w:basedOn w:val="Normal"/>
-    <w:link w:val="Textoindependiente2Car"/>
+    <w:link w:val="BodyText2Char"/>
     <w:uiPriority w:val="99"/>
     <w:unhideWhenUsed/>
     <w:rsid w:val="00AA1D8D"/>
@@ -3858,17 +3821,17 @@
       <w:spacing w:after="120" w:line="480" w:lineRule="auto"/>
     </w:pPr>
   </w:style>
-  <w:style w:type="character" w:customStyle="1" w:styleId="Textoindependiente2Car">
-    <w:name w:val="Texto independiente 2 Car"/>
-    <w:basedOn w:val="Fuentedeprrafopredeter"/>
-    <w:link w:val="Textoindependiente2"/>
+  <w:style w:type="character" w:customStyle="1" w:styleId="BodyText2Char">
+    <w:name w:val="Body Text 2 Char"/>
+    <w:basedOn w:val="DefaultParagraphFont"/>
+    <w:link w:val="BodyText2"/>
     <w:uiPriority w:val="99"/>
     <w:rsid w:val="00AA1D8D"/>
   </w:style>
-  <w:style w:type="paragraph" w:styleId="Textoindependiente3">
+  <w:style w:type="paragraph" w:styleId="BodyText3">
     <w:name w:val="Body Text 3"/>
     <w:basedOn w:val="Normal"/>
-    <w:link w:val="Textoindependiente3Car"/>
+    <w:link w:val="BodyText3Char"/>
     <w:uiPriority w:val="99"/>
     <w:unhideWhenUsed/>
     <w:rsid w:val="00AA1D8D"/>
@@ -3880,10 +3843,10 @@
       <w:szCs w:val="16"/>
     </w:rPr>
   </w:style>
-  <w:style w:type="character" w:customStyle="1" w:styleId="Textoindependiente3Car">
-    <w:name w:val="Texto independiente 3 Car"/>
-    <w:basedOn w:val="Fuentedeprrafopredeter"/>
-    <w:link w:val="Textoindependiente3"/>
+  <w:style w:type="character" w:customStyle="1" w:styleId="BodyText3Char">
+    <w:name w:val="Body Text 3 Char"/>
+    <w:basedOn w:val="DefaultParagraphFont"/>
+    <w:link w:val="BodyText3"/>
     <w:uiPriority w:val="99"/>
     <w:rsid w:val="00AA1D8D"/>
     <w:rPr>
@@ -3891,7 +3854,7 @@
       <w:szCs w:val="16"/>
     </w:rPr>
   </w:style>
-  <w:style w:type="paragraph" w:styleId="Lista">
+  <w:style w:type="paragraph" w:styleId="List">
     <w:name w:val="List"/>
     <w:basedOn w:val="Normal"/>
     <w:uiPriority w:val="99"/>
@@ -3902,7 +3865,7 @@
       <w:contextualSpacing/>
     </w:pPr>
   </w:style>
-  <w:style w:type="paragraph" w:styleId="Lista2">
+  <w:style w:type="paragraph" w:styleId="List2">
     <w:name w:val="List 2"/>
     <w:basedOn w:val="Normal"/>
     <w:uiPriority w:val="99"/>
@@ -3913,7 +3876,7 @@
       <w:contextualSpacing/>
     </w:pPr>
   </w:style>
-  <w:style w:type="paragraph" w:styleId="Lista3">
+  <w:style w:type="paragraph" w:styleId="List3">
     <w:name w:val="List 3"/>
     <w:basedOn w:val="Normal"/>
     <w:uiPriority w:val="99"/>
@@ -3924,7 +3887,7 @@
       <w:contextualSpacing/>
     </w:pPr>
   </w:style>
-  <w:style w:type="paragraph" w:styleId="Listaconvietas">
+  <w:style w:type="paragraph" w:styleId="ListBullet">
     <w:name w:val="List Bullet"/>
     <w:basedOn w:val="Normal"/>
     <w:uiPriority w:val="99"/>
@@ -3937,7 +3900,7 @@
       <w:contextualSpacing/>
     </w:pPr>
   </w:style>
-  <w:style w:type="paragraph" w:styleId="Listaconvietas2">
+  <w:style w:type="paragraph" w:styleId="ListBullet2">
     <w:name w:val="List Bullet 2"/>
     <w:basedOn w:val="Normal"/>
     <w:uiPriority w:val="99"/>
@@ -3950,7 +3913,7 @@
       <w:contextualSpacing/>
     </w:pPr>
   </w:style>
-  <w:style w:type="paragraph" w:styleId="Listaconvietas3">
+  <w:style w:type="paragraph" w:styleId="ListBullet3">
     <w:name w:val="List Bullet 3"/>
     <w:basedOn w:val="Normal"/>
     <w:uiPriority w:val="99"/>
@@ -3963,7 +3926,7 @@
       <w:contextualSpacing/>
     </w:pPr>
   </w:style>
-  <w:style w:type="paragraph" w:styleId="Listaconnmeros">
+  <w:style w:type="paragraph" w:styleId="ListNumber">
     <w:name w:val="List Number"/>
     <w:basedOn w:val="Normal"/>
     <w:uiPriority w:val="99"/>
@@ -3976,7 +3939,7 @@
       <w:contextualSpacing/>
     </w:pPr>
   </w:style>
-  <w:style w:type="paragraph" w:styleId="Listaconnmeros2">
+  <w:style w:type="paragraph" w:styleId="ListNumber2">
     <w:name w:val="List Number 2"/>
     <w:basedOn w:val="Normal"/>
     <w:uiPriority w:val="99"/>
@@ -3989,7 +3952,7 @@
       <w:contextualSpacing/>
     </w:pPr>
   </w:style>
-  <w:style w:type="paragraph" w:styleId="Listaconnmeros3">
+  <w:style w:type="paragraph" w:styleId="ListNumber3">
     <w:name w:val="List Number 3"/>
     <w:basedOn w:val="Normal"/>
     <w:uiPriority w:val="99"/>
@@ -4002,7 +3965,7 @@
       <w:contextualSpacing/>
     </w:pPr>
   </w:style>
-  <w:style w:type="paragraph" w:styleId="Continuarlista">
+  <w:style w:type="paragraph" w:styleId="ListContinue">
     <w:name w:val="List Continue"/>
     <w:basedOn w:val="Normal"/>
     <w:uiPriority w:val="99"/>
@@ -4014,7 +3977,7 @@
       <w:contextualSpacing/>
     </w:pPr>
   </w:style>
-  <w:style w:type="paragraph" w:styleId="Continuarlista2">
+  <w:style w:type="paragraph" w:styleId="ListContinue2">
     <w:name w:val="List Continue 2"/>
     <w:basedOn w:val="Normal"/>
     <w:uiPriority w:val="99"/>
@@ -4026,7 +3989,7 @@
       <w:contextualSpacing/>
     </w:pPr>
   </w:style>
-  <w:style w:type="paragraph" w:styleId="Continuarlista3">
+  <w:style w:type="paragraph" w:styleId="ListContinue3">
     <w:name w:val="List Continue 3"/>
     <w:basedOn w:val="Normal"/>
     <w:uiPriority w:val="99"/>
@@ -4038,9 +4001,9 @@
       <w:contextualSpacing/>
     </w:pPr>
   </w:style>
-  <w:style w:type="paragraph" w:styleId="Textomacro">
+  <w:style w:type="paragraph" w:styleId="MacroText">
     <w:name w:val="macro"/>
-    <w:link w:val="TextomacroCar"/>
+    <w:link w:val="MacroTextChar"/>
     <w:uiPriority w:val="99"/>
     <w:unhideWhenUsed/>
     <w:rsid w:val="0029639D"/>
@@ -4061,10 +4024,10 @@
       <w:szCs w:val="20"/>
     </w:rPr>
   </w:style>
-  <w:style w:type="character" w:customStyle="1" w:styleId="TextomacroCar">
-    <w:name w:val="Texto macro Car"/>
-    <w:basedOn w:val="Fuentedeprrafopredeter"/>
-    <w:link w:val="Textomacro"/>
+  <w:style w:type="character" w:customStyle="1" w:styleId="MacroTextChar">
+    <w:name w:val="Macro Text Char"/>
+    <w:basedOn w:val="DefaultParagraphFont"/>
+    <w:link w:val="MacroText"/>
     <w:uiPriority w:val="99"/>
     <w:rsid w:val="0029639D"/>
     <w:rPr>
@@ -4073,11 +4036,11 @@
       <w:szCs w:val="20"/>
     </w:rPr>
   </w:style>
-  <w:style w:type="paragraph" w:styleId="Cita">
+  <w:style w:type="paragraph" w:styleId="Quote">
     <w:name w:val="Quote"/>
     <w:basedOn w:val="Normal"/>
     <w:next w:val="Normal"/>
-    <w:link w:val="CitaCar"/>
+    <w:link w:val="QuoteChar"/>
     <w:uiPriority w:val="29"/>
     <w:qFormat/>
     <w:rsid w:val="00FC693F"/>
@@ -4087,10 +4050,10 @@
       <w:color w:val="000000" w:themeColor="text1"/>
     </w:rPr>
   </w:style>
-  <w:style w:type="character" w:customStyle="1" w:styleId="CitaCar">
-    <w:name w:val="Cita Car"/>
-    <w:basedOn w:val="Fuentedeprrafopredeter"/>
-    <w:link w:val="Cita"/>
+  <w:style w:type="character" w:customStyle="1" w:styleId="QuoteChar">
+    <w:name w:val="Quote Char"/>
+    <w:basedOn w:val="DefaultParagraphFont"/>
+    <w:link w:val="Quote"/>
     <w:uiPriority w:val="29"/>
     <w:rsid w:val="00FC693F"/>
     <w:rPr>
@@ -4099,10 +4062,10 @@
       <w:color w:val="000000" w:themeColor="text1"/>
     </w:rPr>
   </w:style>
-  <w:style w:type="character" w:customStyle="1" w:styleId="Ttulo4Car">
-    <w:name w:val="Título 4 Car"/>
-    <w:basedOn w:val="Fuentedeprrafopredeter"/>
-    <w:link w:val="Ttulo4"/>
+  <w:style w:type="character" w:customStyle="1" w:styleId="Heading4Char">
+    <w:name w:val="Heading 4 Char"/>
+    <w:basedOn w:val="DefaultParagraphFont"/>
+    <w:link w:val="Heading4"/>
     <w:uiPriority w:val="9"/>
     <w:semiHidden/>
     <w:rsid w:val="00FC693F"/>
@@ -4115,10 +4078,10 @@
       <w:color w:val="4F81BD" w:themeColor="accent1"/>
     </w:rPr>
   </w:style>
-  <w:style w:type="character" w:customStyle="1" w:styleId="Ttulo5Car">
-    <w:name w:val="Título 5 Car"/>
-    <w:basedOn w:val="Fuentedeprrafopredeter"/>
-    <w:link w:val="Ttulo5"/>
+  <w:style w:type="character" w:customStyle="1" w:styleId="Heading5Char">
+    <w:name w:val="Heading 5 Char"/>
+    <w:basedOn w:val="DefaultParagraphFont"/>
+    <w:link w:val="Heading5"/>
     <w:uiPriority w:val="9"/>
     <w:semiHidden/>
     <w:rsid w:val="00FC693F"/>
@@ -4127,10 +4090,10 @@
       <w:color w:val="243F60" w:themeColor="accent1" w:themeShade="7F"/>
     </w:rPr>
   </w:style>
-  <w:style w:type="character" w:customStyle="1" w:styleId="Ttulo6Car">
-    <w:name w:val="Título 6 Car"/>
-    <w:basedOn w:val="Fuentedeprrafopredeter"/>
-    <w:link w:val="Ttulo6"/>
+  <w:style w:type="character" w:customStyle="1" w:styleId="Heading6Char">
+    <w:name w:val="Heading 6 Char"/>
+    <w:basedOn w:val="DefaultParagraphFont"/>
+    <w:link w:val="Heading6"/>
     <w:uiPriority w:val="9"/>
     <w:semiHidden/>
     <w:rsid w:val="00FC693F"/>
@@ -4141,10 +4104,10 @@
       <w:color w:val="243F60" w:themeColor="accent1" w:themeShade="7F"/>
     </w:rPr>
   </w:style>
-  <w:style w:type="character" w:customStyle="1" w:styleId="Ttulo7Car">
-    <w:name w:val="Título 7 Car"/>
-    <w:basedOn w:val="Fuentedeprrafopredeter"/>
-    <w:link w:val="Ttulo7"/>
+  <w:style w:type="character" w:customStyle="1" w:styleId="Heading7Char">
+    <w:name w:val="Heading 7 Char"/>
+    <w:basedOn w:val="DefaultParagraphFont"/>
+    <w:link w:val="Heading7"/>
     <w:uiPriority w:val="9"/>
     <w:semiHidden/>
     <w:rsid w:val="00FC693F"/>
@@ -4155,10 +4118,10 @@
       <w:color w:val="404040" w:themeColor="text1" w:themeTint="BF"/>
     </w:rPr>
   </w:style>
-  <w:style w:type="character" w:customStyle="1" w:styleId="Ttulo8Car">
-    <w:name w:val="Título 8 Car"/>
-    <w:basedOn w:val="Fuentedeprrafopredeter"/>
-    <w:link w:val="Ttulo8"/>
+  <w:style w:type="character" w:customStyle="1" w:styleId="Heading8Char">
+    <w:name w:val="Heading 8 Char"/>
+    <w:basedOn w:val="DefaultParagraphFont"/>
+    <w:link w:val="Heading8"/>
     <w:uiPriority w:val="9"/>
     <w:semiHidden/>
     <w:rsid w:val="00FC693F"/>
@@ -4169,10 +4132,10 @@
       <w:szCs w:val="20"/>
     </w:rPr>
   </w:style>
-  <w:style w:type="character" w:customStyle="1" w:styleId="Ttulo9Car">
-    <w:name w:val="Título 9 Car"/>
-    <w:basedOn w:val="Fuentedeprrafopredeter"/>
-    <w:link w:val="Ttulo9"/>
+  <w:style w:type="character" w:customStyle="1" w:styleId="Heading9Char">
+    <w:name w:val="Heading 9 Char"/>
+    <w:basedOn w:val="DefaultParagraphFont"/>
+    <w:link w:val="Heading9"/>
     <w:uiPriority w:val="9"/>
     <w:semiHidden/>
     <w:rsid w:val="00FC693F"/>
@@ -4185,7 +4148,7 @@
       <w:szCs w:val="20"/>
     </w:rPr>
   </w:style>
-  <w:style w:type="paragraph" w:styleId="Descripcin">
+  <w:style w:type="paragraph" w:styleId="Caption">
     <w:name w:val="caption"/>
     <w:basedOn w:val="Normal"/>
     <w:next w:val="Normal"/>
@@ -4205,9 +4168,9 @@
       <w:szCs w:val="18"/>
     </w:rPr>
   </w:style>
-  <w:style w:type="character" w:styleId="Fuerte">
+  <w:style w:type="character" w:styleId="Strong">
     <w:name w:val="Strong"/>
-    <w:basedOn w:val="Fuentedeprrafopredeter"/>
+    <w:basedOn w:val="DefaultParagraphFont"/>
     <w:uiPriority w:val="22"/>
     <w:qFormat/>
     <w:rsid w:val="00FC693F"/>
@@ -4216,9 +4179,9 @@
       <w:bCs/>
     </w:rPr>
   </w:style>
-  <w:style w:type="character" w:styleId="nfasis">
+  <w:style w:type="character" w:styleId="Emphasis">
     <w:name w:val="Emphasis"/>
-    <w:basedOn w:val="Fuentedeprrafopredeter"/>
+    <w:basedOn w:val="DefaultParagraphFont"/>
     <w:uiPriority w:val="20"/>
     <w:qFormat/>
     <w:rsid w:val="00FC693F"/>
@@ -4227,11 +4190,11 @@
       <w:iCs/>
     </w:rPr>
   </w:style>
-  <w:style w:type="paragraph" w:styleId="Citadestacada">
+  <w:style w:type="paragraph" w:styleId="IntenseQuote">
     <w:name w:val="Intense Quote"/>
     <w:basedOn w:val="Normal"/>
     <w:next w:val="Normal"/>
-    <w:link w:val="CitadestacadaCar"/>
+    <w:link w:val="IntenseQuoteChar"/>
     <w:uiPriority w:val="30"/>
     <w:qFormat/>
     <w:rsid w:val="00FC693F"/>
@@ -4250,10 +4213,10 @@
       <w:color w:val="4F81BD" w:themeColor="accent1"/>
     </w:rPr>
   </w:style>
-  <w:style w:type="character" w:customStyle="1" w:styleId="CitadestacadaCar">
-    <w:name w:val="Cita destacada Car"/>
-    <w:basedOn w:val="Fuentedeprrafopredeter"/>
-    <w:link w:val="Citadestacada"/>
+  <w:style w:type="character" w:customStyle="1" w:styleId="IntenseQuoteChar">
+    <w:name w:val="Intense Quote Char"/>
+    <w:basedOn w:val="DefaultParagraphFont"/>
+    <w:link w:val="IntenseQuote"/>
     <w:uiPriority w:val="30"/>
     <w:rsid w:val="00FC693F"/>
     <w:rPr>
@@ -4264,9 +4227,9 @@
       <w:color w:val="4F81BD" w:themeColor="accent1"/>
     </w:rPr>
   </w:style>
-  <w:style w:type="character" w:styleId="nfasissutil">
+  <w:style w:type="character" w:styleId="SubtleEmphasis">
     <w:name w:val="Subtle Emphasis"/>
-    <w:basedOn w:val="Fuentedeprrafopredeter"/>
+    <w:basedOn w:val="DefaultParagraphFont"/>
     <w:uiPriority w:val="19"/>
     <w:qFormat/>
     <w:rsid w:val="00FC693F"/>
@@ -4276,9 +4239,9 @@
       <w:color w:val="808080" w:themeColor="text1" w:themeTint="7F"/>
     </w:rPr>
   </w:style>
-  <w:style w:type="character" w:styleId="nfasisintenso">
+  <w:style w:type="character" w:styleId="IntenseEmphasis">
     <w:name w:val="Intense Emphasis"/>
-    <w:basedOn w:val="Fuentedeprrafopredeter"/>
+    <w:basedOn w:val="DefaultParagraphFont"/>
     <w:uiPriority w:val="21"/>
     <w:qFormat/>
     <w:rsid w:val="00FC693F"/>
@@ -4290,9 +4253,9 @@
       <w:color w:val="4F81BD" w:themeColor="accent1"/>
     </w:rPr>
   </w:style>
-  <w:style w:type="character" w:styleId="Referenciasutil">
+  <w:style w:type="character" w:styleId="SubtleReference">
     <w:name w:val="Subtle Reference"/>
-    <w:basedOn w:val="Fuentedeprrafopredeter"/>
+    <w:basedOn w:val="DefaultParagraphFont"/>
     <w:uiPriority w:val="31"/>
     <w:qFormat/>
     <w:rsid w:val="00FC693F"/>
@@ -4302,9 +4265,9 @@
       <w:u w:val="single"/>
     </w:rPr>
   </w:style>
-  <w:style w:type="character" w:styleId="Referenciaintensa">
+  <w:style w:type="character" w:styleId="IntenseReference">
     <w:name w:val="Intense Reference"/>
-    <w:basedOn w:val="Fuentedeprrafopredeter"/>
+    <w:basedOn w:val="DefaultParagraphFont"/>
     <w:uiPriority w:val="32"/>
     <w:qFormat/>
     <w:rsid w:val="00FC693F"/>
@@ -4317,9 +4280,9 @@
       <w:u w:val="single"/>
     </w:rPr>
   </w:style>
-  <w:style w:type="character" w:styleId="Ttulodellibro">
+  <w:style w:type="character" w:styleId="BookTitle">
     <w:name w:val="Book Title"/>
-    <w:basedOn w:val="Fuentedeprrafopredeter"/>
+    <w:basedOn w:val="DefaultParagraphFont"/>
     <w:uiPriority w:val="33"/>
     <w:qFormat/>
     <w:rsid w:val="00FC693F"/>
@@ -4330,9 +4293,9 @@
       <w:spacing w:val="5"/>
     </w:rPr>
   </w:style>
-  <w:style w:type="paragraph" w:styleId="TtuloTDC">
+  <w:style w:type="paragraph" w:styleId="TOCHeading">
     <w:name w:val="TOC Heading"/>
-    <w:basedOn w:val="Ttulo1"/>
+    <w:basedOn w:val="Heading1"/>
     <w:next w:val="Normal"/>
     <w:uiPriority w:val="39"/>
     <w:semiHidden/>
@@ -4343,9 +4306,9 @@
       <w:outlineLvl w:val="9"/>
     </w:pPr>
   </w:style>
-  <w:style w:type="table" w:styleId="Tablaconcuadrcula">
+  <w:style w:type="table" w:styleId="TableGrid">
     <w:name w:val="Table Grid"/>
-    <w:basedOn w:val="Tablanormal"/>
+    <w:basedOn w:val="TableNormal"/>
     <w:uiPriority w:val="59"/>
     <w:rsid w:val="00FC693F"/>
     <w:pPr>
@@ -4362,9 +4325,9 @@
       </w:tblBorders>
     </w:tblPr>
   </w:style>
-  <w:style w:type="table" w:styleId="Sombreadoclaro">
+  <w:style w:type="table" w:styleId="LightShading">
     <w:name w:val="Light Shading"/>
-    <w:basedOn w:val="Tablanormal"/>
+    <w:basedOn w:val="TableNormal"/>
     <w:uiPriority w:val="60"/>
     <w:rsid w:val="00FC693F"/>
     <w:pPr>
@@ -4458,9 +4421,9 @@
       </w:tcPr>
     </w:tblStylePr>
   </w:style>
-  <w:style w:type="table" w:styleId="Sombreadoclaro-nfasis1">
+  <w:style w:type="table" w:styleId="LightShading-Accent1">
     <w:name w:val="Light Shading Accent 1"/>
-    <w:basedOn w:val="Tablanormal"/>
+    <w:basedOn w:val="TableNormal"/>
     <w:uiPriority w:val="60"/>
     <w:rsid w:val="00FC693F"/>
     <w:pPr>
@@ -4554,9 +4517,9 @@
       </w:tcPr>
     </w:tblStylePr>
   </w:style>
-  <w:style w:type="table" w:styleId="Sombreadoclaro-nfasis2">
+  <w:style w:type="table" w:styleId="LightShading-Accent2">
     <w:name w:val="Light Shading Accent 2"/>
-    <w:basedOn w:val="Tablanormal"/>
+    <w:basedOn w:val="TableNormal"/>
     <w:uiPriority w:val="60"/>
     <w:rsid w:val="00FC693F"/>
     <w:pPr>
@@ -4650,9 +4613,9 @@
       </w:tcPr>
     </w:tblStylePr>
   </w:style>
-  <w:style w:type="table" w:styleId="Sombreadoclaro-nfasis3">
+  <w:style w:type="table" w:styleId="LightShading-Accent3">
     <w:name w:val="Light Shading Accent 3"/>
-    <w:basedOn w:val="Tablanormal"/>
+    <w:basedOn w:val="TableNormal"/>
     <w:uiPriority w:val="60"/>
     <w:rsid w:val="00FC693F"/>
     <w:pPr>
@@ -4746,9 +4709,9 @@
       </w:tcPr>
     </w:tblStylePr>
   </w:style>
-  <w:style w:type="table" w:styleId="Sombreadoclaro-nfasis4">
+  <w:style w:type="table" w:styleId="LightShading-Accent4">
     <w:name w:val="Light Shading Accent 4"/>
-    <w:basedOn w:val="Tablanormal"/>
+    <w:basedOn w:val="TableNormal"/>
     <w:uiPriority w:val="60"/>
     <w:rsid w:val="00FC693F"/>
     <w:pPr>
@@ -4842,9 +4805,9 @@
       </w:tcPr>
     </w:tblStylePr>
   </w:style>
-  <w:style w:type="table" w:styleId="Sombreadoclaro-nfasis5">
+  <w:style w:type="table" w:styleId="LightShading-Accent5">
     <w:name w:val="Light Shading Accent 5"/>
-    <w:basedOn w:val="Tablanormal"/>
+    <w:basedOn w:val="TableNormal"/>
     <w:uiPriority w:val="60"/>
     <w:rsid w:val="00FC693F"/>
     <w:pPr>
@@ -4938,9 +4901,9 @@
       </w:tcPr>
     </w:tblStylePr>
   </w:style>
-  <w:style w:type="table" w:styleId="Sombreadoclaro-nfasis6">
+  <w:style w:type="table" w:styleId="LightShading-Accent6">
     <w:name w:val="Light Shading Accent 6"/>
-    <w:basedOn w:val="Tablanormal"/>
+    <w:basedOn w:val="TableNormal"/>
     <w:uiPriority w:val="60"/>
     <w:rsid w:val="00FC693F"/>
     <w:pPr>
@@ -5034,9 +4997,9 @@
       </w:tcPr>
     </w:tblStylePr>
   </w:style>
-  <w:style w:type="table" w:styleId="Listaclara">
+  <w:style w:type="table" w:styleId="LightList">
     <w:name w:val="Light List"/>
-    <w:basedOn w:val="Tablanormal"/>
+    <w:basedOn w:val="TableNormal"/>
     <w:uiPriority w:val="61"/>
     <w:rsid w:val="00FC693F"/>
     <w:pPr>
@@ -5119,9 +5082,9 @@
       </w:tcPr>
     </w:tblStylePr>
   </w:style>
-  <w:style w:type="table" w:styleId="Listaclara-nfasis1">
+  <w:style w:type="table" w:styleId="LightList-Accent1">
     <w:name w:val="Light List Accent 1"/>
-    <w:basedOn w:val="Tablanormal"/>
+    <w:basedOn w:val="TableNormal"/>
     <w:uiPriority w:val="61"/>
     <w:rsid w:val="00FC693F"/>
     <w:pPr>
@@ -5204,9 +5167,9 @@
       </w:tcPr>
     </w:tblStylePr>
   </w:style>
-  <w:style w:type="table" w:styleId="Listaclara-nfasis2">
+  <w:style w:type="table" w:styleId="LightList-Accent2">
     <w:name w:val="Light List Accent 2"/>
-    <w:basedOn w:val="Tablanormal"/>
+    <w:basedOn w:val="TableNormal"/>
     <w:uiPriority w:val="61"/>
     <w:rsid w:val="00CB0664"/>
     <w:pPr>
@@ -5289,9 +5252,9 @@
       </w:tcPr>
     </w:tblStylePr>
   </w:style>
-  <w:style w:type="table" w:styleId="Listaclara-nfasis3">
+  <w:style w:type="table" w:styleId="LightList-Accent3">
     <w:name w:val="Light List Accent 3"/>
-    <w:basedOn w:val="Tablanormal"/>
+    <w:basedOn w:val="TableNormal"/>
     <w:uiPriority w:val="61"/>
     <w:rsid w:val="00CB0664"/>
     <w:pPr>
@@ -5374,9 +5337,9 @@
       </w:tcPr>
     </w:tblStylePr>
   </w:style>
-  <w:style w:type="table" w:styleId="Listaclara-nfasis4">
+  <w:style w:type="table" w:styleId="LightList-Accent4">
     <w:name w:val="Light List Accent 4"/>
-    <w:basedOn w:val="Tablanormal"/>
+    <w:basedOn w:val="TableNormal"/>
     <w:uiPriority w:val="61"/>
     <w:rsid w:val="00CB0664"/>
     <w:pPr>
@@ -5459,9 +5422,9 @@
       </w:tcPr>
     </w:tblStylePr>
   </w:style>
-  <w:style w:type="table" w:styleId="Listaclara-nfasis5">
+  <w:style w:type="table" w:styleId="LightList-Accent5">
     <w:name w:val="Light List Accent 5"/>
-    <w:basedOn w:val="Tablanormal"/>
+    <w:basedOn w:val="TableNormal"/>
     <w:uiPriority w:val="61"/>
     <w:rsid w:val="00CB0664"/>
     <w:pPr>
@@ -5544,9 +5507,9 @@
       </w:tcPr>
     </w:tblStylePr>
   </w:style>
-  <w:style w:type="table" w:styleId="Listaclara-nfasis6">
+  <w:style w:type="table" w:styleId="LightList-Accent6">
     <w:name w:val="Light List Accent 6"/>
-    <w:basedOn w:val="Tablanormal"/>
+    <w:basedOn w:val="TableNormal"/>
     <w:uiPriority w:val="61"/>
     <w:rsid w:val="00CB0664"/>
     <w:pPr>
@@ -5629,9 +5592,9 @@
       </w:tcPr>
     </w:tblStylePr>
   </w:style>
-  <w:style w:type="table" w:styleId="Cuadrculaclara">
+  <w:style w:type="table" w:styleId="LightGrid">
     <w:name w:val="Light Grid"/>
-    <w:basedOn w:val="Tablanormal"/>
+    <w:basedOn w:val="TableNormal"/>
     <w:uiPriority w:val="62"/>
     <w:rsid w:val="00CB0664"/>
     <w:pPr>
@@ -5752,9 +5715,9 @@
       </w:tcPr>
     </w:tblStylePr>
   </w:style>
-  <w:style w:type="table" w:styleId="Cuadrculaclara-nfasis1">
+  <w:style w:type="table" w:styleId="LightGrid-Accent1">
     <w:name w:val="Light Grid Accent 1"/>
-    <w:basedOn w:val="Tablanormal"/>
+    <w:basedOn w:val="TableNormal"/>
     <w:uiPriority w:val="62"/>
     <w:rsid w:val="00CB0664"/>
     <w:pPr>
@@ -5875,9 +5838,9 @@
       </w:tcPr>
     </w:tblStylePr>
   </w:style>
-  <w:style w:type="table" w:styleId="Cuadrculaclara-nfasis2">
+  <w:style w:type="table" w:styleId="LightGrid-Accent2">
     <w:name w:val="Light Grid Accent 2"/>
-    <w:basedOn w:val="Tablanormal"/>
+    <w:basedOn w:val="TableNormal"/>
     <w:uiPriority w:val="62"/>
     <w:rsid w:val="00CB0664"/>
     <w:pPr>
@@ -5998,9 +5961,9 @@
       </w:tcPr>
     </w:tblStylePr>
   </w:style>
-  <w:style w:type="table" w:styleId="Cuadrculaclara-nfasis3">
+  <w:style w:type="table" w:styleId="LightGrid-Accent3">
     <w:name w:val="Light Grid Accent 3"/>
-    <w:basedOn w:val="Tablanormal"/>
+    <w:basedOn w:val="TableNormal"/>
     <w:uiPriority w:val="62"/>
     <w:rsid w:val="00CB0664"/>
     <w:pPr>
@@ -6121,9 +6084,9 @@
       </w:tcPr>
     </w:tblStylePr>
   </w:style>
-  <w:style w:type="table" w:styleId="Cuadrculaclara-nfasis4">
+  <w:style w:type="table" w:styleId="LightGrid-Accent4">
     <w:name w:val="Light Grid Accent 4"/>
-    <w:basedOn w:val="Tablanormal"/>
+    <w:basedOn w:val="TableNormal"/>
     <w:uiPriority w:val="62"/>
     <w:rsid w:val="00CB0664"/>
     <w:pPr>
@@ -6244,9 +6207,9 @@
       </w:tcPr>
     </w:tblStylePr>
   </w:style>
-  <w:style w:type="table" w:styleId="Cuadrculaclara-nfasis5">
+  <w:style w:type="table" w:styleId="LightGrid-Accent5">
     <w:name w:val="Light Grid Accent 5"/>
-    <w:basedOn w:val="Tablanormal"/>
+    <w:basedOn w:val="TableNormal"/>
     <w:uiPriority w:val="62"/>
     <w:rsid w:val="00CB0664"/>
     <w:pPr>
@@ -6367,9 +6330,9 @@
       </w:tcPr>
     </w:tblStylePr>
   </w:style>
-  <w:style w:type="table" w:styleId="Cuadrculaclara-nfasis6">
+  <w:style w:type="table" w:styleId="LightGrid-Accent6">
     <w:name w:val="Light Grid Accent 6"/>
-    <w:basedOn w:val="Tablanormal"/>
+    <w:basedOn w:val="TableNormal"/>
     <w:uiPriority w:val="62"/>
     <w:rsid w:val="00CB0664"/>
     <w:pPr>
@@ -6490,9 +6453,9 @@
       </w:tcPr>
     </w:tblStylePr>
   </w:style>
-  <w:style w:type="table" w:styleId="Sombreadomedio1">
+  <w:style w:type="table" w:styleId="MediumShading1">
     <w:name w:val="Medium Shading 1"/>
-    <w:basedOn w:val="Tablanormal"/>
+    <w:basedOn w:val="TableNormal"/>
     <w:uiPriority w:val="63"/>
     <w:rsid w:val="00CB0664"/>
     <w:pPr>
@@ -6589,9 +6552,9 @@
       </w:tcPr>
     </w:tblStylePr>
   </w:style>
-  <w:style w:type="table" w:styleId="Sombreadomedio1-nfasis1">
+  <w:style w:type="table" w:styleId="MediumShading1-Accent1">
     <w:name w:val="Medium Shading 1 Accent 1"/>
-    <w:basedOn w:val="Tablanormal"/>
+    <w:basedOn w:val="TableNormal"/>
     <w:uiPriority w:val="63"/>
     <w:rsid w:val="00CB0664"/>
     <w:pPr>
@@ -6688,9 +6651,9 @@
       </w:tcPr>
     </w:tblStylePr>
   </w:style>
-  <w:style w:type="table" w:styleId="Sombreadomedio1-nfasis2">
+  <w:style w:type="table" w:styleId="MediumShading1-Accent2">
     <w:name w:val="Medium Shading 1 Accent 2"/>
-    <w:basedOn w:val="Tablanormal"/>
+    <w:basedOn w:val="TableNormal"/>
     <w:uiPriority w:val="63"/>
     <w:rsid w:val="00CB0664"/>
     <w:pPr>
@@ -6787,9 +6750,9 @@
       </w:tcPr>
     </w:tblStylePr>
   </w:style>
-  <w:style w:type="table" w:styleId="Sombreadomedio1-nfasis3">
+  <w:style w:type="table" w:styleId="MediumShading1-Accent3">
     <w:name w:val="Medium Shading 1 Accent 3"/>
-    <w:basedOn w:val="Tablanormal"/>
+    <w:basedOn w:val="TableNormal"/>
     <w:uiPriority w:val="63"/>
     <w:rsid w:val="00CB0664"/>
     <w:pPr>
@@ -6886,9 +6849,9 @@
       </w:tcPr>
     </w:tblStylePr>
   </w:style>
-  <w:style w:type="table" w:styleId="Sombreadomedio1-nfasis4">
+  <w:style w:type="table" w:styleId="MediumShading1-Accent4">
     <w:name w:val="Medium Shading 1 Accent 4"/>
-    <w:basedOn w:val="Tablanormal"/>
+    <w:basedOn w:val="TableNormal"/>
     <w:uiPriority w:val="63"/>
     <w:rsid w:val="00CB0664"/>
     <w:pPr>
@@ -6985,9 +6948,9 @@
       </w:tcPr>
     </w:tblStylePr>
   </w:style>
-  <w:style w:type="table" w:styleId="Sombreadomedio1-nfasis5">
+  <w:style w:type="table" w:styleId="MediumShading1-Accent5">
     <w:name w:val="Medium Shading 1 Accent 5"/>
-    <w:basedOn w:val="Tablanormal"/>
+    <w:basedOn w:val="TableNormal"/>
     <w:uiPriority w:val="63"/>
     <w:rsid w:val="00CB0664"/>
     <w:pPr>
@@ -7084,9 +7047,9 @@
       </w:tcPr>
     </w:tblStylePr>
   </w:style>
-  <w:style w:type="table" w:styleId="Sombreadomedio1-nfasis6">
+  <w:style w:type="table" w:styleId="MediumShading1-Accent6">
     <w:name w:val="Medium Shading 1 Accent 6"/>
-    <w:basedOn w:val="Tablanormal"/>
+    <w:basedOn w:val="TableNormal"/>
     <w:uiPriority w:val="63"/>
     <w:rsid w:val="00CB0664"/>
     <w:pPr>
@@ -7183,9 +7146,9 @@
       </w:tcPr>
     </w:tblStylePr>
   </w:style>
-  <w:style w:type="table" w:styleId="Sombreadomedio2">
+  <w:style w:type="table" w:styleId="MediumShading2">
     <w:name w:val="Medium Shading 2"/>
-    <w:basedOn w:val="Tablanormal"/>
+    <w:basedOn w:val="TableNormal"/>
     <w:uiPriority w:val="64"/>
     <w:rsid w:val="00CB0664"/>
     <w:pPr>
@@ -7325,9 +7288,9 @@
       </w:tcPr>
     </w:tblStylePr>
   </w:style>
-  <w:style w:type="table" w:styleId="Sombreadomedio2-nfasis1">
+  <w:style w:type="table" w:styleId="MediumShading2-Accent1">
     <w:name w:val="Medium Shading 2 Accent 1"/>
-    <w:basedOn w:val="Tablanormal"/>
+    <w:basedOn w:val="TableNormal"/>
     <w:uiPriority w:val="64"/>
     <w:rsid w:val="00CB0664"/>
     <w:pPr>
@@ -7467,9 +7430,9 @@
       </w:tcPr>
     </w:tblStylePr>
   </w:style>
-  <w:style w:type="table" w:styleId="Sombreadomedio2-nfasis2">
+  <w:style w:type="table" w:styleId="MediumShading2-Accent2">
     <w:name w:val="Medium Shading 2 Accent 2"/>
-    <w:basedOn w:val="Tablanormal"/>
+    <w:basedOn w:val="TableNormal"/>
     <w:uiPriority w:val="64"/>
     <w:rsid w:val="00CB0664"/>
     <w:pPr>
@@ -7609,9 +7572,9 @@
       </w:tcPr>
     </w:tblStylePr>
   </w:style>
-  <w:style w:type="table" w:styleId="Sombreadomedio2-nfasis3">
+  <w:style w:type="table" w:styleId="MediumShading2-Accent3">
     <w:name w:val="Medium Shading 2 Accent 3"/>
-    <w:basedOn w:val="Tablanormal"/>
+    <w:basedOn w:val="TableNormal"/>
     <w:uiPriority w:val="64"/>
     <w:rsid w:val="00CB0664"/>
     <w:pPr>
@@ -7751,9 +7714,9 @@
       </w:tcPr>
     </w:tblStylePr>
   </w:style>
-  <w:style w:type="table" w:styleId="Sombreadomedio2-nfasis4">
+  <w:style w:type="table" w:styleId="MediumShading2-Accent4">
     <w:name w:val="Medium Shading 2 Accent 4"/>
-    <w:basedOn w:val="Tablanormal"/>
+    <w:basedOn w:val="TableNormal"/>
     <w:uiPriority w:val="64"/>
     <w:rsid w:val="00CB0664"/>
     <w:pPr>
@@ -7893,9 +7856,9 @@
       </w:tcPr>
     </w:tblStylePr>
   </w:style>
-  <w:style w:type="table" w:styleId="Sombreadomedio2-nfasis5">
+  <w:style w:type="table" w:styleId="MediumShading2-Accent5">
     <w:name w:val="Medium Shading 2 Accent 5"/>
-    <w:basedOn w:val="Tablanormal"/>
+    <w:basedOn w:val="TableNormal"/>
     <w:uiPriority w:val="64"/>
     <w:rsid w:val="00CB0664"/>
     <w:pPr>
@@ -8035,9 +7998,9 @@
       </w:tcPr>
     </w:tblStylePr>
   </w:style>
-  <w:style w:type="table" w:styleId="Sombreadomedio2-nfasis6">
+  <w:style w:type="table" w:styleId="MediumShading2-Accent6">
     <w:name w:val="Medium Shading 2 Accent 6"/>
-    <w:basedOn w:val="Tablanormal"/>
+    <w:basedOn w:val="TableNormal"/>
     <w:uiPriority w:val="64"/>
     <w:rsid w:val="00CB0664"/>
     <w:pPr>
@@ -8177,9 +8140,9 @@
       </w:tcPr>
     </w:tblStylePr>
   </w:style>
-  <w:style w:type="table" w:styleId="Listamedia1">
+  <w:style w:type="table" w:styleId="MediumList1">
     <w:name w:val="Medium List 1"/>
-    <w:basedOn w:val="Tablanormal"/>
+    <w:basedOn w:val="TableNormal"/>
     <w:uiPriority w:val="65"/>
     <w:rsid w:val="00CB0664"/>
     <w:pPr>
@@ -8254,9 +8217,9 @@
       </w:tcPr>
     </w:tblStylePr>
   </w:style>
-  <w:style w:type="table" w:styleId="Listamedia1-nfasis1">
+  <w:style w:type="table" w:styleId="MediumList1-Accent1">
     <w:name w:val="Medium List 1 Accent 1"/>
-    <w:basedOn w:val="Tablanormal"/>
+    <w:basedOn w:val="TableNormal"/>
     <w:uiPriority w:val="65"/>
     <w:rsid w:val="00CB0664"/>
     <w:pPr>
@@ -8331,9 +8294,9 @@
       </w:tcPr>
     </w:tblStylePr>
   </w:style>
-  <w:style w:type="table" w:styleId="Listamedia1-nfasis2">
+  <w:style w:type="table" w:styleId="MediumList1-Accent2">
     <w:name w:val="Medium List 1 Accent 2"/>
-    <w:basedOn w:val="Tablanormal"/>
+    <w:basedOn w:val="TableNormal"/>
     <w:uiPriority w:val="65"/>
     <w:rsid w:val="00CB0664"/>
     <w:pPr>
@@ -8408,9 +8371,9 @@
       </w:tcPr>
     </w:tblStylePr>
   </w:style>
-  <w:style w:type="table" w:styleId="Listamedia1-nfasis3">
+  <w:style w:type="table" w:styleId="MediumList1-Accent3">
     <w:name w:val="Medium List 1 Accent 3"/>
-    <w:basedOn w:val="Tablanormal"/>
+    <w:basedOn w:val="TableNormal"/>
     <w:uiPriority w:val="65"/>
     <w:rsid w:val="00CB0664"/>
     <w:pPr>
@@ -8485,9 +8448,9 @@
       </w:tcPr>
     </w:tblStylePr>
   </w:style>
-  <w:style w:type="table" w:styleId="Listamedia1-nfasis4">
+  <w:style w:type="table" w:styleId="MediumList1-Accent4">
     <w:name w:val="Medium List 1 Accent 4"/>
-    <w:basedOn w:val="Tablanormal"/>
+    <w:basedOn w:val="TableNormal"/>
     <w:uiPriority w:val="65"/>
     <w:rsid w:val="00CB0664"/>
     <w:pPr>
@@ -8562,9 +8525,9 @@
       </w:tcPr>
     </w:tblStylePr>
   </w:style>
-  <w:style w:type="table" w:styleId="Listamedia1-nfasis5">
+  <w:style w:type="table" w:styleId="MediumList1-Accent5">
     <w:name w:val="Medium List 1 Accent 5"/>
-    <w:basedOn w:val="Tablanormal"/>
+    <w:basedOn w:val="TableNormal"/>
     <w:uiPriority w:val="65"/>
     <w:rsid w:val="00CB0664"/>
     <w:pPr>
@@ -8639,9 +8602,9 @@
       </w:tcPr>
     </w:tblStylePr>
   </w:style>
-  <w:style w:type="table" w:styleId="Listamedia1-nfasis6">
+  <w:style w:type="table" w:styleId="MediumList1-Accent6">
     <w:name w:val="Medium List 1 Accent 6"/>
-    <w:basedOn w:val="Tablanormal"/>
+    <w:basedOn w:val="TableNormal"/>
     <w:uiPriority w:val="65"/>
     <w:rsid w:val="00CB0664"/>
     <w:pPr>
@@ -8716,9 +8679,9 @@
       </w:tcPr>
     </w:tblStylePr>
   </w:style>
-  <w:style w:type="table" w:styleId="Listamedia2">
+  <w:style w:type="table" w:styleId="MediumList2">
     <w:name w:val="Medium List 2"/>
-    <w:basedOn w:val="Tablanormal"/>
+    <w:basedOn w:val="TableNormal"/>
     <w:uiPriority w:val="66"/>
     <w:rsid w:val="00CB0664"/>
     <w:pPr>
@@ -8837,9 +8800,9 @@
       </w:tcPr>
     </w:tblStylePr>
   </w:style>
-  <w:style w:type="table" w:styleId="Listamedia2-nfasis1">
+  <w:style w:type="table" w:styleId="MediumList2-Accent1">
     <w:name w:val="Medium List 2 Accent 1"/>
-    <w:basedOn w:val="Tablanormal"/>
+    <w:basedOn w:val="TableNormal"/>
     <w:uiPriority w:val="66"/>
     <w:rsid w:val="00CB0664"/>
     <w:pPr>
@@ -8958,9 +8921,9 @@
       </w:tcPr>
     </w:tblStylePr>
   </w:style>
-  <w:style w:type="table" w:styleId="Listamedia2-nfasis2">
+  <w:style w:type="table" w:styleId="MediumList2-Accent2">
     <w:name w:val="Medium List 2 Accent 2"/>
-    <w:basedOn w:val="Tablanormal"/>
+    <w:basedOn w:val="TableNormal"/>
     <w:uiPriority w:val="66"/>
     <w:rsid w:val="00CB0664"/>
     <w:pPr>
@@ -9079,9 +9042,9 @@
       </w:tcPr>
     </w:tblStylePr>
   </w:style>
-  <w:style w:type="table" w:styleId="Listamedia2-nfasis3">
+  <w:style w:type="table" w:styleId="MediumList2-Accent3">
     <w:name w:val="Medium List 2 Accent 3"/>
-    <w:basedOn w:val="Tablanormal"/>
+    <w:basedOn w:val="TableNormal"/>
     <w:uiPriority w:val="66"/>
     <w:rsid w:val="00CB0664"/>
     <w:pPr>
@@ -9200,9 +9163,9 @@
       </w:tcPr>
     </w:tblStylePr>
   </w:style>
-  <w:style w:type="table" w:styleId="Listamedia2-nfasis4">
+  <w:style w:type="table" w:styleId="MediumList2-Accent4">
     <w:name w:val="Medium List 2 Accent 4"/>
-    <w:basedOn w:val="Tablanormal"/>
+    <w:basedOn w:val="TableNormal"/>
     <w:uiPriority w:val="66"/>
     <w:rsid w:val="00CB0664"/>
     <w:pPr>
@@ -9321,9 +9284,9 @@
       </w:tcPr>
     </w:tblStylePr>
   </w:style>
-  <w:style w:type="table" w:styleId="Listamedia2-nfasis5">
+  <w:style w:type="table" w:styleId="MediumList2-Accent5">
     <w:name w:val="Medium List 2 Accent 5"/>
-    <w:basedOn w:val="Tablanormal"/>
+    <w:basedOn w:val="TableNormal"/>
     <w:uiPriority w:val="66"/>
     <w:rsid w:val="00CB0664"/>
     <w:pPr>
@@ -9442,9 +9405,9 @@
       </w:tcPr>
     </w:tblStylePr>
   </w:style>
-  <w:style w:type="table" w:styleId="Listamedia2-nfasis6">
+  <w:style w:type="table" w:styleId="MediumList2-Accent6">
     <w:name w:val="Medium List 2 Accent 6"/>
-    <w:basedOn w:val="Tablanormal"/>
+    <w:basedOn w:val="TableNormal"/>
     <w:uiPriority w:val="66"/>
     <w:rsid w:val="00CB0664"/>
     <w:pPr>
@@ -9563,9 +9526,9 @@
       </w:tcPr>
     </w:tblStylePr>
   </w:style>
-  <w:style w:type="table" w:styleId="Cuadrculamedia1">
+  <w:style w:type="table" w:styleId="MediumGrid1">
     <w:name w:val="Medium Grid 1"/>
-    <w:basedOn w:val="Tablanormal"/>
+    <w:basedOn w:val="TableNormal"/>
     <w:uiPriority w:val="67"/>
     <w:rsid w:val="00CB0664"/>
     <w:pPr>
@@ -9629,9 +9592,9 @@
       </w:tcPr>
     </w:tblStylePr>
   </w:style>
-  <w:style w:type="table" w:styleId="Cuadrculamedia1-nfasis1">
+  <w:style w:type="table" w:styleId="MediumGrid1-Accent1">
     <w:name w:val="Medium Grid 1 Accent 1"/>
-    <w:basedOn w:val="Tablanormal"/>
+    <w:basedOn w:val="TableNormal"/>
     <w:uiPriority w:val="67"/>
     <w:rsid w:val="00CB0664"/>
     <w:pPr>
@@ -9695,9 +9658,9 @@
       </w:tcPr>
     </w:tblStylePr>
   </w:style>
-  <w:style w:type="table" w:styleId="Cuadrculamedia1-nfasis2">
+  <w:style w:type="table" w:styleId="MediumGrid1-Accent2">
     <w:name w:val="Medium Grid 1 Accent 2"/>
-    <w:basedOn w:val="Tablanormal"/>
+    <w:basedOn w:val="TableNormal"/>
     <w:uiPriority w:val="67"/>
     <w:rsid w:val="00CB0664"/>
     <w:pPr>
@@ -9761,9 +9724,9 @@
       </w:tcPr>
     </w:tblStylePr>
   </w:style>
-  <w:style w:type="table" w:styleId="Cuadrculamedia1-nfasis3">
+  <w:style w:type="table" w:styleId="MediumGrid1-Accent3">
     <w:name w:val="Medium Grid 1 Accent 3"/>
-    <w:basedOn w:val="Tablanormal"/>
+    <w:basedOn w:val="TableNormal"/>
     <w:uiPriority w:val="67"/>
     <w:rsid w:val="00CB0664"/>
     <w:pPr>
@@ -9827,9 +9790,9 @@
       </w:tcPr>
     </w:tblStylePr>
   </w:style>
-  <w:style w:type="table" w:styleId="Cuadrculamedia1-nfasis4">
+  <w:style w:type="table" w:styleId="MediumGrid1-Accent4">
     <w:name w:val="Medium Grid 1 Accent 4"/>
-    <w:basedOn w:val="Tablanormal"/>
+    <w:basedOn w:val="TableNormal"/>
     <w:uiPriority w:val="67"/>
     <w:rsid w:val="00CB0664"/>
     <w:pPr>
@@ -9893,9 +9856,9 @@
       </w:tcPr>
     </w:tblStylePr>
   </w:style>
-  <w:style w:type="table" w:styleId="Cuadrculamedia1-nfasis5">
+  <w:style w:type="table" w:styleId="MediumGrid1-Accent5">
     <w:name w:val="Medium Grid 1 Accent 5"/>
-    <w:basedOn w:val="Tablanormal"/>
+    <w:basedOn w:val="TableNormal"/>
     <w:uiPriority w:val="67"/>
     <w:rsid w:val="00CB0664"/>
     <w:pPr>
@@ -9959,9 +9922,9 @@
       </w:tcPr>
     </w:tblStylePr>
   </w:style>
-  <w:style w:type="table" w:styleId="Cuadrculamedia1-nfasis6">
+  <w:style w:type="table" w:styleId="MediumGrid1-Accent6">
     <w:name w:val="Medium Grid 1 Accent 6"/>
-    <w:basedOn w:val="Tablanormal"/>
+    <w:basedOn w:val="TableNormal"/>
     <w:uiPriority w:val="67"/>
     <w:rsid w:val="00CB0664"/>
     <w:pPr>
@@ -10025,9 +9988,9 @@
       </w:tcPr>
     </w:tblStylePr>
   </w:style>
-  <w:style w:type="table" w:styleId="Cuadrculamedia2">
+  <w:style w:type="table" w:styleId="MediumGrid2">
     <w:name w:val="Medium Grid 2"/>
-    <w:basedOn w:val="Tablanormal"/>
+    <w:basedOn w:val="TableNormal"/>
     <w:uiPriority w:val="68"/>
     <w:rsid w:val="00CB0664"/>
     <w:pPr>
@@ -10143,9 +10106,9 @@
       </w:tcPr>
     </w:tblStylePr>
   </w:style>
-  <w:style w:type="table" w:styleId="Cuadrculamedia2-nfasis1">
+  <w:style w:type="table" w:styleId="MediumGrid2-Accent1">
     <w:name w:val="Medium Grid 2 Accent 1"/>
-    <w:basedOn w:val="Tablanormal"/>
+    <w:basedOn w:val="TableNormal"/>
     <w:uiPriority w:val="68"/>
     <w:rsid w:val="00CB0664"/>
     <w:pPr>
@@ -10261,9 +10224,9 @@
       </w:tcPr>
     </w:tblStylePr>
   </w:style>
-  <w:style w:type="table" w:styleId="Cuadrculamedia2-nfasis2">
+  <w:style w:type="table" w:styleId="MediumGrid2-Accent2">
     <w:name w:val="Medium Grid 2 Accent 2"/>
-    <w:basedOn w:val="Tablanormal"/>
+    <w:basedOn w:val="TableNormal"/>
     <w:uiPriority w:val="68"/>
     <w:rsid w:val="00CB0664"/>
     <w:pPr>
@@ -10379,9 +10342,9 @@
       </w:tcPr>
     </w:tblStylePr>
   </w:style>
-  <w:style w:type="table" w:styleId="Cuadrculamedia2-nfasis3">
+  <w:style w:type="table" w:styleId="MediumGrid2-Accent3">
     <w:name w:val="Medium Grid 2 Accent 3"/>
-    <w:basedOn w:val="Tablanormal"/>
+    <w:basedOn w:val="TableNormal"/>
     <w:uiPriority w:val="68"/>
     <w:rsid w:val="00CB0664"/>
     <w:pPr>
@@ -10497,9 +10460,9 @@
       </w:tcPr>
     </w:tblStylePr>
   </w:style>
-  <w:style w:type="table" w:styleId="Cuadrculamedia2-nfasis4">
+  <w:style w:type="table" w:styleId="MediumGrid2-Accent4">
     <w:name w:val="Medium Grid 2 Accent 4"/>
-    <w:basedOn w:val="Tablanormal"/>
+    <w:basedOn w:val="TableNormal"/>
     <w:uiPriority w:val="68"/>
     <w:rsid w:val="00CB0664"/>
     <w:pPr>
@@ -10615,9 +10578,9 @@
       </w:tcPr>
     </w:tblStylePr>
   </w:style>
-  <w:style w:type="table" w:styleId="Cuadrculamedia2-nfasis5">
+  <w:style w:type="table" w:styleId="MediumGrid2-Accent5">
     <w:name w:val="Medium Grid 2 Accent 5"/>
-    <w:basedOn w:val="Tablanormal"/>
+    <w:basedOn w:val="TableNormal"/>
     <w:uiPriority w:val="68"/>
     <w:rsid w:val="00CB0664"/>
     <w:pPr>
@@ -10733,9 +10696,9 @@
       </w:tcPr>
     </w:tblStylePr>
   </w:style>
-  <w:style w:type="table" w:styleId="Cuadrculamedia2-nfasis6">
+  <w:style w:type="table" w:styleId="MediumGrid2-Accent6">
     <w:name w:val="Medium Grid 2 Accent 6"/>
-    <w:basedOn w:val="Tablanormal"/>
+    <w:basedOn w:val="TableNormal"/>
     <w:uiPriority w:val="68"/>
     <w:rsid w:val="00CB0664"/>
     <w:pPr>
@@ -10851,9 +10814,9 @@
       </w:tcPr>
     </w:tblStylePr>
   </w:style>
-  <w:style w:type="table" w:styleId="Cuadrculamedia3">
+  <w:style w:type="table" w:styleId="MediumGrid3">
     <w:name w:val="Medium Grid 3"/>
-    <w:basedOn w:val="Tablanormal"/>
+    <w:basedOn w:val="TableNormal"/>
     <w:uiPriority w:val="69"/>
     <w:rsid w:val="00CB0664"/>
     <w:pPr>
@@ -10985,9 +10948,9 @@
       </w:tcPr>
     </w:tblStylePr>
   </w:style>
-  <w:style w:type="table" w:styleId="Cuadrculamedia3-nfasis1">
+  <w:style w:type="table" w:styleId="MediumGrid3-Accent1">
     <w:name w:val="Medium Grid 3 Accent 1"/>
-    <w:basedOn w:val="Tablanormal"/>
+    <w:basedOn w:val="TableNormal"/>
     <w:uiPriority w:val="69"/>
     <w:rsid w:val="00CB0664"/>
     <w:pPr>
@@ -11119,9 +11082,9 @@
       </w:tcPr>
     </w:tblStylePr>
   </w:style>
-  <w:style w:type="table" w:styleId="Cuadrculamedia3-nfasis2">
+  <w:style w:type="table" w:styleId="MediumGrid3-Accent2">
     <w:name w:val="Medium Grid 3 Accent 2"/>
-    <w:basedOn w:val="Tablanormal"/>
+    <w:basedOn w:val="TableNormal"/>
     <w:uiPriority w:val="69"/>
     <w:rsid w:val="00CB0664"/>
     <w:pPr>
@@ -11253,9 +11216,9 @@
       </w:tcPr>
     </w:tblStylePr>
   </w:style>
-  <w:style w:type="table" w:styleId="Cuadrculamedia3-nfasis3">
+  <w:style w:type="table" w:styleId="MediumGrid3-Accent3">
     <w:name w:val="Medium Grid 3 Accent 3"/>
-    <w:basedOn w:val="Tablanormal"/>
+    <w:basedOn w:val="TableNormal"/>
     <w:uiPriority w:val="69"/>
     <w:rsid w:val="00CB0664"/>
     <w:pPr>
@@ -11387,9 +11350,9 @@
       </w:tcPr>
     </w:tblStylePr>
   </w:style>
-  <w:style w:type="table" w:styleId="Cuadrculamedia3-nfasis4">
+  <w:style w:type="table" w:styleId="MediumGrid3-Accent4">
     <w:name w:val="Medium Grid 3 Accent 4"/>
-    <w:basedOn w:val="Tablanormal"/>
+    <w:basedOn w:val="TableNormal"/>
     <w:uiPriority w:val="69"/>
     <w:rsid w:val="00CB0664"/>
     <w:pPr>
@@ -11521,9 +11484,9 @@
       </w:tcPr>
     </w:tblStylePr>
   </w:style>
-  <w:style w:type="table" w:styleId="Cuadrculamedia3-nfasis5">
+  <w:style w:type="table" w:styleId="MediumGrid3-Accent5">
     <w:name w:val="Medium Grid 3 Accent 5"/>
-    <w:basedOn w:val="Tablanormal"/>
+    <w:basedOn w:val="TableNormal"/>
     <w:uiPriority w:val="69"/>
     <w:rsid w:val="00CB0664"/>
     <w:pPr>
@@ -11655,9 +11618,9 @@
       </w:tcPr>
     </w:tblStylePr>
   </w:style>
-  <w:style w:type="table" w:styleId="Cuadrculamedia3-nfasis6">
+  <w:style w:type="table" w:styleId="MediumGrid3-Accent6">
     <w:name w:val="Medium Grid 3 Accent 6"/>
-    <w:basedOn w:val="Tablanormal"/>
+    <w:basedOn w:val="TableNormal"/>
     <w:uiPriority w:val="69"/>
     <w:rsid w:val="00CB0664"/>
     <w:pPr>
@@ -11789,9 +11752,9 @@
       </w:tcPr>
     </w:tblStylePr>
   </w:style>
-  <w:style w:type="table" w:styleId="Listaoscura">
+  <w:style w:type="table" w:styleId="DarkList">
     <w:name w:val="Dark List"/>
-    <w:basedOn w:val="Tablanormal"/>
+    <w:basedOn w:val="TableNormal"/>
     <w:uiPriority w:val="70"/>
     <w:rsid w:val="00CB0664"/>
     <w:pPr>
@@ -11896,9 +11859,9 @@
       </w:tcPr>
     </w:tblStylePr>
   </w:style>
-  <w:style w:type="table" w:styleId="Listaoscura-nfasis1">
+  <w:style w:type="table" w:styleId="DarkList-Accent1">
     <w:name w:val="Dark List Accent 1"/>
-    <w:basedOn w:val="Tablanormal"/>
+    <w:basedOn w:val="TableNormal"/>
     <w:uiPriority w:val="70"/>
     <w:rsid w:val="00CB0664"/>
     <w:pPr>
@@ -12003,9 +11966,9 @@
       </w:tcPr>
     </w:tblStylePr>
   </w:style>
-  <w:style w:type="table" w:styleId="Listaoscura-nfasis2">
+  <w:style w:type="table" w:styleId="DarkList-Accent2">
     <w:name w:val="Dark List Accent 2"/>
-    <w:basedOn w:val="Tablanormal"/>
+    <w:basedOn w:val="TableNormal"/>
     <w:uiPriority w:val="70"/>
     <w:rsid w:val="00CB0664"/>
     <w:pPr>
@@ -12110,9 +12073,9 @@
       </w:tcPr>
     </w:tblStylePr>
   </w:style>
-  <w:style w:type="table" w:styleId="Listaoscura-nfasis3">
+  <w:style w:type="table" w:styleId="DarkList-Accent3">
     <w:name w:val="Dark List Accent 3"/>
-    <w:basedOn w:val="Tablanormal"/>
+    <w:basedOn w:val="TableNormal"/>
     <w:uiPriority w:val="70"/>
     <w:rsid w:val="00CB0664"/>
     <w:pPr>
@@ -12217,9 +12180,9 @@
       </w:tcPr>
     </w:tblStylePr>
   </w:style>
-  <w:style w:type="table" w:styleId="Listaoscura-nfasis4">
+  <w:style w:type="table" w:styleId="DarkList-Accent4">
     <w:name w:val="Dark List Accent 4"/>
-    <w:basedOn w:val="Tablanormal"/>
+    <w:basedOn w:val="TableNormal"/>
     <w:uiPriority w:val="70"/>
     <w:rsid w:val="00CB0664"/>
     <w:pPr>
@@ -12324,9 +12287,9 @@
       </w:tcPr>
     </w:tblStylePr>
   </w:style>
-  <w:style w:type="table" w:styleId="Listaoscura-nfasis5">
+  <w:style w:type="table" w:styleId="DarkList-Accent5">
     <w:name w:val="Dark List Accent 5"/>
-    <w:basedOn w:val="Tablanormal"/>
+    <w:basedOn w:val="TableNormal"/>
     <w:uiPriority w:val="70"/>
     <w:rsid w:val="00CB0664"/>
     <w:pPr>
@@ -12431,9 +12394,9 @@
       </w:tcPr>
     </w:tblStylePr>
   </w:style>
-  <w:style w:type="table" w:styleId="Listaoscura-nfasis6">
+  <w:style w:type="table" w:styleId="DarkList-Accent6">
     <w:name w:val="Dark List Accent 6"/>
-    <w:basedOn w:val="Tablanormal"/>
+    <w:basedOn w:val="TableNormal"/>
     <w:uiPriority w:val="70"/>
     <w:rsid w:val="00CB0664"/>
     <w:pPr>
@@ -12538,9 +12501,9 @@
       </w:tcPr>
     </w:tblStylePr>
   </w:style>
-  <w:style w:type="table" w:styleId="Sombreadovistoso">
+  <w:style w:type="table" w:styleId="ColorfulShading">
     <w:name w:val="Colorful Shading"/>
-    <w:basedOn w:val="Tablanormal"/>
+    <w:basedOn w:val="TableNormal"/>
     <w:uiPriority w:val="71"/>
     <w:rsid w:val="00CB0664"/>
     <w:pPr>
@@ -12653,9 +12616,9 @@
       </w:rPr>
     </w:tblStylePr>
   </w:style>
-  <w:style w:type="table" w:styleId="Sombreadovistoso-nfasis1">
+  <w:style w:type="table" w:styleId="ColorfulShading-Accent1">
     <w:name w:val="Colorful Shading Accent 1"/>
-    <w:basedOn w:val="Tablanormal"/>
+    <w:basedOn w:val="TableNormal"/>
     <w:uiPriority w:val="71"/>
     <w:rsid w:val="00CB0664"/>
     <w:pPr>
@@ -12768,9 +12731,9 @@
       </w:rPr>
     </w:tblStylePr>
   </w:style>
-  <w:style w:type="table" w:styleId="Sombreadovistoso-nfasis2">
+  <w:style w:type="table" w:styleId="ColorfulShading-Accent2">
     <w:name w:val="Colorful Shading Accent 2"/>
-    <w:basedOn w:val="Tablanormal"/>
+    <w:basedOn w:val="TableNormal"/>
     <w:uiPriority w:val="71"/>
     <w:rsid w:val="00CB0664"/>
     <w:pPr>
@@ -12883,9 +12846,9 @@
       </w:rPr>
     </w:tblStylePr>
   </w:style>
-  <w:style w:type="table" w:styleId="Sombreadovistoso-nfasis3">
+  <w:style w:type="table" w:styleId="ColorfulShading-Accent3">
     <w:name w:val="Colorful Shading Accent 3"/>
-    <w:basedOn w:val="Tablanormal"/>
+    <w:basedOn w:val="TableNormal"/>
     <w:uiPriority w:val="71"/>
     <w:rsid w:val="00CB0664"/>
     <w:pPr>
@@ -12988,9 +12951,9 @@
       </w:tcPr>
     </w:tblStylePr>
   </w:style>
-  <w:style w:type="table" w:styleId="Sombreadovistoso-nfasis4">
+  <w:style w:type="table" w:styleId="ColorfulShading-Accent4">
     <w:name w:val="Colorful Shading Accent 4"/>
-    <w:basedOn w:val="Tablanormal"/>
+    <w:basedOn w:val="TableNormal"/>
     <w:uiPriority w:val="71"/>
     <w:rsid w:val="00CB0664"/>
     <w:pPr>
@@ -13103,9 +13066,9 @@
       </w:rPr>
     </w:tblStylePr>
   </w:style>
-  <w:style w:type="table" w:styleId="Sombreadovistoso-nfasis5">
+  <w:style w:type="table" w:styleId="ColorfulShading-Accent5">
     <w:name w:val="Colorful Shading Accent 5"/>
-    <w:basedOn w:val="Tablanormal"/>
+    <w:basedOn w:val="TableNormal"/>
     <w:uiPriority w:val="71"/>
     <w:rsid w:val="00CB0664"/>
     <w:pPr>
@@ -13218,9 +13181,9 @@
       </w:rPr>
     </w:tblStylePr>
   </w:style>
-  <w:style w:type="table" w:styleId="Sombreadovistoso-nfasis6">
+  <w:style w:type="table" w:styleId="ColorfulShading-Accent6">
     <w:name w:val="Colorful Shading Accent 6"/>
-    <w:basedOn w:val="Tablanormal"/>
+    <w:basedOn w:val="TableNormal"/>
     <w:uiPriority w:val="71"/>
     <w:rsid w:val="00CB0664"/>
     <w:pPr>
@@ -13333,9 +13296,9 @@
       </w:rPr>
     </w:tblStylePr>
   </w:style>
-  <w:style w:type="table" w:styleId="Listavistosa">
+  <w:style w:type="table" w:styleId="ColorfulList">
     <w:name w:val="Colorful List"/>
-    <w:basedOn w:val="Tablanormal"/>
+    <w:basedOn w:val="TableNormal"/>
     <w:uiPriority w:val="72"/>
     <w:rsid w:val="00CB0664"/>
     <w:pPr>
@@ -13412,9 +13375,9 @@
       </w:tcPr>
     </w:tblStylePr>
   </w:style>
-  <w:style w:type="table" w:styleId="Listavistosa-nfasis1">
+  <w:style w:type="table" w:styleId="ColorfulList-Accent1">
     <w:name w:val="Colorful List Accent 1"/>
-    <w:basedOn w:val="Tablanormal"/>
+    <w:basedOn w:val="TableNormal"/>
     <w:uiPriority w:val="72"/>
     <w:rsid w:val="00CB0664"/>
     <w:pPr>
@@ -13491,9 +13454,9 @@
       </w:tcPr>
     </w:tblStylePr>
   </w:style>
-  <w:style w:type="table" w:styleId="Listavistosa-nfasis2">
+  <w:style w:type="table" w:styleId="ColorfulList-Accent2">
     <w:name w:val="Colorful List Accent 2"/>
-    <w:basedOn w:val="Tablanormal"/>
+    <w:basedOn w:val="TableNormal"/>
     <w:uiPriority w:val="72"/>
     <w:rsid w:val="00CB0664"/>
     <w:pPr>
@@ -13570,9 +13533,9 @@
       </w:tcPr>
     </w:tblStylePr>
   </w:style>
-  <w:style w:type="table" w:styleId="Listavistosa-nfasis3">
+  <w:style w:type="table" w:styleId="ColorfulList-Accent3">
     <w:name w:val="Colorful List Accent 3"/>
-    <w:basedOn w:val="Tablanormal"/>
+    <w:basedOn w:val="TableNormal"/>
     <w:uiPriority w:val="72"/>
     <w:rsid w:val="00CB0664"/>
     <w:pPr>
@@ -13649,9 +13612,9 @@
       </w:tcPr>
     </w:tblStylePr>
   </w:style>
-  <w:style w:type="table" w:styleId="Listavistosa-nfasis4">
+  <w:style w:type="table" w:styleId="ColorfulList-Accent4">
     <w:name w:val="Colorful List Accent 4"/>
-    <w:basedOn w:val="Tablanormal"/>
+    <w:basedOn w:val="TableNormal"/>
     <w:uiPriority w:val="72"/>
     <w:rsid w:val="00CB0664"/>
     <w:pPr>
@@ -13728,9 +13691,9 @@
       </w:tcPr>
     </w:tblStylePr>
   </w:style>
-  <w:style w:type="table" w:styleId="Listavistosa-nfasis5">
+  <w:style w:type="table" w:styleId="ColorfulList-Accent5">
     <w:name w:val="Colorful List Accent 5"/>
-    <w:basedOn w:val="Tablanormal"/>
+    <w:basedOn w:val="TableNormal"/>
     <w:uiPriority w:val="72"/>
     <w:rsid w:val="00CB0664"/>
     <w:pPr>
@@ -13807,9 +13770,9 @@
       </w:tcPr>
     </w:tblStylePr>
   </w:style>
-  <w:style w:type="table" w:styleId="Listavistosa-nfasis6">
+  <w:style w:type="table" w:styleId="ColorfulList-Accent6">
     <w:name w:val="Colorful List Accent 6"/>
-    <w:basedOn w:val="Tablanormal"/>
+    <w:basedOn w:val="TableNormal"/>
     <w:uiPriority w:val="72"/>
     <w:rsid w:val="00CB0664"/>
     <w:pPr>
@@ -13886,9 +13849,9 @@
       </w:tcPr>
     </w:tblStylePr>
   </w:style>
-  <w:style w:type="table" w:styleId="Cuadrculavistosa">
+  <w:style w:type="table" w:styleId="ColorfulGrid">
     <w:name w:val="Colorful Grid"/>
-    <w:basedOn w:val="Tablanormal"/>
+    <w:basedOn w:val="TableNormal"/>
     <w:uiPriority w:val="73"/>
     <w:rsid w:val="00CB0664"/>
     <w:pPr>
@@ -13959,9 +13922,9 @@
       </w:tcPr>
     </w:tblStylePr>
   </w:style>
-  <w:style w:type="table" w:styleId="Cuadrculavistosa-nfasis1">
+  <w:style w:type="table" w:styleId="ColorfulGrid-Accent1">
     <w:name w:val="Colorful Grid Accent 1"/>
-    <w:basedOn w:val="Tablanormal"/>
+    <w:basedOn w:val="TableNormal"/>
     <w:uiPriority w:val="73"/>
     <w:rsid w:val="00CB0664"/>
     <w:pPr>
@@ -14032,9 +13995,9 @@
       </w:tcPr>
     </w:tblStylePr>
   </w:style>
-  <w:style w:type="table" w:styleId="Cuadrculavistosa-nfasis2">
+  <w:style w:type="table" w:styleId="ColorfulGrid-Accent2">
     <w:name w:val="Colorful Grid Accent 2"/>
-    <w:basedOn w:val="Tablanormal"/>
+    <w:basedOn w:val="TableNormal"/>
     <w:uiPriority w:val="73"/>
     <w:rsid w:val="00CB0664"/>
     <w:pPr>
@@ -14105,9 +14068,9 @@
       </w:tcPr>
     </w:tblStylePr>
   </w:style>
-  <w:style w:type="table" w:styleId="Cuadrculavistosa-nfasis3">
+  <w:style w:type="table" w:styleId="ColorfulGrid-Accent3">
     <w:name w:val="Colorful Grid Accent 3"/>
-    <w:basedOn w:val="Tablanormal"/>
+    <w:basedOn w:val="TableNormal"/>
     <w:uiPriority w:val="73"/>
     <w:rsid w:val="00CB0664"/>
     <w:pPr>
@@ -14178,9 +14141,9 @@
       </w:tcPr>
     </w:tblStylePr>
   </w:style>
-  <w:style w:type="table" w:styleId="Cuadrculavistosa-nfasis4">
+  <w:style w:type="table" w:styleId="ColorfulGrid-Accent4">
     <w:name w:val="Colorful Grid Accent 4"/>
-    <w:basedOn w:val="Tablanormal"/>
+    <w:basedOn w:val="TableNormal"/>
     <w:uiPriority w:val="73"/>
     <w:rsid w:val="00CB0664"/>
     <w:pPr>
@@ -14251,9 +14214,9 @@
       </w:tcPr>
     </w:tblStylePr>
   </w:style>
-  <w:style w:type="table" w:styleId="Cuadrculavistosa-nfasis5">
+  <w:style w:type="table" w:styleId="ColorfulGrid-Accent5">
     <w:name w:val="Colorful Grid Accent 5"/>
-    <w:basedOn w:val="Tablanormal"/>
+    <w:basedOn w:val="TableNormal"/>
     <w:uiPriority w:val="73"/>
     <w:rsid w:val="00CB0664"/>
     <w:pPr>
@@ -14324,9 +14287,9 @@
       </w:tcPr>
     </w:tblStylePr>
   </w:style>
-  <w:style w:type="table" w:styleId="Cuadrculavistosa-nfasis6">
+  <w:style w:type="table" w:styleId="ColorfulGrid-Accent6">
     <w:name w:val="Colorful Grid Accent 6"/>
-    <w:basedOn w:val="Tablanormal"/>
+    <w:basedOn w:val="TableNormal"/>
     <w:uiPriority w:val="73"/>
     <w:rsid w:val="00CB0664"/>
     <w:pPr>
@@ -14397,9 +14360,9 @@
       </w:tcPr>
     </w:tblStylePr>
   </w:style>
-  <w:style w:type="character" w:styleId="CdigoHTML">
+  <w:style w:type="character" w:styleId="HTMLCode">
     <w:name w:val="HTML Code"/>
-    <w:basedOn w:val="Fuentedeprrafopredeter"/>
+    <w:basedOn w:val="DefaultParagraphFont"/>
     <w:uiPriority w:val="99"/>
     <w:semiHidden/>
     <w:unhideWhenUsed/>
@@ -14410,9 +14373,9 @@
       <w:szCs w:val="20"/>
     </w:rPr>
   </w:style>
-  <w:style w:type="character" w:styleId="Hipervnculo">
+  <w:style w:type="character" w:styleId="Hyperlink">
     <w:name w:val="Hyperlink"/>
-    <w:basedOn w:val="Fuentedeprrafopredeter"/>
+    <w:basedOn w:val="DefaultParagraphFont"/>
     <w:uiPriority w:val="99"/>
     <w:unhideWhenUsed/>
     <w:rsid w:val="005709EB"/>
@@ -14421,9 +14384,9 @@
       <w:u w:val="single"/>
     </w:rPr>
   </w:style>
-  <w:style w:type="character" w:styleId="Mencinsinresolver">
+  <w:style w:type="character" w:styleId="UnresolvedMention">
     <w:name w:val="Unresolved Mention"/>
-    <w:basedOn w:val="Fuentedeprrafopredeter"/>
+    <w:basedOn w:val="DefaultParagraphFont"/>
     <w:uiPriority w:val="99"/>
     <w:semiHidden/>
     <w:unhideWhenUsed/>

</xml_diff>